<commit_message>
git and git branches
</commit_message>
<xml_diff>
--- a/python/notes/OOPs.docx
+++ b/python/notes/OOPs.docx
@@ -3458,200 +3458,776 @@
     </w:p>
     <w:p>
       <w:pPr>
-        <w:rPr>
-          <w:rFonts w:ascii="Times New Roman" w:hAnsi="Times New Roman" w:cs="Times New Roman"/>
-        </w:rPr>
-      </w:pPr>
-      <w:r>
-        <w:rPr>
-          <w:rFonts w:ascii="Times New Roman" w:hAnsi="Times New Roman" w:cs="Times New Roman"/>
-        </w:rPr>
-        <w:t>python</w:t>
-      </w:r>
-    </w:p>
-    <w:p>
-      <w:pPr>
-        <w:rPr>
-          <w:rFonts w:ascii="Times New Roman" w:hAnsi="Times New Roman" w:cs="Times New Roman"/>
-        </w:rPr>
-      </w:pPr>
-      <w:proofErr w:type="spellStart"/>
-      <w:r>
-        <w:rPr>
-          <w:rFonts w:ascii="Times New Roman" w:hAnsi="Times New Roman" w:cs="Times New Roman"/>
-        </w:rPr>
-        <w:t>CopyEdit</w:t>
-      </w:r>
-      <w:proofErr w:type="spellEnd"/>
-    </w:p>
-    <w:p>
-      <w:pPr>
-        <w:rPr>
-          <w:rFonts w:ascii="Times New Roman" w:hAnsi="Times New Roman" w:cs="Times New Roman"/>
-        </w:rPr>
-      </w:pPr>
-      <w:r>
-        <w:rPr>
-          <w:rFonts w:ascii="Times New Roman" w:hAnsi="Times New Roman" w:cs="Times New Roman"/>
-        </w:rPr>
-        <w:t>class Animal:</w:t>
-      </w:r>
-    </w:p>
-    <w:p>
-      <w:pPr>
-        <w:rPr>
-          <w:rFonts w:ascii="Times New Roman" w:hAnsi="Times New Roman" w:cs="Times New Roman"/>
-        </w:rPr>
-      </w:pPr>
-      <w:r>
-        <w:rPr>
-          <w:rFonts w:ascii="Times New Roman" w:hAnsi="Times New Roman" w:cs="Times New Roman"/>
-        </w:rPr>
-        <w:t xml:space="preserve">    def speak(self):</w:t>
-      </w:r>
-    </w:p>
-    <w:p>
-      <w:pPr>
-        <w:rPr>
-          <w:rFonts w:ascii="Times New Roman" w:hAnsi="Times New Roman" w:cs="Times New Roman"/>
-        </w:rPr>
-      </w:pPr>
-      <w:r>
-        <w:rPr>
-          <w:rFonts w:ascii="Times New Roman" w:hAnsi="Times New Roman" w:cs="Times New Roman"/>
-        </w:rPr>
-        <w:t xml:space="preserve">        </w:t>
+        <w:pStyle w:val="ListParagraph"/>
+        <w:numPr>
+          <w:ilvl w:val="0"/>
+          <w:numId w:val="4"/>
+        </w:numPr>
+        <w:shd w:val="clear" w:color="auto" w:fill="1F1F1F"/>
+        <w:spacing w:after="0" w:line="285" w:lineRule="atLeast"/>
+        <w:rPr>
+          <w:rFonts w:ascii="Consolas" w:eastAsia="Times New Roman" w:hAnsi="Consolas" w:cs="Times New Roman"/>
+          <w:color w:val="CCCCCC"/>
+          <w:kern w:val="0"/>
+          <w:sz w:val="21"/>
+          <w:szCs w:val="21"/>
+          <w:lang w:eastAsia="en-IN"/>
+          <w14:ligatures w14:val="none"/>
+        </w:rPr>
+      </w:pPr>
+      <w:r>
+        <w:rPr>
+          <w:rFonts w:ascii="Consolas" w:eastAsia="Times New Roman" w:hAnsi="Consolas" w:cs="Times New Roman"/>
+          <w:color w:val="569CD6"/>
+          <w:kern w:val="0"/>
+          <w:sz w:val="21"/>
+          <w:szCs w:val="21"/>
+          <w:lang w:eastAsia="en-IN"/>
+          <w14:ligatures w14:val="none"/>
+        </w:rPr>
+        <w:t>class</w:t>
+      </w:r>
+      <w:r>
+        <w:rPr>
+          <w:rFonts w:ascii="Consolas" w:eastAsia="Times New Roman" w:hAnsi="Consolas" w:cs="Times New Roman"/>
+          <w:color w:val="CCCCCC"/>
+          <w:kern w:val="0"/>
+          <w:sz w:val="21"/>
+          <w:szCs w:val="21"/>
+          <w:lang w:eastAsia="en-IN"/>
+          <w14:ligatures w14:val="none"/>
+        </w:rPr>
+        <w:t xml:space="preserve"> </w:t>
+      </w:r>
+      <w:r>
+        <w:rPr>
+          <w:rFonts w:ascii="Consolas" w:eastAsia="Times New Roman" w:hAnsi="Consolas" w:cs="Times New Roman"/>
+          <w:color w:val="4EC9B0"/>
+          <w:kern w:val="0"/>
+          <w:sz w:val="21"/>
+          <w:szCs w:val="21"/>
+          <w:lang w:eastAsia="en-IN"/>
+          <w14:ligatures w14:val="none"/>
+        </w:rPr>
+        <w:t>Animal</w:t>
+      </w:r>
+      <w:r>
+        <w:rPr>
+          <w:rFonts w:ascii="Consolas" w:eastAsia="Times New Roman" w:hAnsi="Consolas" w:cs="Times New Roman"/>
+          <w:color w:val="CCCCCC"/>
+          <w:kern w:val="0"/>
+          <w:sz w:val="21"/>
+          <w:szCs w:val="21"/>
+          <w:lang w:eastAsia="en-IN"/>
+          <w14:ligatures w14:val="none"/>
+        </w:rPr>
+        <w:t>:</w:t>
+      </w:r>
+    </w:p>
+    <w:p>
+      <w:pPr>
+        <w:pStyle w:val="ListParagraph"/>
+        <w:numPr>
+          <w:ilvl w:val="0"/>
+          <w:numId w:val="4"/>
+        </w:numPr>
+        <w:shd w:val="clear" w:color="auto" w:fill="1F1F1F"/>
+        <w:spacing w:after="0" w:line="285" w:lineRule="atLeast"/>
+        <w:rPr>
+          <w:rFonts w:ascii="Consolas" w:eastAsia="Times New Roman" w:hAnsi="Consolas" w:cs="Times New Roman"/>
+          <w:color w:val="CCCCCC"/>
+          <w:kern w:val="0"/>
+          <w:sz w:val="21"/>
+          <w:szCs w:val="21"/>
+          <w:lang w:eastAsia="en-IN"/>
+          <w14:ligatures w14:val="none"/>
+        </w:rPr>
+      </w:pPr>
+      <w:r>
+        <w:rPr>
+          <w:rFonts w:ascii="Consolas" w:eastAsia="Times New Roman" w:hAnsi="Consolas" w:cs="Times New Roman"/>
+          <w:color w:val="CCCCCC"/>
+          <w:kern w:val="0"/>
+          <w:sz w:val="21"/>
+          <w:szCs w:val="21"/>
+          <w:lang w:eastAsia="en-IN"/>
+          <w14:ligatures w14:val="none"/>
+        </w:rPr>
+        <w:t xml:space="preserve">    </w:t>
+      </w:r>
+      <w:r>
+        <w:rPr>
+          <w:rFonts w:ascii="Consolas" w:eastAsia="Times New Roman" w:hAnsi="Consolas" w:cs="Times New Roman"/>
+          <w:color w:val="569CD6"/>
+          <w:kern w:val="0"/>
+          <w:sz w:val="21"/>
+          <w:szCs w:val="21"/>
+          <w:lang w:eastAsia="en-IN"/>
+          <w14:ligatures w14:val="none"/>
+        </w:rPr>
+        <w:t>def</w:t>
+      </w:r>
+      <w:r>
+        <w:rPr>
+          <w:rFonts w:ascii="Consolas" w:eastAsia="Times New Roman" w:hAnsi="Consolas" w:cs="Times New Roman"/>
+          <w:color w:val="CCCCCC"/>
+          <w:kern w:val="0"/>
+          <w:sz w:val="21"/>
+          <w:szCs w:val="21"/>
+          <w:lang w:eastAsia="en-IN"/>
+          <w14:ligatures w14:val="none"/>
+        </w:rPr>
+        <w:t xml:space="preserve"> </w:t>
+      </w:r>
+      <w:r>
+        <w:rPr>
+          <w:rFonts w:ascii="Consolas" w:eastAsia="Times New Roman" w:hAnsi="Consolas" w:cs="Times New Roman"/>
+          <w:color w:val="DCDCAA"/>
+          <w:kern w:val="0"/>
+          <w:sz w:val="21"/>
+          <w:szCs w:val="21"/>
+          <w:lang w:eastAsia="en-IN"/>
+          <w14:ligatures w14:val="none"/>
+        </w:rPr>
+        <w:t>speak</w:t>
+      </w:r>
+      <w:r>
+        <w:rPr>
+          <w:rFonts w:ascii="Consolas" w:eastAsia="Times New Roman" w:hAnsi="Consolas" w:cs="Times New Roman"/>
+          <w:color w:val="CCCCCC"/>
+          <w:kern w:val="0"/>
+          <w:sz w:val="21"/>
+          <w:szCs w:val="21"/>
+          <w:lang w:eastAsia="en-IN"/>
+          <w14:ligatures w14:val="none"/>
+        </w:rPr>
+        <w:t>(</w:t>
+      </w:r>
+      <w:r>
+        <w:rPr>
+          <w:rFonts w:ascii="Consolas" w:eastAsia="Times New Roman" w:hAnsi="Consolas" w:cs="Times New Roman"/>
+          <w:color w:val="9CDCFE"/>
+          <w:kern w:val="0"/>
+          <w:sz w:val="21"/>
+          <w:szCs w:val="21"/>
+          <w:lang w:eastAsia="en-IN"/>
+          <w14:ligatures w14:val="none"/>
+        </w:rPr>
+        <w:t>self</w:t>
+      </w:r>
+      <w:r>
+        <w:rPr>
+          <w:rFonts w:ascii="Consolas" w:eastAsia="Times New Roman" w:hAnsi="Consolas" w:cs="Times New Roman"/>
+          <w:color w:val="CCCCCC"/>
+          <w:kern w:val="0"/>
+          <w:sz w:val="21"/>
+          <w:szCs w:val="21"/>
+          <w:lang w:eastAsia="en-IN"/>
+          <w14:ligatures w14:val="none"/>
+        </w:rPr>
+        <w:t>):</w:t>
+      </w:r>
+    </w:p>
+    <w:p>
+      <w:pPr>
+        <w:pStyle w:val="ListParagraph"/>
+        <w:numPr>
+          <w:ilvl w:val="0"/>
+          <w:numId w:val="4"/>
+        </w:numPr>
+        <w:shd w:val="clear" w:color="auto" w:fill="1F1F1F"/>
+        <w:spacing w:after="0" w:line="285" w:lineRule="atLeast"/>
+        <w:rPr>
+          <w:rFonts w:ascii="Consolas" w:eastAsia="Times New Roman" w:hAnsi="Consolas" w:cs="Times New Roman"/>
+          <w:color w:val="CCCCCC"/>
+          <w:kern w:val="0"/>
+          <w:sz w:val="21"/>
+          <w:szCs w:val="21"/>
+          <w:lang w:eastAsia="en-IN"/>
+          <w14:ligatures w14:val="none"/>
+        </w:rPr>
+      </w:pPr>
+      <w:r>
+        <w:rPr>
+          <w:rFonts w:ascii="Consolas" w:eastAsia="Times New Roman" w:hAnsi="Consolas" w:cs="Times New Roman"/>
+          <w:color w:val="CCCCCC"/>
+          <w:kern w:val="0"/>
+          <w:sz w:val="21"/>
+          <w:szCs w:val="21"/>
+          <w:lang w:eastAsia="en-IN"/>
+          <w14:ligatures w14:val="none"/>
+        </w:rPr>
+        <w:t xml:space="preserve">        </w:t>
       </w:r>
       <w:proofErr w:type="gramStart"/>
       <w:r>
         <w:rPr>
-          <w:rFonts w:ascii="Times New Roman" w:hAnsi="Times New Roman" w:cs="Times New Roman"/>
-        </w:rPr>
-        <w:t>print(</w:t>
+          <w:rFonts w:ascii="Consolas" w:eastAsia="Times New Roman" w:hAnsi="Consolas" w:cs="Times New Roman"/>
+          <w:color w:val="DCDCAA"/>
+          <w:kern w:val="0"/>
+          <w:sz w:val="21"/>
+          <w:szCs w:val="21"/>
+          <w:lang w:eastAsia="en-IN"/>
+          <w14:ligatures w14:val="none"/>
+        </w:rPr>
+        <w:t>print</w:t>
+      </w:r>
+      <w:r>
+        <w:rPr>
+          <w:rFonts w:ascii="Consolas" w:eastAsia="Times New Roman" w:hAnsi="Consolas" w:cs="Times New Roman"/>
+          <w:color w:val="CCCCCC"/>
+          <w:kern w:val="0"/>
+          <w:sz w:val="21"/>
+          <w:szCs w:val="21"/>
+          <w:lang w:eastAsia="en-IN"/>
+          <w14:ligatures w14:val="none"/>
+        </w:rPr>
+        <w:t>(</w:t>
       </w:r>
       <w:proofErr w:type="gramEnd"/>
       <w:r>
         <w:rPr>
-          <w:rFonts w:ascii="Times New Roman" w:hAnsi="Times New Roman" w:cs="Times New Roman"/>
-        </w:rPr>
-        <w:t>"Animal speaks")</w:t>
-      </w:r>
-    </w:p>
-    <w:p>
-      <w:pPr>
-        <w:rPr>
-          <w:rFonts w:ascii="Times New Roman" w:hAnsi="Times New Roman" w:cs="Times New Roman"/>
-        </w:rPr>
-      </w:pPr>
-    </w:p>
-    <w:p>
-      <w:pPr>
-        <w:rPr>
-          <w:rFonts w:ascii="Times New Roman" w:hAnsi="Times New Roman" w:cs="Times New Roman"/>
-        </w:rPr>
-      </w:pPr>
-      <w:r>
-        <w:rPr>
-          <w:rFonts w:ascii="Times New Roman" w:hAnsi="Times New Roman" w:cs="Times New Roman"/>
-        </w:rPr>
-        <w:t xml:space="preserve">class </w:t>
+          <w:rFonts w:ascii="Consolas" w:eastAsia="Times New Roman" w:hAnsi="Consolas" w:cs="Times New Roman"/>
+          <w:color w:val="CE9178"/>
+          <w:kern w:val="0"/>
+          <w:sz w:val="21"/>
+          <w:szCs w:val="21"/>
+          <w:lang w:eastAsia="en-IN"/>
+          <w14:ligatures w14:val="none"/>
+        </w:rPr>
+        <w:t>"Animal speaks"</w:t>
+      </w:r>
+      <w:r>
+        <w:rPr>
+          <w:rFonts w:ascii="Consolas" w:eastAsia="Times New Roman" w:hAnsi="Consolas" w:cs="Times New Roman"/>
+          <w:color w:val="CCCCCC"/>
+          <w:kern w:val="0"/>
+          <w:sz w:val="21"/>
+          <w:szCs w:val="21"/>
+          <w:lang w:eastAsia="en-IN"/>
+          <w14:ligatures w14:val="none"/>
+        </w:rPr>
+        <w:t>)</w:t>
+      </w:r>
+    </w:p>
+    <w:p>
+      <w:pPr>
+        <w:pStyle w:val="ListParagraph"/>
+        <w:numPr>
+          <w:ilvl w:val="0"/>
+          <w:numId w:val="4"/>
+        </w:numPr>
+        <w:shd w:val="clear" w:color="auto" w:fill="1F1F1F"/>
+        <w:spacing w:after="0" w:line="285" w:lineRule="atLeast"/>
+        <w:rPr>
+          <w:rFonts w:ascii="Consolas" w:eastAsia="Times New Roman" w:hAnsi="Consolas" w:cs="Times New Roman"/>
+          <w:color w:val="CCCCCC"/>
+          <w:kern w:val="0"/>
+          <w:sz w:val="21"/>
+          <w:szCs w:val="21"/>
+          <w:lang w:eastAsia="en-IN"/>
+          <w14:ligatures w14:val="none"/>
+        </w:rPr>
+      </w:pPr>
+    </w:p>
+    <w:p>
+      <w:pPr>
+        <w:pStyle w:val="ListParagraph"/>
+        <w:numPr>
+          <w:ilvl w:val="0"/>
+          <w:numId w:val="4"/>
+        </w:numPr>
+        <w:shd w:val="clear" w:color="auto" w:fill="1F1F1F"/>
+        <w:spacing w:after="0" w:line="285" w:lineRule="atLeast"/>
+        <w:rPr>
+          <w:rFonts w:ascii="Consolas" w:eastAsia="Times New Roman" w:hAnsi="Consolas" w:cs="Times New Roman"/>
+          <w:color w:val="CCCCCC"/>
+          <w:kern w:val="0"/>
+          <w:sz w:val="21"/>
+          <w:szCs w:val="21"/>
+          <w:lang w:eastAsia="en-IN"/>
+          <w14:ligatures w14:val="none"/>
+        </w:rPr>
+      </w:pPr>
+      <w:r>
+        <w:rPr>
+          <w:rFonts w:ascii="Consolas" w:eastAsia="Times New Roman" w:hAnsi="Consolas" w:cs="Times New Roman"/>
+          <w:color w:val="569CD6"/>
+          <w:kern w:val="0"/>
+          <w:sz w:val="21"/>
+          <w:szCs w:val="21"/>
+          <w:lang w:eastAsia="en-IN"/>
+          <w14:ligatures w14:val="none"/>
+        </w:rPr>
+        <w:t>class</w:t>
+      </w:r>
+      <w:r>
+        <w:rPr>
+          <w:rFonts w:ascii="Consolas" w:eastAsia="Times New Roman" w:hAnsi="Consolas" w:cs="Times New Roman"/>
+          <w:color w:val="CCCCCC"/>
+          <w:kern w:val="0"/>
+          <w:sz w:val="21"/>
+          <w:szCs w:val="21"/>
+          <w:lang w:eastAsia="en-IN"/>
+          <w14:ligatures w14:val="none"/>
+        </w:rPr>
+        <w:t xml:space="preserve"> </w:t>
       </w:r>
       <w:proofErr w:type="gramStart"/>
       <w:r>
         <w:rPr>
-          <w:rFonts w:ascii="Times New Roman" w:hAnsi="Times New Roman" w:cs="Times New Roman"/>
-        </w:rPr>
-        <w:t>Dog(</w:t>
+          <w:rFonts w:ascii="Consolas" w:eastAsia="Times New Roman" w:hAnsi="Consolas" w:cs="Times New Roman"/>
+          <w:color w:val="4EC9B0"/>
+          <w:kern w:val="0"/>
+          <w:sz w:val="21"/>
+          <w:szCs w:val="21"/>
+          <w:lang w:eastAsia="en-IN"/>
+          <w14:ligatures w14:val="none"/>
+        </w:rPr>
+        <w:t>Dog</w:t>
+      </w:r>
+      <w:r>
+        <w:rPr>
+          <w:rFonts w:ascii="Consolas" w:eastAsia="Times New Roman" w:hAnsi="Consolas" w:cs="Times New Roman"/>
+          <w:color w:val="CCCCCC"/>
+          <w:kern w:val="0"/>
+          <w:sz w:val="21"/>
+          <w:szCs w:val="21"/>
+          <w:lang w:eastAsia="en-IN"/>
+          <w14:ligatures w14:val="none"/>
+        </w:rPr>
+        <w:t>(</w:t>
       </w:r>
       <w:proofErr w:type="gramEnd"/>
       <w:r>
         <w:rPr>
-          <w:rFonts w:ascii="Times New Roman" w:hAnsi="Times New Roman" w:cs="Times New Roman"/>
-        </w:rPr>
-        <w:t>Animal):</w:t>
-      </w:r>
-    </w:p>
-    <w:p>
-      <w:pPr>
-        <w:rPr>
-          <w:rFonts w:ascii="Times New Roman" w:hAnsi="Times New Roman" w:cs="Times New Roman"/>
-        </w:rPr>
-      </w:pPr>
-      <w:r>
-        <w:rPr>
-          <w:rFonts w:ascii="Times New Roman" w:hAnsi="Times New Roman" w:cs="Times New Roman"/>
-        </w:rPr>
-        <w:t xml:space="preserve">    def speak(self):</w:t>
-      </w:r>
-    </w:p>
-    <w:p>
-      <w:pPr>
-        <w:rPr>
-          <w:rFonts w:ascii="Times New Roman" w:hAnsi="Times New Roman" w:cs="Times New Roman"/>
-        </w:rPr>
-      </w:pPr>
-      <w:r>
-        <w:rPr>
-          <w:rFonts w:ascii="Times New Roman" w:hAnsi="Times New Roman" w:cs="Times New Roman"/>
-        </w:rPr>
-        <w:t xml:space="preserve">        print("Woof!")  # Overriding the parent method</w:t>
-      </w:r>
-    </w:p>
-    <w:p>
-      <w:pPr>
-        <w:rPr>
-          <w:rFonts w:ascii="Times New Roman" w:hAnsi="Times New Roman" w:cs="Times New Roman"/>
-        </w:rPr>
-      </w:pPr>
-    </w:p>
-    <w:p>
-      <w:pPr>
-        <w:rPr>
-          <w:rFonts w:ascii="Times New Roman" w:hAnsi="Times New Roman" w:cs="Times New Roman"/>
-        </w:rPr>
-      </w:pPr>
-      <w:r>
-        <w:rPr>
-          <w:rFonts w:ascii="Times New Roman" w:hAnsi="Times New Roman" w:cs="Times New Roman"/>
-        </w:rPr>
-        <w:t xml:space="preserve">dog = </w:t>
+          <w:rFonts w:ascii="Consolas" w:eastAsia="Times New Roman" w:hAnsi="Consolas" w:cs="Times New Roman"/>
+          <w:color w:val="4EC9B0"/>
+          <w:kern w:val="0"/>
+          <w:sz w:val="21"/>
+          <w:szCs w:val="21"/>
+          <w:lang w:eastAsia="en-IN"/>
+          <w14:ligatures w14:val="none"/>
+        </w:rPr>
+        <w:t>Animal</w:t>
+      </w:r>
+      <w:r>
+        <w:rPr>
+          <w:rFonts w:ascii="Consolas" w:eastAsia="Times New Roman" w:hAnsi="Consolas" w:cs="Times New Roman"/>
+          <w:color w:val="CCCCCC"/>
+          <w:kern w:val="0"/>
+          <w:sz w:val="21"/>
+          <w:szCs w:val="21"/>
+          <w:lang w:eastAsia="en-IN"/>
+          <w14:ligatures w14:val="none"/>
+        </w:rPr>
+        <w:t>):</w:t>
+      </w:r>
+    </w:p>
+    <w:p>
+      <w:pPr>
+        <w:pStyle w:val="ListParagraph"/>
+        <w:numPr>
+          <w:ilvl w:val="0"/>
+          <w:numId w:val="4"/>
+        </w:numPr>
+        <w:shd w:val="clear" w:color="auto" w:fill="1F1F1F"/>
+        <w:spacing w:after="0" w:line="285" w:lineRule="atLeast"/>
+        <w:rPr>
+          <w:rFonts w:ascii="Consolas" w:eastAsia="Times New Roman" w:hAnsi="Consolas" w:cs="Times New Roman"/>
+          <w:color w:val="CCCCCC"/>
+          <w:kern w:val="0"/>
+          <w:sz w:val="21"/>
+          <w:szCs w:val="21"/>
+          <w:lang w:eastAsia="en-IN"/>
+          <w14:ligatures w14:val="none"/>
+        </w:rPr>
+      </w:pPr>
+      <w:r>
+        <w:rPr>
+          <w:rFonts w:ascii="Consolas" w:eastAsia="Times New Roman" w:hAnsi="Consolas" w:cs="Times New Roman"/>
+          <w:color w:val="CCCCCC"/>
+          <w:kern w:val="0"/>
+          <w:sz w:val="21"/>
+          <w:szCs w:val="21"/>
+          <w:lang w:eastAsia="en-IN"/>
+          <w14:ligatures w14:val="none"/>
+        </w:rPr>
+        <w:t xml:space="preserve">    </w:t>
+      </w:r>
+      <w:r>
+        <w:rPr>
+          <w:rFonts w:ascii="Consolas" w:eastAsia="Times New Roman" w:hAnsi="Consolas" w:cs="Times New Roman"/>
+          <w:color w:val="569CD6"/>
+          <w:kern w:val="0"/>
+          <w:sz w:val="21"/>
+          <w:szCs w:val="21"/>
+          <w:lang w:eastAsia="en-IN"/>
+          <w14:ligatures w14:val="none"/>
+        </w:rPr>
+        <w:t>def</w:t>
+      </w:r>
+      <w:r>
+        <w:rPr>
+          <w:rFonts w:ascii="Consolas" w:eastAsia="Times New Roman" w:hAnsi="Consolas" w:cs="Times New Roman"/>
+          <w:color w:val="CCCCCC"/>
+          <w:kern w:val="0"/>
+          <w:sz w:val="21"/>
+          <w:szCs w:val="21"/>
+          <w:lang w:eastAsia="en-IN"/>
+          <w14:ligatures w14:val="none"/>
+        </w:rPr>
+        <w:t xml:space="preserve"> </w:t>
+      </w:r>
+      <w:r>
+        <w:rPr>
+          <w:rFonts w:ascii="Consolas" w:eastAsia="Times New Roman" w:hAnsi="Consolas" w:cs="Times New Roman"/>
+          <w:color w:val="DCDCAA"/>
+          <w:kern w:val="0"/>
+          <w:sz w:val="21"/>
+          <w:szCs w:val="21"/>
+          <w:lang w:eastAsia="en-IN"/>
+          <w14:ligatures w14:val="none"/>
+        </w:rPr>
+        <w:t>speak</w:t>
+      </w:r>
+      <w:r>
+        <w:rPr>
+          <w:rFonts w:ascii="Consolas" w:eastAsia="Times New Roman" w:hAnsi="Consolas" w:cs="Times New Roman"/>
+          <w:color w:val="CCCCCC"/>
+          <w:kern w:val="0"/>
+          <w:sz w:val="21"/>
+          <w:szCs w:val="21"/>
+          <w:lang w:eastAsia="en-IN"/>
+          <w14:ligatures w14:val="none"/>
+        </w:rPr>
+        <w:t>(</w:t>
+      </w:r>
+      <w:r>
+        <w:rPr>
+          <w:rFonts w:ascii="Consolas" w:eastAsia="Times New Roman" w:hAnsi="Consolas" w:cs="Times New Roman"/>
+          <w:color w:val="9CDCFE"/>
+          <w:kern w:val="0"/>
+          <w:sz w:val="21"/>
+          <w:szCs w:val="21"/>
+          <w:lang w:eastAsia="en-IN"/>
+          <w14:ligatures w14:val="none"/>
+        </w:rPr>
+        <w:t>self</w:t>
+      </w:r>
+      <w:r>
+        <w:rPr>
+          <w:rFonts w:ascii="Consolas" w:eastAsia="Times New Roman" w:hAnsi="Consolas" w:cs="Times New Roman"/>
+          <w:color w:val="CCCCCC"/>
+          <w:kern w:val="0"/>
+          <w:sz w:val="21"/>
+          <w:szCs w:val="21"/>
+          <w:lang w:eastAsia="en-IN"/>
+          <w14:ligatures w14:val="none"/>
+        </w:rPr>
+        <w:t>):</w:t>
+      </w:r>
+    </w:p>
+    <w:p>
+      <w:pPr>
+        <w:pStyle w:val="ListParagraph"/>
+        <w:numPr>
+          <w:ilvl w:val="0"/>
+          <w:numId w:val="4"/>
+        </w:numPr>
+        <w:shd w:val="clear" w:color="auto" w:fill="1F1F1F"/>
+        <w:spacing w:after="0" w:line="285" w:lineRule="atLeast"/>
+        <w:rPr>
+          <w:rFonts w:ascii="Consolas" w:eastAsia="Times New Roman" w:hAnsi="Consolas" w:cs="Times New Roman"/>
+          <w:color w:val="CCCCCC"/>
+          <w:kern w:val="0"/>
+          <w:sz w:val="21"/>
+          <w:szCs w:val="21"/>
+          <w:lang w:eastAsia="en-IN"/>
+          <w14:ligatures w14:val="none"/>
+        </w:rPr>
+      </w:pPr>
+      <w:r>
+        <w:rPr>
+          <w:rFonts w:ascii="Consolas" w:eastAsia="Times New Roman" w:hAnsi="Consolas" w:cs="Times New Roman"/>
+          <w:color w:val="CCCCCC"/>
+          <w:kern w:val="0"/>
+          <w:sz w:val="21"/>
+          <w:szCs w:val="21"/>
+          <w:lang w:eastAsia="en-IN"/>
+          <w14:ligatures w14:val="none"/>
+        </w:rPr>
+        <w:t xml:space="preserve">        </w:t>
+      </w:r>
+      <w:r>
+        <w:rPr>
+          <w:rFonts w:ascii="Consolas" w:eastAsia="Times New Roman" w:hAnsi="Consolas" w:cs="Times New Roman"/>
+          <w:color w:val="DCDCAA"/>
+          <w:kern w:val="0"/>
+          <w:sz w:val="21"/>
+          <w:szCs w:val="21"/>
+          <w:lang w:eastAsia="en-IN"/>
+          <w14:ligatures w14:val="none"/>
+        </w:rPr>
+        <w:t>print</w:t>
+      </w:r>
+      <w:r>
+        <w:rPr>
+          <w:rFonts w:ascii="Consolas" w:eastAsia="Times New Roman" w:hAnsi="Consolas" w:cs="Times New Roman"/>
+          <w:color w:val="CCCCCC"/>
+          <w:kern w:val="0"/>
+          <w:sz w:val="21"/>
+          <w:szCs w:val="21"/>
+          <w:lang w:eastAsia="en-IN"/>
+          <w14:ligatures w14:val="none"/>
+        </w:rPr>
+        <w:t>(</w:t>
+      </w:r>
+      <w:r>
+        <w:rPr>
+          <w:rFonts w:ascii="Consolas" w:eastAsia="Times New Roman" w:hAnsi="Consolas" w:cs="Times New Roman"/>
+          <w:color w:val="CE9178"/>
+          <w:kern w:val="0"/>
+          <w:sz w:val="21"/>
+          <w:szCs w:val="21"/>
+          <w:lang w:eastAsia="en-IN"/>
+          <w14:ligatures w14:val="none"/>
+        </w:rPr>
+        <w:t>"Woof!"</w:t>
+      </w:r>
+      <w:r>
+        <w:rPr>
+          <w:rFonts w:ascii="Consolas" w:eastAsia="Times New Roman" w:hAnsi="Consolas" w:cs="Times New Roman"/>
+          <w:color w:val="CCCCCC"/>
+          <w:kern w:val="0"/>
+          <w:sz w:val="21"/>
+          <w:szCs w:val="21"/>
+          <w:lang w:eastAsia="en-IN"/>
+          <w14:ligatures w14:val="none"/>
+        </w:rPr>
+        <w:t>)  </w:t>
+      </w:r>
+      <w:r>
+        <w:rPr>
+          <w:rFonts w:ascii="Consolas" w:eastAsia="Times New Roman" w:hAnsi="Consolas" w:cs="Times New Roman"/>
+          <w:color w:val="6A9955"/>
+          <w:kern w:val="0"/>
+          <w:sz w:val="21"/>
+          <w:szCs w:val="21"/>
+          <w:lang w:eastAsia="en-IN"/>
+          <w14:ligatures w14:val="none"/>
+        </w:rPr>
+        <w:t># Overriding the parent method</w:t>
+      </w:r>
+    </w:p>
+    <w:p>
+      <w:pPr>
+        <w:pStyle w:val="ListParagraph"/>
+        <w:numPr>
+          <w:ilvl w:val="0"/>
+          <w:numId w:val="4"/>
+        </w:numPr>
+        <w:shd w:val="clear" w:color="auto" w:fill="1F1F1F"/>
+        <w:spacing w:after="0" w:line="285" w:lineRule="atLeast"/>
+        <w:rPr>
+          <w:rFonts w:ascii="Consolas" w:eastAsia="Times New Roman" w:hAnsi="Consolas" w:cs="Times New Roman"/>
+          <w:color w:val="CCCCCC"/>
+          <w:kern w:val="0"/>
+          <w:sz w:val="21"/>
+          <w:szCs w:val="21"/>
+          <w:lang w:eastAsia="en-IN"/>
+          <w14:ligatures w14:val="none"/>
+        </w:rPr>
+      </w:pPr>
+    </w:p>
+    <w:p>
+      <w:pPr>
+        <w:pStyle w:val="ListParagraph"/>
+        <w:numPr>
+          <w:ilvl w:val="0"/>
+          <w:numId w:val="4"/>
+        </w:numPr>
+        <w:shd w:val="clear" w:color="auto" w:fill="1F1F1F"/>
+        <w:spacing w:after="0" w:line="285" w:lineRule="atLeast"/>
+        <w:rPr>
+          <w:rFonts w:ascii="Consolas" w:eastAsia="Times New Roman" w:hAnsi="Consolas" w:cs="Times New Roman"/>
+          <w:color w:val="CCCCCC"/>
+          <w:kern w:val="0"/>
+          <w:sz w:val="21"/>
+          <w:szCs w:val="21"/>
+          <w:lang w:eastAsia="en-IN"/>
+          <w14:ligatures w14:val="none"/>
+        </w:rPr>
+      </w:pPr>
+      <w:r>
+        <w:rPr>
+          <w:rFonts w:ascii="Consolas" w:eastAsia="Times New Roman" w:hAnsi="Consolas" w:cs="Times New Roman"/>
+          <w:color w:val="9CDCFE"/>
+          <w:kern w:val="0"/>
+          <w:sz w:val="21"/>
+          <w:szCs w:val="21"/>
+          <w:lang w:eastAsia="en-IN"/>
+          <w14:ligatures w14:val="none"/>
+        </w:rPr>
+        <w:t>dog</w:t>
+      </w:r>
+      <w:r>
+        <w:rPr>
+          <w:rFonts w:ascii="Consolas" w:eastAsia="Times New Roman" w:hAnsi="Consolas" w:cs="Times New Roman"/>
+          <w:color w:val="CCCCCC"/>
+          <w:kern w:val="0"/>
+          <w:sz w:val="21"/>
+          <w:szCs w:val="21"/>
+          <w:lang w:eastAsia="en-IN"/>
+          <w14:ligatures w14:val="none"/>
+        </w:rPr>
+        <w:t xml:space="preserve"> </w:t>
+      </w:r>
+      <w:r>
+        <w:rPr>
+          <w:rFonts w:ascii="Consolas" w:eastAsia="Times New Roman" w:hAnsi="Consolas" w:cs="Times New Roman"/>
+          <w:color w:val="D4D4D4"/>
+          <w:kern w:val="0"/>
+          <w:sz w:val="21"/>
+          <w:szCs w:val="21"/>
+          <w:lang w:eastAsia="en-IN"/>
+          <w14:ligatures w14:val="none"/>
+        </w:rPr>
+        <w:t>=</w:t>
+      </w:r>
+      <w:r>
+        <w:rPr>
+          <w:rFonts w:ascii="Consolas" w:eastAsia="Times New Roman" w:hAnsi="Consolas" w:cs="Times New Roman"/>
+          <w:color w:val="CCCCCC"/>
+          <w:kern w:val="0"/>
+          <w:sz w:val="21"/>
+          <w:szCs w:val="21"/>
+          <w:lang w:eastAsia="en-IN"/>
+          <w14:ligatures w14:val="none"/>
+        </w:rPr>
+        <w:t xml:space="preserve"> </w:t>
       </w:r>
       <w:proofErr w:type="gramStart"/>
       <w:r>
         <w:rPr>
-          <w:rFonts w:ascii="Times New Roman" w:hAnsi="Times New Roman" w:cs="Times New Roman"/>
-        </w:rPr>
-        <w:t>Dog(</w:t>
+          <w:rFonts w:ascii="Consolas" w:eastAsia="Times New Roman" w:hAnsi="Consolas" w:cs="Times New Roman"/>
+          <w:color w:val="4EC9B0"/>
+          <w:kern w:val="0"/>
+          <w:sz w:val="21"/>
+          <w:szCs w:val="21"/>
+          <w:lang w:eastAsia="en-IN"/>
+          <w14:ligatures w14:val="none"/>
+        </w:rPr>
+        <w:t>Dog</w:t>
+      </w:r>
+      <w:r>
+        <w:rPr>
+          <w:rFonts w:ascii="Consolas" w:eastAsia="Times New Roman" w:hAnsi="Consolas" w:cs="Times New Roman"/>
+          <w:color w:val="CCCCCC"/>
+          <w:kern w:val="0"/>
+          <w:sz w:val="21"/>
+          <w:szCs w:val="21"/>
+          <w:lang w:eastAsia="en-IN"/>
+          <w14:ligatures w14:val="none"/>
+        </w:rPr>
+        <w:t>(</w:t>
       </w:r>
       <w:proofErr w:type="gramEnd"/>
       <w:r>
         <w:rPr>
-          <w:rFonts w:ascii="Times New Roman" w:hAnsi="Times New Roman" w:cs="Times New Roman"/>
+          <w:rFonts w:ascii="Consolas" w:eastAsia="Times New Roman" w:hAnsi="Consolas" w:cs="Times New Roman"/>
+          <w:color w:val="CCCCCC"/>
+          <w:kern w:val="0"/>
+          <w:sz w:val="21"/>
+          <w:szCs w:val="21"/>
+          <w:lang w:eastAsia="en-IN"/>
+          <w14:ligatures w14:val="none"/>
         </w:rPr>
         <w:t>)</w:t>
       </w:r>
     </w:p>
     <w:p>
       <w:pPr>
-        <w:rPr>
-          <w:rFonts w:ascii="Times New Roman" w:hAnsi="Times New Roman" w:cs="Times New Roman"/>
+        <w:pStyle w:val="ListParagraph"/>
+        <w:numPr>
+          <w:ilvl w:val="0"/>
+          <w:numId w:val="4"/>
+        </w:numPr>
+        <w:shd w:val="clear" w:color="auto" w:fill="1F1F1F"/>
+        <w:spacing w:after="0" w:line="285" w:lineRule="atLeast"/>
+        <w:rPr>
+          <w:rFonts w:ascii="Consolas" w:eastAsia="Times New Roman" w:hAnsi="Consolas" w:cs="Times New Roman"/>
+          <w:color w:val="CCCCCC"/>
+          <w:kern w:val="0"/>
+          <w:sz w:val="21"/>
+          <w:szCs w:val="21"/>
+          <w:lang w:eastAsia="en-IN"/>
+          <w14:ligatures w14:val="none"/>
         </w:rPr>
       </w:pPr>
       <w:proofErr w:type="spellStart"/>
       <w:proofErr w:type="gramStart"/>
       <w:r>
         <w:rPr>
-          <w:rFonts w:ascii="Times New Roman" w:hAnsi="Times New Roman" w:cs="Times New Roman"/>
-        </w:rPr>
-        <w:t>dog.speak</w:t>
+          <w:rFonts w:ascii="Consolas" w:eastAsia="Times New Roman" w:hAnsi="Consolas" w:cs="Times New Roman"/>
+          <w:color w:val="9CDCFE"/>
+          <w:kern w:val="0"/>
+          <w:sz w:val="21"/>
+          <w:szCs w:val="21"/>
+          <w:lang w:eastAsia="en-IN"/>
+          <w14:ligatures w14:val="none"/>
+        </w:rPr>
+        <w:t>dog</w:t>
+      </w:r>
+      <w:r>
+        <w:rPr>
+          <w:rFonts w:ascii="Consolas" w:eastAsia="Times New Roman" w:hAnsi="Consolas" w:cs="Times New Roman"/>
+          <w:color w:val="CCCCCC"/>
+          <w:kern w:val="0"/>
+          <w:sz w:val="21"/>
+          <w:szCs w:val="21"/>
+          <w:lang w:eastAsia="en-IN"/>
+          <w14:ligatures w14:val="none"/>
+        </w:rPr>
+        <w:t>.</w:t>
+      </w:r>
+      <w:r>
+        <w:rPr>
+          <w:rFonts w:ascii="Consolas" w:eastAsia="Times New Roman" w:hAnsi="Consolas" w:cs="Times New Roman"/>
+          <w:color w:val="DCDCAA"/>
+          <w:kern w:val="0"/>
+          <w:sz w:val="21"/>
+          <w:szCs w:val="21"/>
+          <w:lang w:eastAsia="en-IN"/>
+          <w14:ligatures w14:val="none"/>
+        </w:rPr>
+        <w:t>speak</w:t>
       </w:r>
       <w:proofErr w:type="spellEnd"/>
       <w:proofErr w:type="gramEnd"/>
       <w:r>
         <w:rPr>
-          <w:rFonts w:ascii="Times New Roman" w:hAnsi="Times New Roman" w:cs="Times New Roman"/>
-        </w:rPr>
-        <w:t>()  # Output: Woof!</w:t>
+          <w:rFonts w:ascii="Consolas" w:eastAsia="Times New Roman" w:hAnsi="Consolas" w:cs="Times New Roman"/>
+          <w:color w:val="CCCCCC"/>
+          <w:kern w:val="0"/>
+          <w:sz w:val="21"/>
+          <w:szCs w:val="21"/>
+          <w:lang w:eastAsia="en-IN"/>
+          <w14:ligatures w14:val="none"/>
+        </w:rPr>
+        <w:t>()  </w:t>
+      </w:r>
+      <w:r>
+        <w:rPr>
+          <w:rFonts w:ascii="Consolas" w:eastAsia="Times New Roman" w:hAnsi="Consolas" w:cs="Times New Roman"/>
+          <w:color w:val="6A9955"/>
+          <w:kern w:val="0"/>
+          <w:sz w:val="21"/>
+          <w:szCs w:val="21"/>
+          <w:lang w:eastAsia="en-IN"/>
+          <w14:ligatures w14:val="none"/>
+        </w:rPr>
+        <w:t># Output: Woof!</w:t>
       </w:r>
     </w:p>
     <w:p>
@@ -3750,199 +4326,671 @@
     </w:p>
     <w:p>
       <w:pPr>
-        <w:rPr>
-          <w:rFonts w:ascii="Times New Roman" w:hAnsi="Times New Roman" w:cs="Times New Roman"/>
-        </w:rPr>
-      </w:pPr>
-      <w:r>
-        <w:rPr>
-          <w:rFonts w:ascii="Times New Roman" w:hAnsi="Times New Roman" w:cs="Times New Roman"/>
-        </w:rPr>
-        <w:t>python</w:t>
-      </w:r>
-    </w:p>
-    <w:p>
-      <w:pPr>
-        <w:rPr>
-          <w:rFonts w:ascii="Times New Roman" w:hAnsi="Times New Roman" w:cs="Times New Roman"/>
-        </w:rPr>
-      </w:pPr>
-      <w:proofErr w:type="spellStart"/>
-      <w:r>
-        <w:rPr>
-          <w:rFonts w:ascii="Times New Roman" w:hAnsi="Times New Roman" w:cs="Times New Roman"/>
-        </w:rPr>
-        <w:t>CopyEdit</w:t>
-      </w:r>
-      <w:proofErr w:type="spellEnd"/>
-    </w:p>
-    <w:p>
-      <w:pPr>
-        <w:rPr>
-          <w:rFonts w:ascii="Times New Roman" w:hAnsi="Times New Roman" w:cs="Times New Roman"/>
-        </w:rPr>
-      </w:pPr>
-      <w:r>
-        <w:rPr>
-          <w:rFonts w:ascii="Times New Roman" w:hAnsi="Times New Roman" w:cs="Times New Roman"/>
-        </w:rPr>
-        <w:t xml:space="preserve">class </w:t>
+        <w:pStyle w:val="ListParagraph"/>
+        <w:numPr>
+          <w:ilvl w:val="0"/>
+          <w:numId w:val="5"/>
+        </w:numPr>
+        <w:shd w:val="clear" w:color="auto" w:fill="1F1F1F"/>
+        <w:spacing w:after="0" w:line="285" w:lineRule="atLeast"/>
+        <w:rPr>
+          <w:rFonts w:ascii="Consolas" w:eastAsia="Times New Roman" w:hAnsi="Consolas" w:cs="Times New Roman"/>
+          <w:color w:val="CCCCCC"/>
+          <w:kern w:val="0"/>
+          <w:sz w:val="21"/>
+          <w:szCs w:val="21"/>
+          <w:lang w:eastAsia="en-IN"/>
+          <w14:ligatures w14:val="none"/>
+        </w:rPr>
+      </w:pPr>
+      <w:r>
+        <w:rPr>
+          <w:rFonts w:ascii="Consolas" w:eastAsia="Times New Roman" w:hAnsi="Consolas" w:cs="Times New Roman"/>
+          <w:color w:val="569CD6"/>
+          <w:kern w:val="0"/>
+          <w:sz w:val="21"/>
+          <w:szCs w:val="21"/>
+          <w:lang w:eastAsia="en-IN"/>
+          <w14:ligatures w14:val="none"/>
+        </w:rPr>
+        <w:t>class</w:t>
+      </w:r>
+      <w:r>
+        <w:rPr>
+          <w:rFonts w:ascii="Consolas" w:eastAsia="Times New Roman" w:hAnsi="Consolas" w:cs="Times New Roman"/>
+          <w:color w:val="CCCCCC"/>
+          <w:kern w:val="0"/>
+          <w:sz w:val="21"/>
+          <w:szCs w:val="21"/>
+          <w:lang w:eastAsia="en-IN"/>
+          <w14:ligatures w14:val="none"/>
+        </w:rPr>
+        <w:t xml:space="preserve"> </w:t>
       </w:r>
       <w:proofErr w:type="gramStart"/>
       <w:r>
         <w:rPr>
-          <w:rFonts w:ascii="Times New Roman" w:hAnsi="Times New Roman" w:cs="Times New Roman"/>
-        </w:rPr>
-        <w:t>Cat(</w:t>
+          <w:rFonts w:ascii="Consolas" w:eastAsia="Times New Roman" w:hAnsi="Consolas" w:cs="Times New Roman"/>
+          <w:color w:val="4EC9B0"/>
+          <w:kern w:val="0"/>
+          <w:sz w:val="21"/>
+          <w:szCs w:val="21"/>
+          <w:lang w:eastAsia="en-IN"/>
+          <w14:ligatures w14:val="none"/>
+        </w:rPr>
+        <w:t>Cat</w:t>
+      </w:r>
+      <w:r>
+        <w:rPr>
+          <w:rFonts w:ascii="Consolas" w:eastAsia="Times New Roman" w:hAnsi="Consolas" w:cs="Times New Roman"/>
+          <w:color w:val="CCCCCC"/>
+          <w:kern w:val="0"/>
+          <w:sz w:val="21"/>
+          <w:szCs w:val="21"/>
+          <w:lang w:eastAsia="en-IN"/>
+          <w14:ligatures w14:val="none"/>
+        </w:rPr>
+        <w:t>(</w:t>
       </w:r>
       <w:proofErr w:type="gramEnd"/>
       <w:r>
         <w:rPr>
-          <w:rFonts w:ascii="Times New Roman" w:hAnsi="Times New Roman" w:cs="Times New Roman"/>
-        </w:rPr>
-        <w:t>Animal):</w:t>
-      </w:r>
-    </w:p>
-    <w:p>
-      <w:pPr>
-        <w:rPr>
-          <w:rFonts w:ascii="Times New Roman" w:hAnsi="Times New Roman" w:cs="Times New Roman"/>
-        </w:rPr>
-      </w:pPr>
-      <w:r>
-        <w:rPr>
-          <w:rFonts w:ascii="Times New Roman" w:hAnsi="Times New Roman" w:cs="Times New Roman"/>
-        </w:rPr>
-        <w:t xml:space="preserve">    def speak(self):</w:t>
-      </w:r>
-    </w:p>
-    <w:p>
-      <w:pPr>
-        <w:rPr>
-          <w:rFonts w:ascii="Times New Roman" w:hAnsi="Times New Roman" w:cs="Times New Roman"/>
-        </w:rPr>
-      </w:pPr>
-      <w:r>
-        <w:rPr>
-          <w:rFonts w:ascii="Times New Roman" w:hAnsi="Times New Roman" w:cs="Times New Roman"/>
-        </w:rPr>
-        <w:t xml:space="preserve">        print("Meow!")</w:t>
-      </w:r>
-    </w:p>
-    <w:p>
-      <w:pPr>
-        <w:rPr>
-          <w:rFonts w:ascii="Times New Roman" w:hAnsi="Times New Roman" w:cs="Times New Roman"/>
-        </w:rPr>
-      </w:pPr>
-    </w:p>
-    <w:p>
-      <w:pPr>
-        <w:rPr>
-          <w:rFonts w:ascii="Times New Roman" w:hAnsi="Times New Roman" w:cs="Times New Roman"/>
-        </w:rPr>
-      </w:pPr>
-      <w:r>
-        <w:rPr>
-          <w:rFonts w:ascii="Times New Roman" w:hAnsi="Times New Roman" w:cs="Times New Roman"/>
+          <w:rFonts w:ascii="Consolas" w:eastAsia="Times New Roman" w:hAnsi="Consolas" w:cs="Times New Roman"/>
+          <w:color w:val="4EC9B0"/>
+          <w:kern w:val="0"/>
+          <w:sz w:val="21"/>
+          <w:szCs w:val="21"/>
+          <w:lang w:eastAsia="en-IN"/>
+          <w14:ligatures w14:val="none"/>
+        </w:rPr>
+        <w:t>Animal</w:t>
+      </w:r>
+      <w:r>
+        <w:rPr>
+          <w:rFonts w:ascii="Consolas" w:eastAsia="Times New Roman" w:hAnsi="Consolas" w:cs="Times New Roman"/>
+          <w:color w:val="CCCCCC"/>
+          <w:kern w:val="0"/>
+          <w:sz w:val="21"/>
+          <w:szCs w:val="21"/>
+          <w:lang w:eastAsia="en-IN"/>
+          <w14:ligatures w14:val="none"/>
+        </w:rPr>
+        <w:t>):</w:t>
+      </w:r>
+    </w:p>
+    <w:p>
+      <w:pPr>
+        <w:pStyle w:val="ListParagraph"/>
+        <w:numPr>
+          <w:ilvl w:val="0"/>
+          <w:numId w:val="5"/>
+        </w:numPr>
+        <w:shd w:val="clear" w:color="auto" w:fill="1F1F1F"/>
+        <w:spacing w:after="0" w:line="285" w:lineRule="atLeast"/>
+        <w:rPr>
+          <w:rFonts w:ascii="Consolas" w:eastAsia="Times New Roman" w:hAnsi="Consolas" w:cs="Times New Roman"/>
+          <w:color w:val="CCCCCC"/>
+          <w:kern w:val="0"/>
+          <w:sz w:val="21"/>
+          <w:szCs w:val="21"/>
+          <w:lang w:eastAsia="en-IN"/>
+          <w14:ligatures w14:val="none"/>
+        </w:rPr>
+      </w:pPr>
+      <w:r>
+        <w:rPr>
+          <w:rFonts w:ascii="Consolas" w:eastAsia="Times New Roman" w:hAnsi="Consolas" w:cs="Times New Roman"/>
+          <w:color w:val="CCCCCC"/>
+          <w:kern w:val="0"/>
+          <w:sz w:val="21"/>
+          <w:szCs w:val="21"/>
+          <w:lang w:eastAsia="en-IN"/>
+          <w14:ligatures w14:val="none"/>
+        </w:rPr>
+        <w:t xml:space="preserve">    </w:t>
+      </w:r>
+      <w:r>
+        <w:rPr>
+          <w:rFonts w:ascii="Consolas" w:eastAsia="Times New Roman" w:hAnsi="Consolas" w:cs="Times New Roman"/>
+          <w:color w:val="569CD6"/>
+          <w:kern w:val="0"/>
+          <w:sz w:val="21"/>
+          <w:szCs w:val="21"/>
+          <w:lang w:eastAsia="en-IN"/>
+          <w14:ligatures w14:val="none"/>
+        </w:rPr>
+        <w:t>def</w:t>
+      </w:r>
+      <w:r>
+        <w:rPr>
+          <w:rFonts w:ascii="Consolas" w:eastAsia="Times New Roman" w:hAnsi="Consolas" w:cs="Times New Roman"/>
+          <w:color w:val="CCCCCC"/>
+          <w:kern w:val="0"/>
+          <w:sz w:val="21"/>
+          <w:szCs w:val="21"/>
+          <w:lang w:eastAsia="en-IN"/>
+          <w14:ligatures w14:val="none"/>
+        </w:rPr>
+        <w:t xml:space="preserve"> </w:t>
+      </w:r>
+      <w:r>
+        <w:rPr>
+          <w:rFonts w:ascii="Consolas" w:eastAsia="Times New Roman" w:hAnsi="Consolas" w:cs="Times New Roman"/>
+          <w:color w:val="DCDCAA"/>
+          <w:kern w:val="0"/>
+          <w:sz w:val="21"/>
+          <w:szCs w:val="21"/>
+          <w:lang w:eastAsia="en-IN"/>
+          <w14:ligatures w14:val="none"/>
+        </w:rPr>
+        <w:t>speak</w:t>
+      </w:r>
+      <w:r>
+        <w:rPr>
+          <w:rFonts w:ascii="Consolas" w:eastAsia="Times New Roman" w:hAnsi="Consolas" w:cs="Times New Roman"/>
+          <w:color w:val="CCCCCC"/>
+          <w:kern w:val="0"/>
+          <w:sz w:val="21"/>
+          <w:szCs w:val="21"/>
+          <w:lang w:eastAsia="en-IN"/>
+          <w14:ligatures w14:val="none"/>
+        </w:rPr>
+        <w:t>(</w:t>
+      </w:r>
+      <w:r>
+        <w:rPr>
+          <w:rFonts w:ascii="Consolas" w:eastAsia="Times New Roman" w:hAnsi="Consolas" w:cs="Times New Roman"/>
+          <w:color w:val="9CDCFE"/>
+          <w:kern w:val="0"/>
+          <w:sz w:val="21"/>
+          <w:szCs w:val="21"/>
+          <w:lang w:eastAsia="en-IN"/>
+          <w14:ligatures w14:val="none"/>
+        </w:rPr>
+        <w:t>self</w:t>
+      </w:r>
+      <w:r>
+        <w:rPr>
+          <w:rFonts w:ascii="Consolas" w:eastAsia="Times New Roman" w:hAnsi="Consolas" w:cs="Times New Roman"/>
+          <w:color w:val="CCCCCC"/>
+          <w:kern w:val="0"/>
+          <w:sz w:val="21"/>
+          <w:szCs w:val="21"/>
+          <w:lang w:eastAsia="en-IN"/>
+          <w14:ligatures w14:val="none"/>
+        </w:rPr>
+        <w:t>):</w:t>
+      </w:r>
+    </w:p>
+    <w:p>
+      <w:pPr>
+        <w:pStyle w:val="ListParagraph"/>
+        <w:numPr>
+          <w:ilvl w:val="0"/>
+          <w:numId w:val="5"/>
+        </w:numPr>
+        <w:shd w:val="clear" w:color="auto" w:fill="1F1F1F"/>
+        <w:spacing w:after="0" w:line="285" w:lineRule="atLeast"/>
+        <w:rPr>
+          <w:rFonts w:ascii="Consolas" w:eastAsia="Times New Roman" w:hAnsi="Consolas" w:cs="Times New Roman"/>
+          <w:color w:val="CCCCCC"/>
+          <w:kern w:val="0"/>
+          <w:sz w:val="21"/>
+          <w:szCs w:val="21"/>
+          <w:lang w:eastAsia="en-IN"/>
+          <w14:ligatures w14:val="none"/>
+        </w:rPr>
+      </w:pPr>
+      <w:r>
+        <w:rPr>
+          <w:rFonts w:ascii="Consolas" w:eastAsia="Times New Roman" w:hAnsi="Consolas" w:cs="Times New Roman"/>
+          <w:color w:val="CCCCCC"/>
+          <w:kern w:val="0"/>
+          <w:sz w:val="21"/>
+          <w:szCs w:val="21"/>
+          <w:lang w:eastAsia="en-IN"/>
+          <w14:ligatures w14:val="none"/>
+        </w:rPr>
+        <w:t xml:space="preserve">        </w:t>
+      </w:r>
+      <w:r>
+        <w:rPr>
+          <w:rFonts w:ascii="Consolas" w:eastAsia="Times New Roman" w:hAnsi="Consolas" w:cs="Times New Roman"/>
+          <w:color w:val="DCDCAA"/>
+          <w:kern w:val="0"/>
+          <w:sz w:val="21"/>
+          <w:szCs w:val="21"/>
+          <w:lang w:eastAsia="en-IN"/>
+          <w14:ligatures w14:val="none"/>
+        </w:rPr>
+        <w:t>print</w:t>
+      </w:r>
+      <w:r>
+        <w:rPr>
+          <w:rFonts w:ascii="Consolas" w:eastAsia="Times New Roman" w:hAnsi="Consolas" w:cs="Times New Roman"/>
+          <w:color w:val="CCCCCC"/>
+          <w:kern w:val="0"/>
+          <w:sz w:val="21"/>
+          <w:szCs w:val="21"/>
+          <w:lang w:eastAsia="en-IN"/>
+          <w14:ligatures w14:val="none"/>
+        </w:rPr>
+        <w:t>(</w:t>
+      </w:r>
+      <w:r>
+        <w:rPr>
+          <w:rFonts w:ascii="Consolas" w:eastAsia="Times New Roman" w:hAnsi="Consolas" w:cs="Times New Roman"/>
+          <w:color w:val="CE9178"/>
+          <w:kern w:val="0"/>
+          <w:sz w:val="21"/>
+          <w:szCs w:val="21"/>
+          <w:lang w:eastAsia="en-IN"/>
+          <w14:ligatures w14:val="none"/>
+        </w:rPr>
+        <w:t>"Meow!"</w:t>
+      </w:r>
+      <w:r>
+        <w:rPr>
+          <w:rFonts w:ascii="Consolas" w:eastAsia="Times New Roman" w:hAnsi="Consolas" w:cs="Times New Roman"/>
+          <w:color w:val="CCCCCC"/>
+          <w:kern w:val="0"/>
+          <w:sz w:val="21"/>
+          <w:szCs w:val="21"/>
+          <w:lang w:eastAsia="en-IN"/>
+          <w14:ligatures w14:val="none"/>
+        </w:rPr>
+        <w:t>)</w:t>
+      </w:r>
+    </w:p>
+    <w:p>
+      <w:pPr>
+        <w:pStyle w:val="ListParagraph"/>
+        <w:numPr>
+          <w:ilvl w:val="0"/>
+          <w:numId w:val="5"/>
+        </w:numPr>
+        <w:shd w:val="clear" w:color="auto" w:fill="1F1F1F"/>
+        <w:spacing w:after="0" w:line="285" w:lineRule="atLeast"/>
+        <w:rPr>
+          <w:rFonts w:ascii="Consolas" w:eastAsia="Times New Roman" w:hAnsi="Consolas" w:cs="Times New Roman"/>
+          <w:color w:val="CCCCCC"/>
+          <w:kern w:val="0"/>
+          <w:sz w:val="21"/>
+          <w:szCs w:val="21"/>
+          <w:lang w:eastAsia="en-IN"/>
+          <w14:ligatures w14:val="none"/>
+        </w:rPr>
+      </w:pPr>
+    </w:p>
+    <w:p>
+      <w:pPr>
+        <w:pStyle w:val="ListParagraph"/>
+        <w:numPr>
+          <w:ilvl w:val="0"/>
+          <w:numId w:val="5"/>
+        </w:numPr>
+        <w:shd w:val="clear" w:color="auto" w:fill="1F1F1F"/>
+        <w:spacing w:after="0" w:line="285" w:lineRule="atLeast"/>
+        <w:rPr>
+          <w:rFonts w:ascii="Consolas" w:eastAsia="Times New Roman" w:hAnsi="Consolas" w:cs="Times New Roman"/>
+          <w:color w:val="CCCCCC"/>
+          <w:kern w:val="0"/>
+          <w:sz w:val="21"/>
+          <w:szCs w:val="21"/>
+          <w:lang w:eastAsia="en-IN"/>
+          <w14:ligatures w14:val="none"/>
+        </w:rPr>
+      </w:pPr>
+      <w:r>
+        <w:rPr>
+          <w:rFonts w:ascii="Consolas" w:eastAsia="Times New Roman" w:hAnsi="Consolas" w:cs="Times New Roman"/>
+          <w:color w:val="6A9955"/>
+          <w:kern w:val="0"/>
+          <w:sz w:val="21"/>
+          <w:szCs w:val="21"/>
+          <w:lang w:eastAsia="en-IN"/>
+          <w14:ligatures w14:val="none"/>
         </w:rPr>
         <w:t># Using polymorphism: different objects respond to the same method call.</w:t>
       </w:r>
     </w:p>
     <w:p>
       <w:pPr>
-        <w:rPr>
-          <w:rFonts w:ascii="Times New Roman" w:hAnsi="Times New Roman" w:cs="Times New Roman"/>
-        </w:rPr>
-      </w:pPr>
-      <w:r>
-        <w:rPr>
-          <w:rFonts w:ascii="Times New Roman" w:hAnsi="Times New Roman" w:cs="Times New Roman"/>
-        </w:rPr>
-        <w:t>for animal in [</w:t>
+        <w:pStyle w:val="ListParagraph"/>
+        <w:numPr>
+          <w:ilvl w:val="0"/>
+          <w:numId w:val="5"/>
+        </w:numPr>
+        <w:shd w:val="clear" w:color="auto" w:fill="1F1F1F"/>
+        <w:spacing w:after="0" w:line="285" w:lineRule="atLeast"/>
+        <w:rPr>
+          <w:rFonts w:ascii="Consolas" w:eastAsia="Times New Roman" w:hAnsi="Consolas" w:cs="Times New Roman"/>
+          <w:color w:val="CCCCCC"/>
+          <w:kern w:val="0"/>
+          <w:sz w:val="21"/>
+          <w:szCs w:val="21"/>
+          <w:lang w:eastAsia="en-IN"/>
+          <w14:ligatures w14:val="none"/>
+        </w:rPr>
+      </w:pPr>
+      <w:r>
+        <w:rPr>
+          <w:rFonts w:ascii="Consolas" w:eastAsia="Times New Roman" w:hAnsi="Consolas" w:cs="Times New Roman"/>
+          <w:color w:val="C586C0"/>
+          <w:kern w:val="0"/>
+          <w:sz w:val="21"/>
+          <w:szCs w:val="21"/>
+          <w:lang w:eastAsia="en-IN"/>
+          <w14:ligatures w14:val="none"/>
+        </w:rPr>
+        <w:t>for</w:t>
+      </w:r>
+      <w:r>
+        <w:rPr>
+          <w:rFonts w:ascii="Consolas" w:eastAsia="Times New Roman" w:hAnsi="Consolas" w:cs="Times New Roman"/>
+          <w:color w:val="CCCCCC"/>
+          <w:kern w:val="0"/>
+          <w:sz w:val="21"/>
+          <w:szCs w:val="21"/>
+          <w:lang w:eastAsia="en-IN"/>
+          <w14:ligatures w14:val="none"/>
+        </w:rPr>
+        <w:t xml:space="preserve"> </w:t>
+      </w:r>
+      <w:r>
+        <w:rPr>
+          <w:rFonts w:ascii="Consolas" w:eastAsia="Times New Roman" w:hAnsi="Consolas" w:cs="Times New Roman"/>
+          <w:color w:val="9CDCFE"/>
+          <w:kern w:val="0"/>
+          <w:sz w:val="21"/>
+          <w:szCs w:val="21"/>
+          <w:lang w:eastAsia="en-IN"/>
+          <w14:ligatures w14:val="none"/>
+        </w:rPr>
+        <w:t>animal</w:t>
+      </w:r>
+      <w:r>
+        <w:rPr>
+          <w:rFonts w:ascii="Consolas" w:eastAsia="Times New Roman" w:hAnsi="Consolas" w:cs="Times New Roman"/>
+          <w:color w:val="CCCCCC"/>
+          <w:kern w:val="0"/>
+          <w:sz w:val="21"/>
+          <w:szCs w:val="21"/>
+          <w:lang w:eastAsia="en-IN"/>
+          <w14:ligatures w14:val="none"/>
+        </w:rPr>
+        <w:t xml:space="preserve"> </w:t>
+      </w:r>
+      <w:r>
+        <w:rPr>
+          <w:rFonts w:ascii="Consolas" w:eastAsia="Times New Roman" w:hAnsi="Consolas" w:cs="Times New Roman"/>
+          <w:color w:val="C586C0"/>
+          <w:kern w:val="0"/>
+          <w:sz w:val="21"/>
+          <w:szCs w:val="21"/>
+          <w:lang w:eastAsia="en-IN"/>
+          <w14:ligatures w14:val="none"/>
+        </w:rPr>
+        <w:t>in</w:t>
+      </w:r>
+      <w:r>
+        <w:rPr>
+          <w:rFonts w:ascii="Consolas" w:eastAsia="Times New Roman" w:hAnsi="Consolas" w:cs="Times New Roman"/>
+          <w:color w:val="CCCCCC"/>
+          <w:kern w:val="0"/>
+          <w:sz w:val="21"/>
+          <w:szCs w:val="21"/>
+          <w:lang w:eastAsia="en-IN"/>
+          <w14:ligatures w14:val="none"/>
+        </w:rPr>
+        <w:t xml:space="preserve"> [</w:t>
       </w:r>
       <w:proofErr w:type="gramStart"/>
       <w:r>
         <w:rPr>
-          <w:rFonts w:ascii="Times New Roman" w:hAnsi="Times New Roman" w:cs="Times New Roman"/>
-        </w:rPr>
-        <w:t>Dog(</w:t>
+          <w:rFonts w:ascii="Consolas" w:eastAsia="Times New Roman" w:hAnsi="Consolas" w:cs="Times New Roman"/>
+          <w:color w:val="4EC9B0"/>
+          <w:kern w:val="0"/>
+          <w:sz w:val="21"/>
+          <w:szCs w:val="21"/>
+          <w:lang w:eastAsia="en-IN"/>
+          <w14:ligatures w14:val="none"/>
+        </w:rPr>
+        <w:t>Dog</w:t>
+      </w:r>
+      <w:r>
+        <w:rPr>
+          <w:rFonts w:ascii="Consolas" w:eastAsia="Times New Roman" w:hAnsi="Consolas" w:cs="Times New Roman"/>
+          <w:color w:val="CCCCCC"/>
+          <w:kern w:val="0"/>
+          <w:sz w:val="21"/>
+          <w:szCs w:val="21"/>
+          <w:lang w:eastAsia="en-IN"/>
+          <w14:ligatures w14:val="none"/>
+        </w:rPr>
+        <w:t>(</w:t>
       </w:r>
       <w:proofErr w:type="gramEnd"/>
       <w:r>
         <w:rPr>
-          <w:rFonts w:ascii="Times New Roman" w:hAnsi="Times New Roman" w:cs="Times New Roman"/>
-        </w:rPr>
-        <w:t>), Cat()]:</w:t>
-      </w:r>
-    </w:p>
-    <w:p>
-      <w:pPr>
-        <w:rPr>
-          <w:rFonts w:ascii="Times New Roman" w:hAnsi="Times New Roman" w:cs="Times New Roman"/>
-        </w:rPr>
-      </w:pPr>
-      <w:r>
-        <w:rPr>
-          <w:rFonts w:ascii="Times New Roman" w:hAnsi="Times New Roman" w:cs="Times New Roman"/>
-        </w:rPr>
-        <w:t xml:space="preserve">    </w:t>
+          <w:rFonts w:ascii="Consolas" w:eastAsia="Times New Roman" w:hAnsi="Consolas" w:cs="Times New Roman"/>
+          <w:color w:val="CCCCCC"/>
+          <w:kern w:val="0"/>
+          <w:sz w:val="21"/>
+          <w:szCs w:val="21"/>
+          <w:lang w:eastAsia="en-IN"/>
+          <w14:ligatures w14:val="none"/>
+        </w:rPr>
+        <w:t xml:space="preserve">), </w:t>
+      </w:r>
+      <w:r>
+        <w:rPr>
+          <w:rFonts w:ascii="Consolas" w:eastAsia="Times New Roman" w:hAnsi="Consolas" w:cs="Times New Roman"/>
+          <w:color w:val="4EC9B0"/>
+          <w:kern w:val="0"/>
+          <w:sz w:val="21"/>
+          <w:szCs w:val="21"/>
+          <w:lang w:eastAsia="en-IN"/>
+          <w14:ligatures w14:val="none"/>
+        </w:rPr>
+        <w:t>Cat</w:t>
+      </w:r>
+      <w:r>
+        <w:rPr>
+          <w:rFonts w:ascii="Consolas" w:eastAsia="Times New Roman" w:hAnsi="Consolas" w:cs="Times New Roman"/>
+          <w:color w:val="CCCCCC"/>
+          <w:kern w:val="0"/>
+          <w:sz w:val="21"/>
+          <w:szCs w:val="21"/>
+          <w:lang w:eastAsia="en-IN"/>
+          <w14:ligatures w14:val="none"/>
+        </w:rPr>
+        <w:t>()]:</w:t>
+      </w:r>
+    </w:p>
+    <w:p>
+      <w:pPr>
+        <w:pStyle w:val="ListParagraph"/>
+        <w:numPr>
+          <w:ilvl w:val="0"/>
+          <w:numId w:val="5"/>
+        </w:numPr>
+        <w:shd w:val="clear" w:color="auto" w:fill="1F1F1F"/>
+        <w:spacing w:after="0" w:line="285" w:lineRule="atLeast"/>
+        <w:rPr>
+          <w:rFonts w:ascii="Consolas" w:eastAsia="Times New Roman" w:hAnsi="Consolas" w:cs="Times New Roman"/>
+          <w:color w:val="CCCCCC"/>
+          <w:kern w:val="0"/>
+          <w:sz w:val="21"/>
+          <w:szCs w:val="21"/>
+          <w:lang w:eastAsia="en-IN"/>
+          <w14:ligatures w14:val="none"/>
+        </w:rPr>
+      </w:pPr>
+      <w:r>
+        <w:rPr>
+          <w:rFonts w:ascii="Consolas" w:eastAsia="Times New Roman" w:hAnsi="Consolas" w:cs="Times New Roman"/>
+          <w:color w:val="CCCCCC"/>
+          <w:kern w:val="0"/>
+          <w:sz w:val="21"/>
+          <w:szCs w:val="21"/>
+          <w:lang w:eastAsia="en-IN"/>
+          <w14:ligatures w14:val="none"/>
+        </w:rPr>
+        <w:t xml:space="preserve">    </w:t>
       </w:r>
       <w:proofErr w:type="spellStart"/>
       <w:proofErr w:type="gramStart"/>
       <w:r>
         <w:rPr>
-          <w:rFonts w:ascii="Times New Roman" w:hAnsi="Times New Roman" w:cs="Times New Roman"/>
-        </w:rPr>
-        <w:t>animal.speak</w:t>
+          <w:rFonts w:ascii="Consolas" w:eastAsia="Times New Roman" w:hAnsi="Consolas" w:cs="Times New Roman"/>
+          <w:color w:val="9CDCFE"/>
+          <w:kern w:val="0"/>
+          <w:sz w:val="21"/>
+          <w:szCs w:val="21"/>
+          <w:lang w:eastAsia="en-IN"/>
+          <w14:ligatures w14:val="none"/>
+        </w:rPr>
+        <w:t>animal</w:t>
+      </w:r>
+      <w:r>
+        <w:rPr>
+          <w:rFonts w:ascii="Consolas" w:eastAsia="Times New Roman" w:hAnsi="Consolas" w:cs="Times New Roman"/>
+          <w:color w:val="CCCCCC"/>
+          <w:kern w:val="0"/>
+          <w:sz w:val="21"/>
+          <w:szCs w:val="21"/>
+          <w:lang w:eastAsia="en-IN"/>
+          <w14:ligatures w14:val="none"/>
+        </w:rPr>
+        <w:t>.speak</w:t>
       </w:r>
       <w:proofErr w:type="spellEnd"/>
       <w:proofErr w:type="gramEnd"/>
       <w:r>
         <w:rPr>
-          <w:rFonts w:ascii="Times New Roman" w:hAnsi="Times New Roman" w:cs="Times New Roman"/>
+          <w:rFonts w:ascii="Consolas" w:eastAsia="Times New Roman" w:hAnsi="Consolas" w:cs="Times New Roman"/>
+          <w:color w:val="CCCCCC"/>
+          <w:kern w:val="0"/>
+          <w:sz w:val="21"/>
+          <w:szCs w:val="21"/>
+          <w:lang w:eastAsia="en-IN"/>
+          <w14:ligatures w14:val="none"/>
         </w:rPr>
         <w:t>()</w:t>
       </w:r>
     </w:p>
     <w:p>
       <w:pPr>
-        <w:rPr>
-          <w:rFonts w:ascii="Times New Roman" w:hAnsi="Times New Roman" w:cs="Times New Roman"/>
-        </w:rPr>
-      </w:pPr>
-      <w:r>
-        <w:rPr>
-          <w:rFonts w:ascii="Times New Roman" w:hAnsi="Times New Roman" w:cs="Times New Roman"/>
+        <w:pStyle w:val="ListParagraph"/>
+        <w:numPr>
+          <w:ilvl w:val="0"/>
+          <w:numId w:val="5"/>
+        </w:numPr>
+        <w:shd w:val="clear" w:color="auto" w:fill="1F1F1F"/>
+        <w:spacing w:after="0" w:line="285" w:lineRule="atLeast"/>
+        <w:rPr>
+          <w:rFonts w:ascii="Consolas" w:eastAsia="Times New Roman" w:hAnsi="Consolas" w:cs="Times New Roman"/>
+          <w:color w:val="CCCCCC"/>
+          <w:kern w:val="0"/>
+          <w:sz w:val="21"/>
+          <w:szCs w:val="21"/>
+          <w:lang w:eastAsia="en-IN"/>
+          <w14:ligatures w14:val="none"/>
+        </w:rPr>
+      </w:pPr>
+      <w:r>
+        <w:rPr>
+          <w:rFonts w:ascii="Consolas" w:eastAsia="Times New Roman" w:hAnsi="Consolas" w:cs="Times New Roman"/>
+          <w:color w:val="6A9955"/>
+          <w:kern w:val="0"/>
+          <w:sz w:val="21"/>
+          <w:szCs w:val="21"/>
+          <w:lang w:eastAsia="en-IN"/>
+          <w14:ligatures w14:val="none"/>
         </w:rPr>
         <w:t># Output:</w:t>
       </w:r>
     </w:p>
     <w:p>
       <w:pPr>
-        <w:rPr>
-          <w:rFonts w:ascii="Times New Roman" w:hAnsi="Times New Roman" w:cs="Times New Roman"/>
-        </w:rPr>
-      </w:pPr>
-      <w:r>
-        <w:rPr>
-          <w:rFonts w:ascii="Times New Roman" w:hAnsi="Times New Roman" w:cs="Times New Roman"/>
+        <w:pStyle w:val="ListParagraph"/>
+        <w:numPr>
+          <w:ilvl w:val="0"/>
+          <w:numId w:val="5"/>
+        </w:numPr>
+        <w:shd w:val="clear" w:color="auto" w:fill="1F1F1F"/>
+        <w:spacing w:after="0" w:line="285" w:lineRule="atLeast"/>
+        <w:rPr>
+          <w:rFonts w:ascii="Consolas" w:eastAsia="Times New Roman" w:hAnsi="Consolas" w:cs="Times New Roman"/>
+          <w:color w:val="CCCCCC"/>
+          <w:kern w:val="0"/>
+          <w:sz w:val="21"/>
+          <w:szCs w:val="21"/>
+          <w:lang w:eastAsia="en-IN"/>
+          <w14:ligatures w14:val="none"/>
+        </w:rPr>
+      </w:pPr>
+      <w:r>
+        <w:rPr>
+          <w:rFonts w:ascii="Consolas" w:eastAsia="Times New Roman" w:hAnsi="Consolas" w:cs="Times New Roman"/>
+          <w:color w:val="6A9955"/>
+          <w:kern w:val="0"/>
+          <w:sz w:val="21"/>
+          <w:szCs w:val="21"/>
+          <w:lang w:eastAsia="en-IN"/>
+          <w14:ligatures w14:val="none"/>
         </w:rPr>
         <w:t># Woof!</w:t>
       </w:r>
     </w:p>
     <w:p>
       <w:pPr>
-        <w:rPr>
-          <w:rFonts w:ascii="Times New Roman" w:hAnsi="Times New Roman" w:cs="Times New Roman"/>
-        </w:rPr>
-      </w:pPr>
-      <w:r>
-        <w:rPr>
-          <w:rFonts w:ascii="Times New Roman" w:hAnsi="Times New Roman" w:cs="Times New Roman"/>
+        <w:pStyle w:val="ListParagraph"/>
+        <w:numPr>
+          <w:ilvl w:val="0"/>
+          <w:numId w:val="5"/>
+        </w:numPr>
+        <w:shd w:val="clear" w:color="auto" w:fill="1F1F1F"/>
+        <w:spacing w:after="0" w:line="285" w:lineRule="atLeast"/>
+        <w:rPr>
+          <w:rFonts w:ascii="Consolas" w:eastAsia="Times New Roman" w:hAnsi="Consolas" w:cs="Times New Roman"/>
+          <w:color w:val="CCCCCC"/>
+          <w:kern w:val="0"/>
+          <w:sz w:val="21"/>
+          <w:szCs w:val="21"/>
+          <w:lang w:eastAsia="en-IN"/>
+          <w14:ligatures w14:val="none"/>
+        </w:rPr>
+      </w:pPr>
+      <w:r>
+        <w:rPr>
+          <w:rFonts w:ascii="Consolas" w:eastAsia="Times New Roman" w:hAnsi="Consolas" w:cs="Times New Roman"/>
+          <w:color w:val="6A9955"/>
+          <w:kern w:val="0"/>
+          <w:sz w:val="21"/>
+          <w:szCs w:val="21"/>
+          <w:lang w:eastAsia="en-IN"/>
+          <w14:ligatures w14:val="none"/>
         </w:rPr>
         <w:t># Meow!</w:t>
       </w:r>
+    </w:p>
+    <w:p>
+      <w:pPr>
+        <w:ind w:left="720"/>
+        <w:rPr>
+          <w:rFonts w:ascii="Times New Roman" w:hAnsi="Times New Roman" w:cs="Times New Roman"/>
+        </w:rPr>
+      </w:pPr>
+    </w:p>
+    <w:p>
+      <w:pPr>
+        <w:ind w:left="720"/>
+        <w:rPr>
+          <w:rFonts w:ascii="Times New Roman" w:hAnsi="Times New Roman" w:cs="Times New Roman"/>
+        </w:rPr>
+      </w:pPr>
     </w:p>
     <w:p>
       <w:pPr>
@@ -4055,285 +5103,978 @@
     </w:p>
     <w:p>
       <w:pPr>
-        <w:rPr>
-          <w:rFonts w:ascii="Times New Roman" w:hAnsi="Times New Roman" w:cs="Times New Roman"/>
-        </w:rPr>
-      </w:pPr>
-      <w:r>
-        <w:rPr>
-          <w:rFonts w:ascii="Times New Roman" w:hAnsi="Times New Roman" w:cs="Times New Roman"/>
-        </w:rPr>
-        <w:t>python</w:t>
-      </w:r>
-    </w:p>
-    <w:p>
-      <w:pPr>
-        <w:rPr>
-          <w:rFonts w:ascii="Times New Roman" w:hAnsi="Times New Roman" w:cs="Times New Roman"/>
-        </w:rPr>
-      </w:pPr>
+        <w:pStyle w:val="ListParagraph"/>
+        <w:numPr>
+          <w:ilvl w:val="0"/>
+          <w:numId w:val="6"/>
+        </w:numPr>
+        <w:shd w:val="clear" w:color="auto" w:fill="1F1F1F"/>
+        <w:spacing w:after="0" w:line="285" w:lineRule="atLeast"/>
+        <w:rPr>
+          <w:rFonts w:ascii="Consolas" w:eastAsia="Times New Roman" w:hAnsi="Consolas" w:cs="Times New Roman"/>
+          <w:color w:val="CCCCCC"/>
+          <w:kern w:val="0"/>
+          <w:sz w:val="21"/>
+          <w:szCs w:val="21"/>
+          <w:lang w:eastAsia="en-IN"/>
+          <w14:ligatures w14:val="none"/>
+        </w:rPr>
+      </w:pPr>
+      <w:r>
+        <w:rPr>
+          <w:rFonts w:ascii="Consolas" w:eastAsia="Times New Roman" w:hAnsi="Consolas" w:cs="Times New Roman"/>
+          <w:color w:val="C586C0"/>
+          <w:kern w:val="0"/>
+          <w:sz w:val="21"/>
+          <w:szCs w:val="21"/>
+          <w:lang w:eastAsia="en-IN"/>
+          <w14:ligatures w14:val="none"/>
+        </w:rPr>
+        <w:t>from</w:t>
+      </w:r>
+      <w:r>
+        <w:rPr>
+          <w:rFonts w:ascii="Consolas" w:eastAsia="Times New Roman" w:hAnsi="Consolas" w:cs="Times New Roman"/>
+          <w:color w:val="CCCCCC"/>
+          <w:kern w:val="0"/>
+          <w:sz w:val="21"/>
+          <w:szCs w:val="21"/>
+          <w:lang w:eastAsia="en-IN"/>
+          <w14:ligatures w14:val="none"/>
+        </w:rPr>
+        <w:t xml:space="preserve"> </w:t>
+      </w:r>
       <w:proofErr w:type="spellStart"/>
       <w:r>
         <w:rPr>
-          <w:rFonts w:ascii="Times New Roman" w:hAnsi="Times New Roman" w:cs="Times New Roman"/>
-        </w:rPr>
-        <w:t>CopyEdit</w:t>
+          <w:rFonts w:ascii="Consolas" w:eastAsia="Times New Roman" w:hAnsi="Consolas" w:cs="Times New Roman"/>
+          <w:color w:val="4EC9B0"/>
+          <w:kern w:val="0"/>
+          <w:sz w:val="21"/>
+          <w:szCs w:val="21"/>
+          <w:lang w:eastAsia="en-IN"/>
+          <w14:ligatures w14:val="none"/>
+        </w:rPr>
+        <w:t>abc</w:t>
       </w:r>
       <w:proofErr w:type="spellEnd"/>
-    </w:p>
-    <w:p>
-      <w:pPr>
-        <w:rPr>
-          <w:rFonts w:ascii="Times New Roman" w:hAnsi="Times New Roman" w:cs="Times New Roman"/>
-        </w:rPr>
-      </w:pPr>
-      <w:r>
-        <w:rPr>
-          <w:rFonts w:ascii="Times New Roman" w:hAnsi="Times New Roman" w:cs="Times New Roman"/>
-        </w:rPr>
-        <w:t xml:space="preserve">from </w:t>
+      <w:r>
+        <w:rPr>
+          <w:rFonts w:ascii="Consolas" w:eastAsia="Times New Roman" w:hAnsi="Consolas" w:cs="Times New Roman"/>
+          <w:color w:val="CCCCCC"/>
+          <w:kern w:val="0"/>
+          <w:sz w:val="21"/>
+          <w:szCs w:val="21"/>
+          <w:lang w:eastAsia="en-IN"/>
+          <w14:ligatures w14:val="none"/>
+        </w:rPr>
+        <w:t xml:space="preserve"> </w:t>
+      </w:r>
+      <w:r>
+        <w:rPr>
+          <w:rFonts w:ascii="Consolas" w:eastAsia="Times New Roman" w:hAnsi="Consolas" w:cs="Times New Roman"/>
+          <w:color w:val="C586C0"/>
+          <w:kern w:val="0"/>
+          <w:sz w:val="21"/>
+          <w:szCs w:val="21"/>
+          <w:lang w:eastAsia="en-IN"/>
+          <w14:ligatures w14:val="none"/>
+        </w:rPr>
+        <w:t>import</w:t>
+      </w:r>
+      <w:r>
+        <w:rPr>
+          <w:rFonts w:ascii="Consolas" w:eastAsia="Times New Roman" w:hAnsi="Consolas" w:cs="Times New Roman"/>
+          <w:color w:val="CCCCCC"/>
+          <w:kern w:val="0"/>
+          <w:sz w:val="21"/>
+          <w:szCs w:val="21"/>
+          <w:lang w:eastAsia="en-IN"/>
+          <w14:ligatures w14:val="none"/>
+        </w:rPr>
+        <w:t xml:space="preserve"> </w:t>
+      </w:r>
+      <w:r>
+        <w:rPr>
+          <w:rFonts w:ascii="Consolas" w:eastAsia="Times New Roman" w:hAnsi="Consolas" w:cs="Times New Roman"/>
+          <w:color w:val="4EC9B0"/>
+          <w:kern w:val="0"/>
+          <w:sz w:val="21"/>
+          <w:szCs w:val="21"/>
+          <w:lang w:eastAsia="en-IN"/>
+          <w14:ligatures w14:val="none"/>
+        </w:rPr>
+        <w:t>ABC</w:t>
+      </w:r>
+      <w:r>
+        <w:rPr>
+          <w:rFonts w:ascii="Consolas" w:eastAsia="Times New Roman" w:hAnsi="Consolas" w:cs="Times New Roman"/>
+          <w:color w:val="CCCCCC"/>
+          <w:kern w:val="0"/>
+          <w:sz w:val="21"/>
+          <w:szCs w:val="21"/>
+          <w:lang w:eastAsia="en-IN"/>
+          <w14:ligatures w14:val="none"/>
+        </w:rPr>
+        <w:t xml:space="preserve">, </w:t>
       </w:r>
       <w:proofErr w:type="spellStart"/>
       <w:r>
         <w:rPr>
-          <w:rFonts w:ascii="Times New Roman" w:hAnsi="Times New Roman" w:cs="Times New Roman"/>
-        </w:rPr>
-        <w:t>abc</w:t>
+          <w:rFonts w:ascii="Consolas" w:eastAsia="Times New Roman" w:hAnsi="Consolas" w:cs="Times New Roman"/>
+          <w:color w:val="DCDCAA"/>
+          <w:kern w:val="0"/>
+          <w:sz w:val="21"/>
+          <w:szCs w:val="21"/>
+          <w:lang w:eastAsia="en-IN"/>
+          <w14:ligatures w14:val="none"/>
+        </w:rPr>
+        <w:t>abstractmethod</w:t>
       </w:r>
       <w:proofErr w:type="spellEnd"/>
-      <w:r>
-        <w:rPr>
-          <w:rFonts w:ascii="Times New Roman" w:hAnsi="Times New Roman" w:cs="Times New Roman"/>
-        </w:rPr>
-        <w:t xml:space="preserve"> import ABC, </w:t>
-      </w:r>
-      <w:proofErr w:type="spellStart"/>
-      <w:r>
-        <w:rPr>
-          <w:rFonts w:ascii="Times New Roman" w:hAnsi="Times New Roman" w:cs="Times New Roman"/>
-        </w:rPr>
-        <w:t>abstractmethod</w:t>
-      </w:r>
-      <w:proofErr w:type="spellEnd"/>
-    </w:p>
-    <w:p>
-      <w:pPr>
-        <w:rPr>
-          <w:rFonts w:ascii="Times New Roman" w:hAnsi="Times New Roman" w:cs="Times New Roman"/>
-        </w:rPr>
-      </w:pPr>
-    </w:p>
-    <w:p>
-      <w:pPr>
-        <w:rPr>
-          <w:rFonts w:ascii="Times New Roman" w:hAnsi="Times New Roman" w:cs="Times New Roman"/>
-        </w:rPr>
-      </w:pPr>
-      <w:r>
-        <w:rPr>
-          <w:rFonts w:ascii="Times New Roman" w:hAnsi="Times New Roman" w:cs="Times New Roman"/>
-        </w:rPr>
-        <w:t xml:space="preserve">class </w:t>
+    </w:p>
+    <w:p>
+      <w:pPr>
+        <w:pStyle w:val="ListParagraph"/>
+        <w:numPr>
+          <w:ilvl w:val="0"/>
+          <w:numId w:val="6"/>
+        </w:numPr>
+        <w:shd w:val="clear" w:color="auto" w:fill="1F1F1F"/>
+        <w:spacing w:after="0" w:line="285" w:lineRule="atLeast"/>
+        <w:rPr>
+          <w:rFonts w:ascii="Consolas" w:eastAsia="Times New Roman" w:hAnsi="Consolas" w:cs="Times New Roman"/>
+          <w:color w:val="CCCCCC"/>
+          <w:kern w:val="0"/>
+          <w:sz w:val="21"/>
+          <w:szCs w:val="21"/>
+          <w:lang w:eastAsia="en-IN"/>
+          <w14:ligatures w14:val="none"/>
+        </w:rPr>
+      </w:pPr>
+    </w:p>
+    <w:p>
+      <w:pPr>
+        <w:pStyle w:val="ListParagraph"/>
+        <w:numPr>
+          <w:ilvl w:val="0"/>
+          <w:numId w:val="6"/>
+        </w:numPr>
+        <w:shd w:val="clear" w:color="auto" w:fill="1F1F1F"/>
+        <w:spacing w:after="0" w:line="285" w:lineRule="atLeast"/>
+        <w:rPr>
+          <w:rFonts w:ascii="Consolas" w:eastAsia="Times New Roman" w:hAnsi="Consolas" w:cs="Times New Roman"/>
+          <w:color w:val="CCCCCC"/>
+          <w:kern w:val="0"/>
+          <w:sz w:val="21"/>
+          <w:szCs w:val="21"/>
+          <w:lang w:eastAsia="en-IN"/>
+          <w14:ligatures w14:val="none"/>
+        </w:rPr>
+      </w:pPr>
+      <w:r>
+        <w:rPr>
+          <w:rFonts w:ascii="Consolas" w:eastAsia="Times New Roman" w:hAnsi="Consolas" w:cs="Times New Roman"/>
+          <w:color w:val="569CD6"/>
+          <w:kern w:val="0"/>
+          <w:sz w:val="21"/>
+          <w:szCs w:val="21"/>
+          <w:lang w:eastAsia="en-IN"/>
+          <w14:ligatures w14:val="none"/>
+        </w:rPr>
+        <w:t>class</w:t>
+      </w:r>
+      <w:r>
+        <w:rPr>
+          <w:rFonts w:ascii="Consolas" w:eastAsia="Times New Roman" w:hAnsi="Consolas" w:cs="Times New Roman"/>
+          <w:color w:val="CCCCCC"/>
+          <w:kern w:val="0"/>
+          <w:sz w:val="21"/>
+          <w:szCs w:val="21"/>
+          <w:lang w:eastAsia="en-IN"/>
+          <w14:ligatures w14:val="none"/>
+        </w:rPr>
+        <w:t xml:space="preserve"> </w:t>
       </w:r>
       <w:proofErr w:type="gramStart"/>
       <w:r>
         <w:rPr>
-          <w:rFonts w:ascii="Times New Roman" w:hAnsi="Times New Roman" w:cs="Times New Roman"/>
-        </w:rPr>
-        <w:t>Vehicle(</w:t>
+          <w:rFonts w:ascii="Consolas" w:eastAsia="Times New Roman" w:hAnsi="Consolas" w:cs="Times New Roman"/>
+          <w:color w:val="4EC9B0"/>
+          <w:kern w:val="0"/>
+          <w:sz w:val="21"/>
+          <w:szCs w:val="21"/>
+          <w:lang w:eastAsia="en-IN"/>
+          <w14:ligatures w14:val="none"/>
+        </w:rPr>
+        <w:t>Vehicle</w:t>
+      </w:r>
+      <w:r>
+        <w:rPr>
+          <w:rFonts w:ascii="Consolas" w:eastAsia="Times New Roman" w:hAnsi="Consolas" w:cs="Times New Roman"/>
+          <w:color w:val="CCCCCC"/>
+          <w:kern w:val="0"/>
+          <w:sz w:val="21"/>
+          <w:szCs w:val="21"/>
+          <w:lang w:eastAsia="en-IN"/>
+          <w14:ligatures w14:val="none"/>
+        </w:rPr>
+        <w:t>(</w:t>
       </w:r>
       <w:proofErr w:type="gramEnd"/>
       <w:r>
         <w:rPr>
-          <w:rFonts w:ascii="Times New Roman" w:hAnsi="Times New Roman" w:cs="Times New Roman"/>
-        </w:rPr>
-        <w:t>ABC):</w:t>
-      </w:r>
-    </w:p>
-    <w:p>
-      <w:pPr>
-        <w:rPr>
-          <w:rFonts w:ascii="Times New Roman" w:hAnsi="Times New Roman" w:cs="Times New Roman"/>
-        </w:rPr>
-      </w:pPr>
-      <w:r>
-        <w:rPr>
-          <w:rFonts w:ascii="Times New Roman" w:hAnsi="Times New Roman" w:cs="Times New Roman"/>
-        </w:rPr>
-        <w:t xml:space="preserve">    @abstractmethod</w:t>
-      </w:r>
-    </w:p>
-    <w:p>
-      <w:pPr>
-        <w:rPr>
-          <w:rFonts w:ascii="Times New Roman" w:hAnsi="Times New Roman" w:cs="Times New Roman"/>
-        </w:rPr>
-      </w:pPr>
-      <w:r>
-        <w:rPr>
-          <w:rFonts w:ascii="Times New Roman" w:hAnsi="Times New Roman" w:cs="Times New Roman"/>
-        </w:rPr>
-        <w:t xml:space="preserve">    def start(self):</w:t>
-      </w:r>
-    </w:p>
-    <w:p>
-      <w:pPr>
-        <w:rPr>
-          <w:rFonts w:ascii="Times New Roman" w:hAnsi="Times New Roman" w:cs="Times New Roman"/>
-        </w:rPr>
-      </w:pPr>
-      <w:r>
-        <w:rPr>
-          <w:rFonts w:ascii="Times New Roman" w:hAnsi="Times New Roman" w:cs="Times New Roman"/>
-        </w:rPr>
-        <w:t xml:space="preserve">        pass</w:t>
-      </w:r>
-    </w:p>
-    <w:p>
-      <w:pPr>
-        <w:rPr>
-          <w:rFonts w:ascii="Times New Roman" w:hAnsi="Times New Roman" w:cs="Times New Roman"/>
-        </w:rPr>
-      </w:pPr>
-    </w:p>
-    <w:p>
-      <w:pPr>
-        <w:rPr>
-          <w:rFonts w:ascii="Times New Roman" w:hAnsi="Times New Roman" w:cs="Times New Roman"/>
-        </w:rPr>
-      </w:pPr>
-      <w:r>
-        <w:rPr>
-          <w:rFonts w:ascii="Times New Roman" w:hAnsi="Times New Roman" w:cs="Times New Roman"/>
-        </w:rPr>
-        <w:t xml:space="preserve">class </w:t>
+          <w:rFonts w:ascii="Consolas" w:eastAsia="Times New Roman" w:hAnsi="Consolas" w:cs="Times New Roman"/>
+          <w:color w:val="4EC9B0"/>
+          <w:kern w:val="0"/>
+          <w:sz w:val="21"/>
+          <w:szCs w:val="21"/>
+          <w:lang w:eastAsia="en-IN"/>
+          <w14:ligatures w14:val="none"/>
+        </w:rPr>
+        <w:t>ABC</w:t>
+      </w:r>
+      <w:r>
+        <w:rPr>
+          <w:rFonts w:ascii="Consolas" w:eastAsia="Times New Roman" w:hAnsi="Consolas" w:cs="Times New Roman"/>
+          <w:color w:val="CCCCCC"/>
+          <w:kern w:val="0"/>
+          <w:sz w:val="21"/>
+          <w:szCs w:val="21"/>
+          <w:lang w:eastAsia="en-IN"/>
+          <w14:ligatures w14:val="none"/>
+        </w:rPr>
+        <w:t>):</w:t>
+      </w:r>
+    </w:p>
+    <w:p>
+      <w:pPr>
+        <w:pStyle w:val="ListParagraph"/>
+        <w:numPr>
+          <w:ilvl w:val="0"/>
+          <w:numId w:val="6"/>
+        </w:numPr>
+        <w:shd w:val="clear" w:color="auto" w:fill="1F1F1F"/>
+        <w:spacing w:after="0" w:line="285" w:lineRule="atLeast"/>
+        <w:rPr>
+          <w:rFonts w:ascii="Consolas" w:eastAsia="Times New Roman" w:hAnsi="Consolas" w:cs="Times New Roman"/>
+          <w:color w:val="CCCCCC"/>
+          <w:kern w:val="0"/>
+          <w:sz w:val="21"/>
+          <w:szCs w:val="21"/>
+          <w:lang w:eastAsia="en-IN"/>
+          <w14:ligatures w14:val="none"/>
+        </w:rPr>
+      </w:pPr>
+      <w:r>
+        <w:rPr>
+          <w:rFonts w:ascii="Consolas" w:eastAsia="Times New Roman" w:hAnsi="Consolas" w:cs="Times New Roman"/>
+          <w:color w:val="CCCCCC"/>
+          <w:kern w:val="0"/>
+          <w:sz w:val="21"/>
+          <w:szCs w:val="21"/>
+          <w:lang w:eastAsia="en-IN"/>
+          <w14:ligatures w14:val="none"/>
+        </w:rPr>
+        <w:t xml:space="preserve">    </w:t>
+      </w:r>
+      <w:r>
+        <w:rPr>
+          <w:rFonts w:ascii="Consolas" w:eastAsia="Times New Roman" w:hAnsi="Consolas" w:cs="Times New Roman"/>
+          <w:color w:val="DCDCAA"/>
+          <w:kern w:val="0"/>
+          <w:sz w:val="21"/>
+          <w:szCs w:val="21"/>
+          <w:lang w:eastAsia="en-IN"/>
+          <w14:ligatures w14:val="none"/>
+        </w:rPr>
+        <w:t>@abstractmethod</w:t>
+      </w:r>
+    </w:p>
+    <w:p>
+      <w:pPr>
+        <w:pStyle w:val="ListParagraph"/>
+        <w:numPr>
+          <w:ilvl w:val="0"/>
+          <w:numId w:val="6"/>
+        </w:numPr>
+        <w:shd w:val="clear" w:color="auto" w:fill="1F1F1F"/>
+        <w:spacing w:after="0" w:line="285" w:lineRule="atLeast"/>
+        <w:rPr>
+          <w:rFonts w:ascii="Consolas" w:eastAsia="Times New Roman" w:hAnsi="Consolas" w:cs="Times New Roman"/>
+          <w:color w:val="CCCCCC"/>
+          <w:kern w:val="0"/>
+          <w:sz w:val="21"/>
+          <w:szCs w:val="21"/>
+          <w:lang w:eastAsia="en-IN"/>
+          <w14:ligatures w14:val="none"/>
+        </w:rPr>
+      </w:pPr>
+      <w:r>
+        <w:rPr>
+          <w:rFonts w:ascii="Consolas" w:eastAsia="Times New Roman" w:hAnsi="Consolas" w:cs="Times New Roman"/>
+          <w:color w:val="CCCCCC"/>
+          <w:kern w:val="0"/>
+          <w:sz w:val="21"/>
+          <w:szCs w:val="21"/>
+          <w:lang w:eastAsia="en-IN"/>
+          <w14:ligatures w14:val="none"/>
+        </w:rPr>
+        <w:t xml:space="preserve">    </w:t>
+      </w:r>
+      <w:r>
+        <w:rPr>
+          <w:rFonts w:ascii="Consolas" w:eastAsia="Times New Roman" w:hAnsi="Consolas" w:cs="Times New Roman"/>
+          <w:color w:val="569CD6"/>
+          <w:kern w:val="0"/>
+          <w:sz w:val="21"/>
+          <w:szCs w:val="21"/>
+          <w:lang w:eastAsia="en-IN"/>
+          <w14:ligatures w14:val="none"/>
+        </w:rPr>
+        <w:t>def</w:t>
+      </w:r>
+      <w:r>
+        <w:rPr>
+          <w:rFonts w:ascii="Consolas" w:eastAsia="Times New Roman" w:hAnsi="Consolas" w:cs="Times New Roman"/>
+          <w:color w:val="CCCCCC"/>
+          <w:kern w:val="0"/>
+          <w:sz w:val="21"/>
+          <w:szCs w:val="21"/>
+          <w:lang w:eastAsia="en-IN"/>
+          <w14:ligatures w14:val="none"/>
+        </w:rPr>
+        <w:t xml:space="preserve"> </w:t>
+      </w:r>
+      <w:r>
+        <w:rPr>
+          <w:rFonts w:ascii="Consolas" w:eastAsia="Times New Roman" w:hAnsi="Consolas" w:cs="Times New Roman"/>
+          <w:color w:val="DCDCAA"/>
+          <w:kern w:val="0"/>
+          <w:sz w:val="21"/>
+          <w:szCs w:val="21"/>
+          <w:lang w:eastAsia="en-IN"/>
+          <w14:ligatures w14:val="none"/>
+        </w:rPr>
+        <w:t>start</w:t>
+      </w:r>
+      <w:r>
+        <w:rPr>
+          <w:rFonts w:ascii="Consolas" w:eastAsia="Times New Roman" w:hAnsi="Consolas" w:cs="Times New Roman"/>
+          <w:color w:val="CCCCCC"/>
+          <w:kern w:val="0"/>
+          <w:sz w:val="21"/>
+          <w:szCs w:val="21"/>
+          <w:lang w:eastAsia="en-IN"/>
+          <w14:ligatures w14:val="none"/>
+        </w:rPr>
+        <w:t>(</w:t>
+      </w:r>
+      <w:r>
+        <w:rPr>
+          <w:rFonts w:ascii="Consolas" w:eastAsia="Times New Roman" w:hAnsi="Consolas" w:cs="Times New Roman"/>
+          <w:color w:val="9CDCFE"/>
+          <w:kern w:val="0"/>
+          <w:sz w:val="21"/>
+          <w:szCs w:val="21"/>
+          <w:lang w:eastAsia="en-IN"/>
+          <w14:ligatures w14:val="none"/>
+        </w:rPr>
+        <w:t>self</w:t>
+      </w:r>
+      <w:r>
+        <w:rPr>
+          <w:rFonts w:ascii="Consolas" w:eastAsia="Times New Roman" w:hAnsi="Consolas" w:cs="Times New Roman"/>
+          <w:color w:val="CCCCCC"/>
+          <w:kern w:val="0"/>
+          <w:sz w:val="21"/>
+          <w:szCs w:val="21"/>
+          <w:lang w:eastAsia="en-IN"/>
+          <w14:ligatures w14:val="none"/>
+        </w:rPr>
+        <w:t>):</w:t>
+      </w:r>
+    </w:p>
+    <w:p>
+      <w:pPr>
+        <w:pStyle w:val="ListParagraph"/>
+        <w:numPr>
+          <w:ilvl w:val="0"/>
+          <w:numId w:val="6"/>
+        </w:numPr>
+        <w:shd w:val="clear" w:color="auto" w:fill="1F1F1F"/>
+        <w:spacing w:after="0" w:line="285" w:lineRule="atLeast"/>
+        <w:rPr>
+          <w:rFonts w:ascii="Consolas" w:eastAsia="Times New Roman" w:hAnsi="Consolas" w:cs="Times New Roman"/>
+          <w:color w:val="CCCCCC"/>
+          <w:kern w:val="0"/>
+          <w:sz w:val="21"/>
+          <w:szCs w:val="21"/>
+          <w:lang w:eastAsia="en-IN"/>
+          <w14:ligatures w14:val="none"/>
+        </w:rPr>
+      </w:pPr>
+      <w:r>
+        <w:rPr>
+          <w:rFonts w:ascii="Consolas" w:eastAsia="Times New Roman" w:hAnsi="Consolas" w:cs="Times New Roman"/>
+          <w:color w:val="CCCCCC"/>
+          <w:kern w:val="0"/>
+          <w:sz w:val="21"/>
+          <w:szCs w:val="21"/>
+          <w:lang w:eastAsia="en-IN"/>
+          <w14:ligatures w14:val="none"/>
+        </w:rPr>
+        <w:t xml:space="preserve">        </w:t>
+      </w:r>
+      <w:r>
+        <w:rPr>
+          <w:rFonts w:ascii="Consolas" w:eastAsia="Times New Roman" w:hAnsi="Consolas" w:cs="Times New Roman"/>
+          <w:color w:val="C586C0"/>
+          <w:kern w:val="0"/>
+          <w:sz w:val="21"/>
+          <w:szCs w:val="21"/>
+          <w:lang w:eastAsia="en-IN"/>
+          <w14:ligatures w14:val="none"/>
+        </w:rPr>
+        <w:t>pass</w:t>
+      </w:r>
+    </w:p>
+    <w:p>
+      <w:pPr>
+        <w:pStyle w:val="ListParagraph"/>
+        <w:numPr>
+          <w:ilvl w:val="0"/>
+          <w:numId w:val="6"/>
+        </w:numPr>
+        <w:shd w:val="clear" w:color="auto" w:fill="1F1F1F"/>
+        <w:spacing w:after="0" w:line="285" w:lineRule="atLeast"/>
+        <w:rPr>
+          <w:rFonts w:ascii="Consolas" w:eastAsia="Times New Roman" w:hAnsi="Consolas" w:cs="Times New Roman"/>
+          <w:color w:val="CCCCCC"/>
+          <w:kern w:val="0"/>
+          <w:sz w:val="21"/>
+          <w:szCs w:val="21"/>
+          <w:lang w:eastAsia="en-IN"/>
+          <w14:ligatures w14:val="none"/>
+        </w:rPr>
+      </w:pPr>
+    </w:p>
+    <w:p>
+      <w:pPr>
+        <w:pStyle w:val="ListParagraph"/>
+        <w:numPr>
+          <w:ilvl w:val="0"/>
+          <w:numId w:val="6"/>
+        </w:numPr>
+        <w:shd w:val="clear" w:color="auto" w:fill="1F1F1F"/>
+        <w:spacing w:after="0" w:line="285" w:lineRule="atLeast"/>
+        <w:rPr>
+          <w:rFonts w:ascii="Consolas" w:eastAsia="Times New Roman" w:hAnsi="Consolas" w:cs="Times New Roman"/>
+          <w:color w:val="CCCCCC"/>
+          <w:kern w:val="0"/>
+          <w:sz w:val="21"/>
+          <w:szCs w:val="21"/>
+          <w:lang w:eastAsia="en-IN"/>
+          <w14:ligatures w14:val="none"/>
+        </w:rPr>
+      </w:pPr>
+      <w:r>
+        <w:rPr>
+          <w:rFonts w:ascii="Consolas" w:eastAsia="Times New Roman" w:hAnsi="Consolas" w:cs="Times New Roman"/>
+          <w:color w:val="569CD6"/>
+          <w:kern w:val="0"/>
+          <w:sz w:val="21"/>
+          <w:szCs w:val="21"/>
+          <w:lang w:eastAsia="en-IN"/>
+          <w14:ligatures w14:val="none"/>
+        </w:rPr>
+        <w:t>class</w:t>
+      </w:r>
+      <w:r>
+        <w:rPr>
+          <w:rFonts w:ascii="Consolas" w:eastAsia="Times New Roman" w:hAnsi="Consolas" w:cs="Times New Roman"/>
+          <w:color w:val="CCCCCC"/>
+          <w:kern w:val="0"/>
+          <w:sz w:val="21"/>
+          <w:szCs w:val="21"/>
+          <w:lang w:eastAsia="en-IN"/>
+          <w14:ligatures w14:val="none"/>
+        </w:rPr>
+        <w:t xml:space="preserve"> </w:t>
       </w:r>
       <w:proofErr w:type="gramStart"/>
       <w:r>
         <w:rPr>
-          <w:rFonts w:ascii="Times New Roman" w:hAnsi="Times New Roman" w:cs="Times New Roman"/>
-        </w:rPr>
-        <w:t>Car(</w:t>
+          <w:rFonts w:ascii="Consolas" w:eastAsia="Times New Roman" w:hAnsi="Consolas" w:cs="Times New Roman"/>
+          <w:color w:val="4EC9B0"/>
+          <w:kern w:val="0"/>
+          <w:sz w:val="21"/>
+          <w:szCs w:val="21"/>
+          <w:lang w:eastAsia="en-IN"/>
+          <w14:ligatures w14:val="none"/>
+        </w:rPr>
+        <w:t>Car</w:t>
+      </w:r>
+      <w:r>
+        <w:rPr>
+          <w:rFonts w:ascii="Consolas" w:eastAsia="Times New Roman" w:hAnsi="Consolas" w:cs="Times New Roman"/>
+          <w:color w:val="CCCCCC"/>
+          <w:kern w:val="0"/>
+          <w:sz w:val="21"/>
+          <w:szCs w:val="21"/>
+          <w:lang w:eastAsia="en-IN"/>
+          <w14:ligatures w14:val="none"/>
+        </w:rPr>
+        <w:t>(</w:t>
       </w:r>
       <w:proofErr w:type="gramEnd"/>
       <w:r>
         <w:rPr>
-          <w:rFonts w:ascii="Times New Roman" w:hAnsi="Times New Roman" w:cs="Times New Roman"/>
-        </w:rPr>
-        <w:t>Vehicle):</w:t>
-      </w:r>
-    </w:p>
-    <w:p>
-      <w:pPr>
-        <w:rPr>
-          <w:rFonts w:ascii="Times New Roman" w:hAnsi="Times New Roman" w:cs="Times New Roman"/>
-        </w:rPr>
-      </w:pPr>
-      <w:r>
-        <w:rPr>
-          <w:rFonts w:ascii="Times New Roman" w:hAnsi="Times New Roman" w:cs="Times New Roman"/>
-        </w:rPr>
-        <w:t xml:space="preserve">    def start(self):</w:t>
-      </w:r>
-    </w:p>
-    <w:p>
-      <w:pPr>
-        <w:rPr>
-          <w:rFonts w:ascii="Times New Roman" w:hAnsi="Times New Roman" w:cs="Times New Roman"/>
-        </w:rPr>
-      </w:pPr>
-      <w:r>
-        <w:rPr>
-          <w:rFonts w:ascii="Times New Roman" w:hAnsi="Times New Roman" w:cs="Times New Roman"/>
-        </w:rPr>
-        <w:t xml:space="preserve">        </w:t>
+          <w:rFonts w:ascii="Consolas" w:eastAsia="Times New Roman" w:hAnsi="Consolas" w:cs="Times New Roman"/>
+          <w:color w:val="4EC9B0"/>
+          <w:kern w:val="0"/>
+          <w:sz w:val="21"/>
+          <w:szCs w:val="21"/>
+          <w:lang w:eastAsia="en-IN"/>
+          <w14:ligatures w14:val="none"/>
+        </w:rPr>
+        <w:t>Vehicle</w:t>
+      </w:r>
+      <w:r>
+        <w:rPr>
+          <w:rFonts w:ascii="Consolas" w:eastAsia="Times New Roman" w:hAnsi="Consolas" w:cs="Times New Roman"/>
+          <w:color w:val="CCCCCC"/>
+          <w:kern w:val="0"/>
+          <w:sz w:val="21"/>
+          <w:szCs w:val="21"/>
+          <w:lang w:eastAsia="en-IN"/>
+          <w14:ligatures w14:val="none"/>
+        </w:rPr>
+        <w:t>):</w:t>
+      </w:r>
+    </w:p>
+    <w:p>
+      <w:pPr>
+        <w:pStyle w:val="ListParagraph"/>
+        <w:numPr>
+          <w:ilvl w:val="0"/>
+          <w:numId w:val="6"/>
+        </w:numPr>
+        <w:shd w:val="clear" w:color="auto" w:fill="1F1F1F"/>
+        <w:spacing w:after="0" w:line="285" w:lineRule="atLeast"/>
+        <w:rPr>
+          <w:rFonts w:ascii="Consolas" w:eastAsia="Times New Roman" w:hAnsi="Consolas" w:cs="Times New Roman"/>
+          <w:color w:val="CCCCCC"/>
+          <w:kern w:val="0"/>
+          <w:sz w:val="21"/>
+          <w:szCs w:val="21"/>
+          <w:lang w:eastAsia="en-IN"/>
+          <w14:ligatures w14:val="none"/>
+        </w:rPr>
+      </w:pPr>
+      <w:r>
+        <w:rPr>
+          <w:rFonts w:ascii="Consolas" w:eastAsia="Times New Roman" w:hAnsi="Consolas" w:cs="Times New Roman"/>
+          <w:color w:val="CCCCCC"/>
+          <w:kern w:val="0"/>
+          <w:sz w:val="21"/>
+          <w:szCs w:val="21"/>
+          <w:lang w:eastAsia="en-IN"/>
+          <w14:ligatures w14:val="none"/>
+        </w:rPr>
+        <w:t xml:space="preserve">    </w:t>
+      </w:r>
+      <w:r>
+        <w:rPr>
+          <w:rFonts w:ascii="Consolas" w:eastAsia="Times New Roman" w:hAnsi="Consolas" w:cs="Times New Roman"/>
+          <w:color w:val="569CD6"/>
+          <w:kern w:val="0"/>
+          <w:sz w:val="21"/>
+          <w:szCs w:val="21"/>
+          <w:lang w:eastAsia="en-IN"/>
+          <w14:ligatures w14:val="none"/>
+        </w:rPr>
+        <w:t>def</w:t>
+      </w:r>
+      <w:r>
+        <w:rPr>
+          <w:rFonts w:ascii="Consolas" w:eastAsia="Times New Roman" w:hAnsi="Consolas" w:cs="Times New Roman"/>
+          <w:color w:val="CCCCCC"/>
+          <w:kern w:val="0"/>
+          <w:sz w:val="21"/>
+          <w:szCs w:val="21"/>
+          <w:lang w:eastAsia="en-IN"/>
+          <w14:ligatures w14:val="none"/>
+        </w:rPr>
+        <w:t xml:space="preserve"> </w:t>
+      </w:r>
+      <w:r>
+        <w:rPr>
+          <w:rFonts w:ascii="Consolas" w:eastAsia="Times New Roman" w:hAnsi="Consolas" w:cs="Times New Roman"/>
+          <w:color w:val="DCDCAA"/>
+          <w:kern w:val="0"/>
+          <w:sz w:val="21"/>
+          <w:szCs w:val="21"/>
+          <w:lang w:eastAsia="en-IN"/>
+          <w14:ligatures w14:val="none"/>
+        </w:rPr>
+        <w:t>start</w:t>
+      </w:r>
+      <w:r>
+        <w:rPr>
+          <w:rFonts w:ascii="Consolas" w:eastAsia="Times New Roman" w:hAnsi="Consolas" w:cs="Times New Roman"/>
+          <w:color w:val="CCCCCC"/>
+          <w:kern w:val="0"/>
+          <w:sz w:val="21"/>
+          <w:szCs w:val="21"/>
+          <w:lang w:eastAsia="en-IN"/>
+          <w14:ligatures w14:val="none"/>
+        </w:rPr>
+        <w:t>(</w:t>
+      </w:r>
+      <w:r>
+        <w:rPr>
+          <w:rFonts w:ascii="Consolas" w:eastAsia="Times New Roman" w:hAnsi="Consolas" w:cs="Times New Roman"/>
+          <w:color w:val="9CDCFE"/>
+          <w:kern w:val="0"/>
+          <w:sz w:val="21"/>
+          <w:szCs w:val="21"/>
+          <w:lang w:eastAsia="en-IN"/>
+          <w14:ligatures w14:val="none"/>
+        </w:rPr>
+        <w:t>self</w:t>
+      </w:r>
+      <w:r>
+        <w:rPr>
+          <w:rFonts w:ascii="Consolas" w:eastAsia="Times New Roman" w:hAnsi="Consolas" w:cs="Times New Roman"/>
+          <w:color w:val="CCCCCC"/>
+          <w:kern w:val="0"/>
+          <w:sz w:val="21"/>
+          <w:szCs w:val="21"/>
+          <w:lang w:eastAsia="en-IN"/>
+          <w14:ligatures w14:val="none"/>
+        </w:rPr>
+        <w:t>):</w:t>
+      </w:r>
+    </w:p>
+    <w:p>
+      <w:pPr>
+        <w:pStyle w:val="ListParagraph"/>
+        <w:numPr>
+          <w:ilvl w:val="0"/>
+          <w:numId w:val="6"/>
+        </w:numPr>
+        <w:shd w:val="clear" w:color="auto" w:fill="1F1F1F"/>
+        <w:spacing w:after="0" w:line="285" w:lineRule="atLeast"/>
+        <w:rPr>
+          <w:rFonts w:ascii="Consolas" w:eastAsia="Times New Roman" w:hAnsi="Consolas" w:cs="Times New Roman"/>
+          <w:color w:val="CCCCCC"/>
+          <w:kern w:val="0"/>
+          <w:sz w:val="21"/>
+          <w:szCs w:val="21"/>
+          <w:lang w:eastAsia="en-IN"/>
+          <w14:ligatures w14:val="none"/>
+        </w:rPr>
+      </w:pPr>
+      <w:r>
+        <w:rPr>
+          <w:rFonts w:ascii="Consolas" w:eastAsia="Times New Roman" w:hAnsi="Consolas" w:cs="Times New Roman"/>
+          <w:color w:val="CCCCCC"/>
+          <w:kern w:val="0"/>
+          <w:sz w:val="21"/>
+          <w:szCs w:val="21"/>
+          <w:lang w:eastAsia="en-IN"/>
+          <w14:ligatures w14:val="none"/>
+        </w:rPr>
+        <w:t xml:space="preserve">        </w:t>
       </w:r>
       <w:proofErr w:type="gramStart"/>
       <w:r>
         <w:rPr>
-          <w:rFonts w:ascii="Times New Roman" w:hAnsi="Times New Roman" w:cs="Times New Roman"/>
-        </w:rPr>
-        <w:t>print(</w:t>
+          <w:rFonts w:ascii="Consolas" w:eastAsia="Times New Roman" w:hAnsi="Consolas" w:cs="Times New Roman"/>
+          <w:color w:val="DCDCAA"/>
+          <w:kern w:val="0"/>
+          <w:sz w:val="21"/>
+          <w:szCs w:val="21"/>
+          <w:lang w:eastAsia="en-IN"/>
+          <w14:ligatures w14:val="none"/>
+        </w:rPr>
+        <w:t>print</w:t>
+      </w:r>
+      <w:r>
+        <w:rPr>
+          <w:rFonts w:ascii="Consolas" w:eastAsia="Times New Roman" w:hAnsi="Consolas" w:cs="Times New Roman"/>
+          <w:color w:val="CCCCCC"/>
+          <w:kern w:val="0"/>
+          <w:sz w:val="21"/>
+          <w:szCs w:val="21"/>
+          <w:lang w:eastAsia="en-IN"/>
+          <w14:ligatures w14:val="none"/>
+        </w:rPr>
+        <w:t>(</w:t>
       </w:r>
       <w:proofErr w:type="gramEnd"/>
       <w:r>
         <w:rPr>
-          <w:rFonts w:ascii="Times New Roman" w:hAnsi="Times New Roman" w:cs="Times New Roman"/>
-        </w:rPr>
-        <w:t>"Car started")</w:t>
-      </w:r>
-    </w:p>
-    <w:p>
-      <w:pPr>
-        <w:rPr>
-          <w:rFonts w:ascii="Times New Roman" w:hAnsi="Times New Roman" w:cs="Times New Roman"/>
-        </w:rPr>
-      </w:pPr>
-    </w:p>
-    <w:p>
-      <w:pPr>
-        <w:rPr>
-          <w:rFonts w:ascii="Times New Roman" w:hAnsi="Times New Roman" w:cs="Times New Roman"/>
-        </w:rPr>
-      </w:pPr>
-      <w:r>
-        <w:rPr>
-          <w:rFonts w:ascii="Times New Roman" w:hAnsi="Times New Roman" w:cs="Times New Roman"/>
-        </w:rPr>
-        <w:t xml:space="preserve">car = </w:t>
+          <w:rFonts w:ascii="Consolas" w:eastAsia="Times New Roman" w:hAnsi="Consolas" w:cs="Times New Roman"/>
+          <w:color w:val="CE9178"/>
+          <w:kern w:val="0"/>
+          <w:sz w:val="21"/>
+          <w:szCs w:val="21"/>
+          <w:lang w:eastAsia="en-IN"/>
+          <w14:ligatures w14:val="none"/>
+        </w:rPr>
+        <w:t>"Car started"</w:t>
+      </w:r>
+      <w:r>
+        <w:rPr>
+          <w:rFonts w:ascii="Consolas" w:eastAsia="Times New Roman" w:hAnsi="Consolas" w:cs="Times New Roman"/>
+          <w:color w:val="CCCCCC"/>
+          <w:kern w:val="0"/>
+          <w:sz w:val="21"/>
+          <w:szCs w:val="21"/>
+          <w:lang w:eastAsia="en-IN"/>
+          <w14:ligatures w14:val="none"/>
+        </w:rPr>
+        <w:t>)</w:t>
+      </w:r>
+    </w:p>
+    <w:p>
+      <w:pPr>
+        <w:pStyle w:val="ListParagraph"/>
+        <w:numPr>
+          <w:ilvl w:val="0"/>
+          <w:numId w:val="6"/>
+        </w:numPr>
+        <w:shd w:val="clear" w:color="auto" w:fill="1F1F1F"/>
+        <w:spacing w:after="0" w:line="285" w:lineRule="atLeast"/>
+        <w:rPr>
+          <w:rFonts w:ascii="Consolas" w:eastAsia="Times New Roman" w:hAnsi="Consolas" w:cs="Times New Roman"/>
+          <w:color w:val="CCCCCC"/>
+          <w:kern w:val="0"/>
+          <w:sz w:val="21"/>
+          <w:szCs w:val="21"/>
+          <w:lang w:eastAsia="en-IN"/>
+          <w14:ligatures w14:val="none"/>
+        </w:rPr>
+      </w:pPr>
+    </w:p>
+    <w:p>
+      <w:pPr>
+        <w:pStyle w:val="ListParagraph"/>
+        <w:numPr>
+          <w:ilvl w:val="0"/>
+          <w:numId w:val="6"/>
+        </w:numPr>
+        <w:shd w:val="clear" w:color="auto" w:fill="1F1F1F"/>
+        <w:spacing w:after="0" w:line="285" w:lineRule="atLeast"/>
+        <w:rPr>
+          <w:rFonts w:ascii="Consolas" w:eastAsia="Times New Roman" w:hAnsi="Consolas" w:cs="Times New Roman"/>
+          <w:color w:val="CCCCCC"/>
+          <w:kern w:val="0"/>
+          <w:sz w:val="21"/>
+          <w:szCs w:val="21"/>
+          <w:lang w:eastAsia="en-IN"/>
+          <w14:ligatures w14:val="none"/>
+        </w:rPr>
+      </w:pPr>
+      <w:r>
+        <w:rPr>
+          <w:rFonts w:ascii="Consolas" w:eastAsia="Times New Roman" w:hAnsi="Consolas" w:cs="Times New Roman"/>
+          <w:color w:val="9CDCFE"/>
+          <w:kern w:val="0"/>
+          <w:sz w:val="21"/>
+          <w:szCs w:val="21"/>
+          <w:lang w:eastAsia="en-IN"/>
+          <w14:ligatures w14:val="none"/>
+        </w:rPr>
+        <w:t>car</w:t>
+      </w:r>
+      <w:r>
+        <w:rPr>
+          <w:rFonts w:ascii="Consolas" w:eastAsia="Times New Roman" w:hAnsi="Consolas" w:cs="Times New Roman"/>
+          <w:color w:val="CCCCCC"/>
+          <w:kern w:val="0"/>
+          <w:sz w:val="21"/>
+          <w:szCs w:val="21"/>
+          <w:lang w:eastAsia="en-IN"/>
+          <w14:ligatures w14:val="none"/>
+        </w:rPr>
+        <w:t xml:space="preserve"> </w:t>
+      </w:r>
+      <w:r>
+        <w:rPr>
+          <w:rFonts w:ascii="Consolas" w:eastAsia="Times New Roman" w:hAnsi="Consolas" w:cs="Times New Roman"/>
+          <w:color w:val="D4D4D4"/>
+          <w:kern w:val="0"/>
+          <w:sz w:val="21"/>
+          <w:szCs w:val="21"/>
+          <w:lang w:eastAsia="en-IN"/>
+          <w14:ligatures w14:val="none"/>
+        </w:rPr>
+        <w:t>=</w:t>
+      </w:r>
+      <w:r>
+        <w:rPr>
+          <w:rFonts w:ascii="Consolas" w:eastAsia="Times New Roman" w:hAnsi="Consolas" w:cs="Times New Roman"/>
+          <w:color w:val="CCCCCC"/>
+          <w:kern w:val="0"/>
+          <w:sz w:val="21"/>
+          <w:szCs w:val="21"/>
+          <w:lang w:eastAsia="en-IN"/>
+          <w14:ligatures w14:val="none"/>
+        </w:rPr>
+        <w:t xml:space="preserve"> </w:t>
       </w:r>
       <w:proofErr w:type="gramStart"/>
       <w:r>
         <w:rPr>
-          <w:rFonts w:ascii="Times New Roman" w:hAnsi="Times New Roman" w:cs="Times New Roman"/>
-        </w:rPr>
-        <w:t>Car(</w:t>
+          <w:rFonts w:ascii="Consolas" w:eastAsia="Times New Roman" w:hAnsi="Consolas" w:cs="Times New Roman"/>
+          <w:color w:val="4EC9B0"/>
+          <w:kern w:val="0"/>
+          <w:sz w:val="21"/>
+          <w:szCs w:val="21"/>
+          <w:lang w:eastAsia="en-IN"/>
+          <w14:ligatures w14:val="none"/>
+        </w:rPr>
+        <w:t>Car</w:t>
+      </w:r>
+      <w:r>
+        <w:rPr>
+          <w:rFonts w:ascii="Consolas" w:eastAsia="Times New Roman" w:hAnsi="Consolas" w:cs="Times New Roman"/>
+          <w:color w:val="CCCCCC"/>
+          <w:kern w:val="0"/>
+          <w:sz w:val="21"/>
+          <w:szCs w:val="21"/>
+          <w:lang w:eastAsia="en-IN"/>
+          <w14:ligatures w14:val="none"/>
+        </w:rPr>
+        <w:t>(</w:t>
       </w:r>
       <w:proofErr w:type="gramEnd"/>
       <w:r>
         <w:rPr>
-          <w:rFonts w:ascii="Times New Roman" w:hAnsi="Times New Roman" w:cs="Times New Roman"/>
+          <w:rFonts w:ascii="Consolas" w:eastAsia="Times New Roman" w:hAnsi="Consolas" w:cs="Times New Roman"/>
+          <w:color w:val="CCCCCC"/>
+          <w:kern w:val="0"/>
+          <w:sz w:val="21"/>
+          <w:szCs w:val="21"/>
+          <w:lang w:eastAsia="en-IN"/>
+          <w14:ligatures w14:val="none"/>
         </w:rPr>
         <w:t>)</w:t>
       </w:r>
     </w:p>
     <w:p>
       <w:pPr>
-        <w:rPr>
-          <w:rFonts w:ascii="Times New Roman" w:hAnsi="Times New Roman" w:cs="Times New Roman"/>
+        <w:pStyle w:val="ListParagraph"/>
+        <w:numPr>
+          <w:ilvl w:val="0"/>
+          <w:numId w:val="6"/>
+        </w:numPr>
+        <w:shd w:val="clear" w:color="auto" w:fill="1F1F1F"/>
+        <w:spacing w:after="0" w:line="285" w:lineRule="atLeast"/>
+        <w:rPr>
+          <w:rFonts w:ascii="Consolas" w:eastAsia="Times New Roman" w:hAnsi="Consolas" w:cs="Times New Roman"/>
+          <w:color w:val="CCCCCC"/>
+          <w:kern w:val="0"/>
+          <w:sz w:val="21"/>
+          <w:szCs w:val="21"/>
+          <w:lang w:eastAsia="en-IN"/>
+          <w14:ligatures w14:val="none"/>
         </w:rPr>
       </w:pPr>
       <w:proofErr w:type="spellStart"/>
       <w:proofErr w:type="gramStart"/>
       <w:r>
         <w:rPr>
-          <w:rFonts w:ascii="Times New Roman" w:hAnsi="Times New Roman" w:cs="Times New Roman"/>
-        </w:rPr>
-        <w:t>car.start</w:t>
+          <w:rFonts w:ascii="Consolas" w:eastAsia="Times New Roman" w:hAnsi="Consolas" w:cs="Times New Roman"/>
+          <w:color w:val="9CDCFE"/>
+          <w:kern w:val="0"/>
+          <w:sz w:val="21"/>
+          <w:szCs w:val="21"/>
+          <w:lang w:eastAsia="en-IN"/>
+          <w14:ligatures w14:val="none"/>
+        </w:rPr>
+        <w:t>car</w:t>
+      </w:r>
+      <w:r>
+        <w:rPr>
+          <w:rFonts w:ascii="Consolas" w:eastAsia="Times New Roman" w:hAnsi="Consolas" w:cs="Times New Roman"/>
+          <w:color w:val="CCCCCC"/>
+          <w:kern w:val="0"/>
+          <w:sz w:val="21"/>
+          <w:szCs w:val="21"/>
+          <w:lang w:eastAsia="en-IN"/>
+          <w14:ligatures w14:val="none"/>
+        </w:rPr>
+        <w:t>.</w:t>
+      </w:r>
+      <w:r>
+        <w:rPr>
+          <w:rFonts w:ascii="Consolas" w:eastAsia="Times New Roman" w:hAnsi="Consolas" w:cs="Times New Roman"/>
+          <w:color w:val="DCDCAA"/>
+          <w:kern w:val="0"/>
+          <w:sz w:val="21"/>
+          <w:szCs w:val="21"/>
+          <w:lang w:eastAsia="en-IN"/>
+          <w14:ligatures w14:val="none"/>
+        </w:rPr>
+        <w:t>start</w:t>
       </w:r>
       <w:proofErr w:type="spellEnd"/>
       <w:proofErr w:type="gramEnd"/>
       <w:r>
         <w:rPr>
-          <w:rFonts w:ascii="Times New Roman" w:hAnsi="Times New Roman" w:cs="Times New Roman"/>
-        </w:rPr>
-        <w:t>()  # Output: Car started</w:t>
-      </w:r>
-    </w:p>
-    <w:p>
-      <w:pPr>
-        <w:rPr>
-          <w:rFonts w:ascii="Times New Roman" w:hAnsi="Times New Roman" w:cs="Times New Roman"/>
-        </w:rPr>
-      </w:pPr>
-      <w:r>
-        <w:rPr>
-          <w:rFonts w:ascii="Times New Roman" w:hAnsi="Times New Roman" w:cs="Times New Roman"/>
-        </w:rPr>
-        <w:pict w14:anchorId="040BCC18">
-          <v:rect id="_x0000_i1038" style="width:0;height:1.5pt" o:hralign="center" o:hrstd="t" o:hr="t" fillcolor="#a0a0a0" stroked="f"/>
-        </w:pict>
-      </w:r>
+          <w:rFonts w:ascii="Consolas" w:eastAsia="Times New Roman" w:hAnsi="Consolas" w:cs="Times New Roman"/>
+          <w:color w:val="CCCCCC"/>
+          <w:kern w:val="0"/>
+          <w:sz w:val="21"/>
+          <w:szCs w:val="21"/>
+          <w:lang w:eastAsia="en-IN"/>
+          <w14:ligatures w14:val="none"/>
+        </w:rPr>
+        <w:t>()  </w:t>
+      </w:r>
+      <w:r>
+        <w:rPr>
+          <w:rFonts w:ascii="Consolas" w:eastAsia="Times New Roman" w:hAnsi="Consolas" w:cs="Times New Roman"/>
+          <w:color w:val="6A9955"/>
+          <w:kern w:val="0"/>
+          <w:sz w:val="21"/>
+          <w:szCs w:val="21"/>
+          <w:lang w:eastAsia="en-IN"/>
+          <w14:ligatures w14:val="none"/>
+        </w:rPr>
+        <w:t># Output: Car started</w:t>
+      </w:r>
+    </w:p>
+    <w:p>
+      <w:pPr>
+        <w:pStyle w:val="ListParagraph"/>
+        <w:numPr>
+          <w:ilvl w:val="0"/>
+          <w:numId w:val="6"/>
+        </w:numPr>
+        <w:shd w:val="clear" w:color="auto" w:fill="1F1F1F"/>
+        <w:spacing w:after="0" w:line="285" w:lineRule="atLeast"/>
+        <w:rPr>
+          <w:rFonts w:ascii="Consolas" w:eastAsia="Times New Roman" w:hAnsi="Consolas" w:cs="Times New Roman"/>
+          <w:color w:val="CCCCCC"/>
+          <w:kern w:val="0"/>
+          <w:sz w:val="21"/>
+          <w:szCs w:val="21"/>
+          <w:lang w:eastAsia="en-IN"/>
+          <w14:ligatures w14:val="none"/>
+        </w:rPr>
+      </w:pPr>
+    </w:p>
+    <w:p>
+      <w:pPr>
+        <w:rPr>
+          <w:rFonts w:ascii="Times New Roman" w:hAnsi="Times New Roman" w:cs="Times New Roman"/>
+        </w:rPr>
+      </w:pPr>
     </w:p>
     <w:p>
       <w:pPr>
@@ -4397,173 +6138,558 @@
     </w:p>
     <w:p>
       <w:pPr>
-        <w:rPr>
-          <w:rFonts w:ascii="Times New Roman" w:hAnsi="Times New Roman" w:cs="Times New Roman"/>
-        </w:rPr>
-      </w:pPr>
-      <w:r>
-        <w:rPr>
-          <w:rFonts w:ascii="Times New Roman" w:hAnsi="Times New Roman" w:cs="Times New Roman"/>
-        </w:rPr>
-        <w:t>python</w:t>
-      </w:r>
-    </w:p>
-    <w:p>
-      <w:pPr>
-        <w:rPr>
-          <w:rFonts w:ascii="Times New Roman" w:hAnsi="Times New Roman" w:cs="Times New Roman"/>
-        </w:rPr>
-      </w:pPr>
+        <w:pStyle w:val="ListParagraph"/>
+        <w:numPr>
+          <w:ilvl w:val="0"/>
+          <w:numId w:val="7"/>
+        </w:numPr>
+        <w:shd w:val="clear" w:color="auto" w:fill="1F1F1F"/>
+        <w:spacing w:after="0" w:line="285" w:lineRule="atLeast"/>
+        <w:rPr>
+          <w:rFonts w:ascii="Consolas" w:eastAsia="Times New Roman" w:hAnsi="Consolas" w:cs="Times New Roman"/>
+          <w:color w:val="CCCCCC"/>
+          <w:kern w:val="0"/>
+          <w:sz w:val="21"/>
+          <w:szCs w:val="21"/>
+          <w:lang w:eastAsia="en-IN"/>
+          <w14:ligatures w14:val="none"/>
+        </w:rPr>
+      </w:pPr>
+      <w:r>
+        <w:rPr>
+          <w:rFonts w:ascii="Consolas" w:eastAsia="Times New Roman" w:hAnsi="Consolas" w:cs="Times New Roman"/>
+          <w:color w:val="569CD6"/>
+          <w:kern w:val="0"/>
+          <w:sz w:val="21"/>
+          <w:szCs w:val="21"/>
+          <w:lang w:eastAsia="en-IN"/>
+          <w14:ligatures w14:val="none"/>
+        </w:rPr>
+        <w:t>class</w:t>
+      </w:r>
+      <w:r>
+        <w:rPr>
+          <w:rFonts w:ascii="Consolas" w:eastAsia="Times New Roman" w:hAnsi="Consolas" w:cs="Times New Roman"/>
+          <w:color w:val="CCCCCC"/>
+          <w:kern w:val="0"/>
+          <w:sz w:val="21"/>
+          <w:szCs w:val="21"/>
+          <w:lang w:eastAsia="en-IN"/>
+          <w14:ligatures w14:val="none"/>
+        </w:rPr>
+        <w:t xml:space="preserve"> </w:t>
+      </w:r>
+      <w:r>
+        <w:rPr>
+          <w:rFonts w:ascii="Consolas" w:eastAsia="Times New Roman" w:hAnsi="Consolas" w:cs="Times New Roman"/>
+          <w:color w:val="4EC9B0"/>
+          <w:kern w:val="0"/>
+          <w:sz w:val="21"/>
+          <w:szCs w:val="21"/>
+          <w:lang w:eastAsia="en-IN"/>
+          <w14:ligatures w14:val="none"/>
+        </w:rPr>
+        <w:t>Example</w:t>
+      </w:r>
+      <w:r>
+        <w:rPr>
+          <w:rFonts w:ascii="Consolas" w:eastAsia="Times New Roman" w:hAnsi="Consolas" w:cs="Times New Roman"/>
+          <w:color w:val="CCCCCC"/>
+          <w:kern w:val="0"/>
+          <w:sz w:val="21"/>
+          <w:szCs w:val="21"/>
+          <w:lang w:eastAsia="en-IN"/>
+          <w14:ligatures w14:val="none"/>
+        </w:rPr>
+        <w:t>:</w:t>
+      </w:r>
+    </w:p>
+    <w:p>
+      <w:pPr>
+        <w:pStyle w:val="ListParagraph"/>
+        <w:numPr>
+          <w:ilvl w:val="0"/>
+          <w:numId w:val="7"/>
+        </w:numPr>
+        <w:shd w:val="clear" w:color="auto" w:fill="1F1F1F"/>
+        <w:spacing w:after="0" w:line="285" w:lineRule="atLeast"/>
+        <w:rPr>
+          <w:rFonts w:ascii="Consolas" w:eastAsia="Times New Roman" w:hAnsi="Consolas" w:cs="Times New Roman"/>
+          <w:color w:val="CCCCCC"/>
+          <w:kern w:val="0"/>
+          <w:sz w:val="21"/>
+          <w:szCs w:val="21"/>
+          <w:lang w:eastAsia="en-IN"/>
+          <w14:ligatures w14:val="none"/>
+        </w:rPr>
+      </w:pPr>
+      <w:r>
+        <w:rPr>
+          <w:rFonts w:ascii="Consolas" w:eastAsia="Times New Roman" w:hAnsi="Consolas" w:cs="Times New Roman"/>
+          <w:color w:val="CCCCCC"/>
+          <w:kern w:val="0"/>
+          <w:sz w:val="21"/>
+          <w:szCs w:val="21"/>
+          <w:lang w:eastAsia="en-IN"/>
+          <w14:ligatures w14:val="none"/>
+        </w:rPr>
+        <w:t xml:space="preserve">    </w:t>
+      </w:r>
       <w:proofErr w:type="spellStart"/>
       <w:r>
         <w:rPr>
-          <w:rFonts w:ascii="Times New Roman" w:hAnsi="Times New Roman" w:cs="Times New Roman"/>
-        </w:rPr>
-        <w:t>CopyEdit</w:t>
+          <w:rFonts w:ascii="Consolas" w:eastAsia="Times New Roman" w:hAnsi="Consolas" w:cs="Times New Roman"/>
+          <w:color w:val="9CDCFE"/>
+          <w:kern w:val="0"/>
+          <w:sz w:val="21"/>
+          <w:szCs w:val="21"/>
+          <w:lang w:eastAsia="en-IN"/>
+          <w14:ligatures w14:val="none"/>
+        </w:rPr>
+        <w:t>class_var</w:t>
       </w:r>
       <w:proofErr w:type="spellEnd"/>
-    </w:p>
-    <w:p>
-      <w:pPr>
-        <w:rPr>
-          <w:rFonts w:ascii="Times New Roman" w:hAnsi="Times New Roman" w:cs="Times New Roman"/>
-        </w:rPr>
-      </w:pPr>
-      <w:r>
-        <w:rPr>
-          <w:rFonts w:ascii="Times New Roman" w:hAnsi="Times New Roman" w:cs="Times New Roman"/>
-        </w:rPr>
-        <w:t>class Example:</w:t>
-      </w:r>
-    </w:p>
-    <w:p>
-      <w:pPr>
-        <w:rPr>
-          <w:rFonts w:ascii="Times New Roman" w:hAnsi="Times New Roman" w:cs="Times New Roman"/>
-        </w:rPr>
-      </w:pPr>
-      <w:r>
-        <w:rPr>
-          <w:rFonts w:ascii="Times New Roman" w:hAnsi="Times New Roman" w:cs="Times New Roman"/>
-        </w:rPr>
-        <w:t xml:space="preserve">    </w:t>
+      <w:r>
+        <w:rPr>
+          <w:rFonts w:ascii="Consolas" w:eastAsia="Times New Roman" w:hAnsi="Consolas" w:cs="Times New Roman"/>
+          <w:color w:val="CCCCCC"/>
+          <w:kern w:val="0"/>
+          <w:sz w:val="21"/>
+          <w:szCs w:val="21"/>
+          <w:lang w:eastAsia="en-IN"/>
+          <w14:ligatures w14:val="none"/>
+        </w:rPr>
+        <w:t xml:space="preserve"> </w:t>
+      </w:r>
+      <w:r>
+        <w:rPr>
+          <w:rFonts w:ascii="Consolas" w:eastAsia="Times New Roman" w:hAnsi="Consolas" w:cs="Times New Roman"/>
+          <w:color w:val="D4D4D4"/>
+          <w:kern w:val="0"/>
+          <w:sz w:val="21"/>
+          <w:szCs w:val="21"/>
+          <w:lang w:eastAsia="en-IN"/>
+          <w14:ligatures w14:val="none"/>
+        </w:rPr>
+        <w:t>=</w:t>
+      </w:r>
+      <w:r>
+        <w:rPr>
+          <w:rFonts w:ascii="Consolas" w:eastAsia="Times New Roman" w:hAnsi="Consolas" w:cs="Times New Roman"/>
+          <w:color w:val="CCCCCC"/>
+          <w:kern w:val="0"/>
+          <w:sz w:val="21"/>
+          <w:szCs w:val="21"/>
+          <w:lang w:eastAsia="en-IN"/>
+          <w14:ligatures w14:val="none"/>
+        </w:rPr>
+        <w:t xml:space="preserve"> </w:t>
+      </w:r>
+      <w:proofErr w:type="gramStart"/>
+      <w:r>
+        <w:rPr>
+          <w:rFonts w:ascii="Consolas" w:eastAsia="Times New Roman" w:hAnsi="Consolas" w:cs="Times New Roman"/>
+          <w:color w:val="B5CEA8"/>
+          <w:kern w:val="0"/>
+          <w:sz w:val="21"/>
+          <w:szCs w:val="21"/>
+          <w:lang w:eastAsia="en-IN"/>
+          <w14:ligatures w14:val="none"/>
+        </w:rPr>
+        <w:t>0</w:t>
+      </w:r>
+      <w:r>
+        <w:rPr>
+          <w:rFonts w:ascii="Consolas" w:eastAsia="Times New Roman" w:hAnsi="Consolas" w:cs="Times New Roman"/>
+          <w:color w:val="CCCCCC"/>
+          <w:kern w:val="0"/>
+          <w:sz w:val="21"/>
+          <w:szCs w:val="21"/>
+          <w:lang w:eastAsia="en-IN"/>
+          <w14:ligatures w14:val="none"/>
+        </w:rPr>
+        <w:t xml:space="preserve">  </w:t>
+      </w:r>
+      <w:r>
+        <w:rPr>
+          <w:rFonts w:ascii="Consolas" w:eastAsia="Times New Roman" w:hAnsi="Consolas" w:cs="Times New Roman"/>
+          <w:color w:val="6A9955"/>
+          <w:kern w:val="0"/>
+          <w:sz w:val="21"/>
+          <w:szCs w:val="21"/>
+          <w:lang w:eastAsia="en-IN"/>
+          <w14:ligatures w14:val="none"/>
+        </w:rPr>
+        <w:t>#</w:t>
+      </w:r>
+      <w:proofErr w:type="gramEnd"/>
+      <w:r>
+        <w:rPr>
+          <w:rFonts w:ascii="Consolas" w:eastAsia="Times New Roman" w:hAnsi="Consolas" w:cs="Times New Roman"/>
+          <w:color w:val="6A9955"/>
+          <w:kern w:val="0"/>
+          <w:sz w:val="21"/>
+          <w:szCs w:val="21"/>
+          <w:lang w:eastAsia="en-IN"/>
+          <w14:ligatures w14:val="none"/>
+        </w:rPr>
+        <w:t xml:space="preserve"> Class variable</w:t>
+      </w:r>
+    </w:p>
+    <w:p>
+      <w:pPr>
+        <w:pStyle w:val="ListParagraph"/>
+        <w:numPr>
+          <w:ilvl w:val="0"/>
+          <w:numId w:val="7"/>
+        </w:numPr>
+        <w:shd w:val="clear" w:color="auto" w:fill="1F1F1F"/>
+        <w:spacing w:after="0" w:line="285" w:lineRule="atLeast"/>
+        <w:rPr>
+          <w:rFonts w:ascii="Consolas" w:eastAsia="Times New Roman" w:hAnsi="Consolas" w:cs="Times New Roman"/>
+          <w:color w:val="CCCCCC"/>
+          <w:kern w:val="0"/>
+          <w:sz w:val="21"/>
+          <w:szCs w:val="21"/>
+          <w:lang w:eastAsia="en-IN"/>
+          <w14:ligatures w14:val="none"/>
+        </w:rPr>
+      </w:pPr>
+      <w:r>
+        <w:rPr>
+          <w:rFonts w:ascii="Consolas" w:eastAsia="Times New Roman" w:hAnsi="Consolas" w:cs="Times New Roman"/>
+          <w:color w:val="CCCCCC"/>
+          <w:kern w:val="0"/>
+          <w:sz w:val="21"/>
+          <w:szCs w:val="21"/>
+          <w:lang w:eastAsia="en-IN"/>
+          <w14:ligatures w14:val="none"/>
+        </w:rPr>
+        <w:t xml:space="preserve">    </w:t>
+      </w:r>
+    </w:p>
+    <w:p>
+      <w:pPr>
+        <w:pStyle w:val="ListParagraph"/>
+        <w:numPr>
+          <w:ilvl w:val="0"/>
+          <w:numId w:val="7"/>
+        </w:numPr>
+        <w:shd w:val="clear" w:color="auto" w:fill="1F1F1F"/>
+        <w:spacing w:after="0" w:line="285" w:lineRule="atLeast"/>
+        <w:rPr>
+          <w:rFonts w:ascii="Consolas" w:eastAsia="Times New Roman" w:hAnsi="Consolas" w:cs="Times New Roman"/>
+          <w:color w:val="CCCCCC"/>
+          <w:kern w:val="0"/>
+          <w:sz w:val="21"/>
+          <w:szCs w:val="21"/>
+          <w:lang w:eastAsia="en-IN"/>
+          <w14:ligatures w14:val="none"/>
+        </w:rPr>
+      </w:pPr>
+      <w:r>
+        <w:rPr>
+          <w:rFonts w:ascii="Consolas" w:eastAsia="Times New Roman" w:hAnsi="Consolas" w:cs="Times New Roman"/>
+          <w:color w:val="CCCCCC"/>
+          <w:kern w:val="0"/>
+          <w:sz w:val="21"/>
+          <w:szCs w:val="21"/>
+          <w:lang w:eastAsia="en-IN"/>
+          <w14:ligatures w14:val="none"/>
+        </w:rPr>
+        <w:t xml:space="preserve">    </w:t>
+      </w:r>
+      <w:r>
+        <w:rPr>
+          <w:rFonts w:ascii="Consolas" w:eastAsia="Times New Roman" w:hAnsi="Consolas" w:cs="Times New Roman"/>
+          <w:color w:val="569CD6"/>
+          <w:kern w:val="0"/>
+          <w:sz w:val="21"/>
+          <w:szCs w:val="21"/>
+          <w:lang w:eastAsia="en-IN"/>
+          <w14:ligatures w14:val="none"/>
+        </w:rPr>
+        <w:t>def</w:t>
+      </w:r>
+      <w:r>
+        <w:rPr>
+          <w:rFonts w:ascii="Consolas" w:eastAsia="Times New Roman" w:hAnsi="Consolas" w:cs="Times New Roman"/>
+          <w:color w:val="CCCCCC"/>
+          <w:kern w:val="0"/>
+          <w:sz w:val="21"/>
+          <w:szCs w:val="21"/>
+          <w:lang w:eastAsia="en-IN"/>
+          <w14:ligatures w14:val="none"/>
+        </w:rPr>
+        <w:t xml:space="preserve"> </w:t>
+      </w:r>
+      <w:r>
+        <w:rPr>
+          <w:rFonts w:ascii="Consolas" w:eastAsia="Times New Roman" w:hAnsi="Consolas" w:cs="Times New Roman"/>
+          <w:color w:val="DCDCAA"/>
+          <w:kern w:val="0"/>
+          <w:sz w:val="21"/>
+          <w:szCs w:val="21"/>
+          <w:lang w:eastAsia="en-IN"/>
+          <w14:ligatures w14:val="none"/>
+        </w:rPr>
+        <w:t>__</w:t>
       </w:r>
       <w:proofErr w:type="spellStart"/>
       <w:r>
         <w:rPr>
-          <w:rFonts w:ascii="Times New Roman" w:hAnsi="Times New Roman" w:cs="Times New Roman"/>
-        </w:rPr>
-        <w:t>class_var</w:t>
+          <w:rFonts w:ascii="Consolas" w:eastAsia="Times New Roman" w:hAnsi="Consolas" w:cs="Times New Roman"/>
+          <w:color w:val="DCDCAA"/>
+          <w:kern w:val="0"/>
+          <w:sz w:val="21"/>
+          <w:szCs w:val="21"/>
+          <w:lang w:eastAsia="en-IN"/>
+          <w14:ligatures w14:val="none"/>
+        </w:rPr>
+        <w:t>init</w:t>
       </w:r>
       <w:proofErr w:type="spellEnd"/>
       <w:r>
         <w:rPr>
-          <w:rFonts w:ascii="Times New Roman" w:hAnsi="Times New Roman" w:cs="Times New Roman"/>
-        </w:rPr>
-        <w:t xml:space="preserve"> = </w:t>
+          <w:rFonts w:ascii="Consolas" w:eastAsia="Times New Roman" w:hAnsi="Consolas" w:cs="Times New Roman"/>
+          <w:color w:val="DCDCAA"/>
+          <w:kern w:val="0"/>
+          <w:sz w:val="21"/>
+          <w:szCs w:val="21"/>
+          <w:lang w:eastAsia="en-IN"/>
+          <w14:ligatures w14:val="none"/>
+        </w:rPr>
+        <w:t>_</w:t>
       </w:r>
       <w:proofErr w:type="gramStart"/>
       <w:r>
         <w:rPr>
-          <w:rFonts w:ascii="Times New Roman" w:hAnsi="Times New Roman" w:cs="Times New Roman"/>
-        </w:rPr>
-        <w:t>0  #</w:t>
+          <w:rFonts w:ascii="Consolas" w:eastAsia="Times New Roman" w:hAnsi="Consolas" w:cs="Times New Roman"/>
+          <w:color w:val="DCDCAA"/>
+          <w:kern w:val="0"/>
+          <w:sz w:val="21"/>
+          <w:szCs w:val="21"/>
+          <w:lang w:eastAsia="en-IN"/>
+          <w14:ligatures w14:val="none"/>
+        </w:rPr>
+        <w:t>_</w:t>
+      </w:r>
+      <w:r>
+        <w:rPr>
+          <w:rFonts w:ascii="Consolas" w:eastAsia="Times New Roman" w:hAnsi="Consolas" w:cs="Times New Roman"/>
+          <w:color w:val="CCCCCC"/>
+          <w:kern w:val="0"/>
+          <w:sz w:val="21"/>
+          <w:szCs w:val="21"/>
+          <w:lang w:eastAsia="en-IN"/>
+          <w14:ligatures w14:val="none"/>
+        </w:rPr>
+        <w:t>(</w:t>
       </w:r>
       <w:proofErr w:type="gramEnd"/>
       <w:r>
         <w:rPr>
-          <w:rFonts w:ascii="Times New Roman" w:hAnsi="Times New Roman" w:cs="Times New Roman"/>
-        </w:rPr>
-        <w:t xml:space="preserve"> Class variable</w:t>
-      </w:r>
-    </w:p>
-    <w:p>
-      <w:pPr>
-        <w:rPr>
-          <w:rFonts w:ascii="Times New Roman" w:hAnsi="Times New Roman" w:cs="Times New Roman"/>
-        </w:rPr>
-      </w:pPr>
-      <w:r>
-        <w:rPr>
-          <w:rFonts w:ascii="Times New Roman" w:hAnsi="Times New Roman" w:cs="Times New Roman"/>
-        </w:rPr>
-        <w:t xml:space="preserve">    </w:t>
-      </w:r>
-    </w:p>
-    <w:p>
-      <w:pPr>
-        <w:rPr>
-          <w:rFonts w:ascii="Times New Roman" w:hAnsi="Times New Roman" w:cs="Times New Roman"/>
-        </w:rPr>
-      </w:pPr>
-      <w:r>
-        <w:rPr>
-          <w:rFonts w:ascii="Times New Roman" w:hAnsi="Times New Roman" w:cs="Times New Roman"/>
-        </w:rPr>
-        <w:t xml:space="preserve">    def __</w:t>
-      </w:r>
-      <w:proofErr w:type="spellStart"/>
-      <w:r>
-        <w:rPr>
-          <w:rFonts w:ascii="Times New Roman" w:hAnsi="Times New Roman" w:cs="Times New Roman"/>
-        </w:rPr>
-        <w:t>init</w:t>
-      </w:r>
-      <w:proofErr w:type="spellEnd"/>
-      <w:r>
-        <w:rPr>
-          <w:rFonts w:ascii="Times New Roman" w:hAnsi="Times New Roman" w:cs="Times New Roman"/>
-        </w:rPr>
-        <w:t>_</w:t>
-      </w:r>
-      <w:proofErr w:type="gramStart"/>
-      <w:r>
-        <w:rPr>
-          <w:rFonts w:ascii="Times New Roman" w:hAnsi="Times New Roman" w:cs="Times New Roman"/>
-        </w:rPr>
-        <w:t>_(</w:t>
-      </w:r>
-      <w:proofErr w:type="gramEnd"/>
-      <w:r>
-        <w:rPr>
-          <w:rFonts w:ascii="Times New Roman" w:hAnsi="Times New Roman" w:cs="Times New Roman"/>
-        </w:rPr>
-        <w:t>self, value):</w:t>
-      </w:r>
-    </w:p>
-    <w:p>
-      <w:pPr>
-        <w:rPr>
-          <w:rFonts w:ascii="Times New Roman" w:hAnsi="Times New Roman" w:cs="Times New Roman"/>
-        </w:rPr>
-      </w:pPr>
-      <w:r>
-        <w:rPr>
-          <w:rFonts w:ascii="Times New Roman" w:hAnsi="Times New Roman" w:cs="Times New Roman"/>
-        </w:rPr>
-        <w:t xml:space="preserve">        </w:t>
+          <w:rFonts w:ascii="Consolas" w:eastAsia="Times New Roman" w:hAnsi="Consolas" w:cs="Times New Roman"/>
+          <w:color w:val="9CDCFE"/>
+          <w:kern w:val="0"/>
+          <w:sz w:val="21"/>
+          <w:szCs w:val="21"/>
+          <w:lang w:eastAsia="en-IN"/>
+          <w14:ligatures w14:val="none"/>
+        </w:rPr>
+        <w:t>self</w:t>
+      </w:r>
+      <w:r>
+        <w:rPr>
+          <w:rFonts w:ascii="Consolas" w:eastAsia="Times New Roman" w:hAnsi="Consolas" w:cs="Times New Roman"/>
+          <w:color w:val="CCCCCC"/>
+          <w:kern w:val="0"/>
+          <w:sz w:val="21"/>
+          <w:szCs w:val="21"/>
+          <w:lang w:eastAsia="en-IN"/>
+          <w14:ligatures w14:val="none"/>
+        </w:rPr>
+        <w:t xml:space="preserve">, </w:t>
+      </w:r>
+      <w:r>
+        <w:rPr>
+          <w:rFonts w:ascii="Consolas" w:eastAsia="Times New Roman" w:hAnsi="Consolas" w:cs="Times New Roman"/>
+          <w:color w:val="9CDCFE"/>
+          <w:kern w:val="0"/>
+          <w:sz w:val="21"/>
+          <w:szCs w:val="21"/>
+          <w:lang w:eastAsia="en-IN"/>
+          <w14:ligatures w14:val="none"/>
+        </w:rPr>
+        <w:t>value</w:t>
+      </w:r>
+      <w:r>
+        <w:rPr>
+          <w:rFonts w:ascii="Consolas" w:eastAsia="Times New Roman" w:hAnsi="Consolas" w:cs="Times New Roman"/>
+          <w:color w:val="CCCCCC"/>
+          <w:kern w:val="0"/>
+          <w:sz w:val="21"/>
+          <w:szCs w:val="21"/>
+          <w:lang w:eastAsia="en-IN"/>
+          <w14:ligatures w14:val="none"/>
+        </w:rPr>
+        <w:t>):</w:t>
+      </w:r>
+    </w:p>
+    <w:p>
+      <w:pPr>
+        <w:pStyle w:val="ListParagraph"/>
+        <w:numPr>
+          <w:ilvl w:val="0"/>
+          <w:numId w:val="7"/>
+        </w:numPr>
+        <w:shd w:val="clear" w:color="auto" w:fill="1F1F1F"/>
+        <w:spacing w:after="0" w:line="285" w:lineRule="atLeast"/>
+        <w:rPr>
+          <w:rFonts w:ascii="Consolas" w:eastAsia="Times New Roman" w:hAnsi="Consolas" w:cs="Times New Roman"/>
+          <w:color w:val="CCCCCC"/>
+          <w:kern w:val="0"/>
+          <w:sz w:val="21"/>
+          <w:szCs w:val="21"/>
+          <w:lang w:eastAsia="en-IN"/>
+          <w14:ligatures w14:val="none"/>
+        </w:rPr>
+      </w:pPr>
+      <w:r>
+        <w:rPr>
+          <w:rFonts w:ascii="Consolas" w:eastAsia="Times New Roman" w:hAnsi="Consolas" w:cs="Times New Roman"/>
+          <w:color w:val="CCCCCC"/>
+          <w:kern w:val="0"/>
+          <w:sz w:val="21"/>
+          <w:szCs w:val="21"/>
+          <w:lang w:eastAsia="en-IN"/>
+          <w14:ligatures w14:val="none"/>
+        </w:rPr>
+        <w:t xml:space="preserve">        </w:t>
       </w:r>
       <w:proofErr w:type="spellStart"/>
       <w:proofErr w:type="gramStart"/>
       <w:r>
         <w:rPr>
-          <w:rFonts w:ascii="Times New Roman" w:hAnsi="Times New Roman" w:cs="Times New Roman"/>
-        </w:rPr>
-        <w:t>self.instance</w:t>
+          <w:rFonts w:ascii="Consolas" w:eastAsia="Times New Roman" w:hAnsi="Consolas" w:cs="Times New Roman"/>
+          <w:color w:val="9CDCFE"/>
+          <w:kern w:val="0"/>
+          <w:sz w:val="21"/>
+          <w:szCs w:val="21"/>
+          <w:lang w:eastAsia="en-IN"/>
+          <w14:ligatures w14:val="none"/>
+        </w:rPr>
+        <w:t>self</w:t>
+      </w:r>
+      <w:r>
+        <w:rPr>
+          <w:rFonts w:ascii="Consolas" w:eastAsia="Times New Roman" w:hAnsi="Consolas" w:cs="Times New Roman"/>
+          <w:color w:val="CCCCCC"/>
+          <w:kern w:val="0"/>
+          <w:sz w:val="21"/>
+          <w:szCs w:val="21"/>
+          <w:lang w:eastAsia="en-IN"/>
+          <w14:ligatures w14:val="none"/>
+        </w:rPr>
+        <w:t>.</w:t>
+      </w:r>
+      <w:r>
+        <w:rPr>
+          <w:rFonts w:ascii="Consolas" w:eastAsia="Times New Roman" w:hAnsi="Consolas" w:cs="Times New Roman"/>
+          <w:color w:val="9CDCFE"/>
+          <w:kern w:val="0"/>
+          <w:sz w:val="21"/>
+          <w:szCs w:val="21"/>
+          <w:lang w:eastAsia="en-IN"/>
+          <w14:ligatures w14:val="none"/>
+        </w:rPr>
+        <w:t>instance</w:t>
       </w:r>
       <w:proofErr w:type="gramEnd"/>
       <w:r>
         <w:rPr>
-          <w:rFonts w:ascii="Times New Roman" w:hAnsi="Times New Roman" w:cs="Times New Roman"/>
+          <w:rFonts w:ascii="Consolas" w:eastAsia="Times New Roman" w:hAnsi="Consolas" w:cs="Times New Roman"/>
+          <w:color w:val="9CDCFE"/>
+          <w:kern w:val="0"/>
+          <w:sz w:val="21"/>
+          <w:szCs w:val="21"/>
+          <w:lang w:eastAsia="en-IN"/>
+          <w14:ligatures w14:val="none"/>
         </w:rPr>
         <w:t>_var</w:t>
       </w:r>
       <w:proofErr w:type="spellEnd"/>
       <w:r>
         <w:rPr>
-          <w:rFonts w:ascii="Times New Roman" w:hAnsi="Times New Roman" w:cs="Times New Roman"/>
-        </w:rPr>
-        <w:t xml:space="preserve"> = value  # Instance variable</w:t>
+          <w:rFonts w:ascii="Consolas" w:eastAsia="Times New Roman" w:hAnsi="Consolas" w:cs="Times New Roman"/>
+          <w:color w:val="CCCCCC"/>
+          <w:kern w:val="0"/>
+          <w:sz w:val="21"/>
+          <w:szCs w:val="21"/>
+          <w:lang w:eastAsia="en-IN"/>
+          <w14:ligatures w14:val="none"/>
+        </w:rPr>
+        <w:t xml:space="preserve"> </w:t>
+      </w:r>
+      <w:r>
+        <w:rPr>
+          <w:rFonts w:ascii="Consolas" w:eastAsia="Times New Roman" w:hAnsi="Consolas" w:cs="Times New Roman"/>
+          <w:color w:val="D4D4D4"/>
+          <w:kern w:val="0"/>
+          <w:sz w:val="21"/>
+          <w:szCs w:val="21"/>
+          <w:lang w:eastAsia="en-IN"/>
+          <w14:ligatures w14:val="none"/>
+        </w:rPr>
+        <w:t>=</w:t>
+      </w:r>
+      <w:r>
+        <w:rPr>
+          <w:rFonts w:ascii="Consolas" w:eastAsia="Times New Roman" w:hAnsi="Consolas" w:cs="Times New Roman"/>
+          <w:color w:val="CCCCCC"/>
+          <w:kern w:val="0"/>
+          <w:sz w:val="21"/>
+          <w:szCs w:val="21"/>
+          <w:lang w:eastAsia="en-IN"/>
+          <w14:ligatures w14:val="none"/>
+        </w:rPr>
+        <w:t xml:space="preserve"> </w:t>
+      </w:r>
+      <w:r>
+        <w:rPr>
+          <w:rFonts w:ascii="Consolas" w:eastAsia="Times New Roman" w:hAnsi="Consolas" w:cs="Times New Roman"/>
+          <w:color w:val="9CDCFE"/>
+          <w:kern w:val="0"/>
+          <w:sz w:val="21"/>
+          <w:szCs w:val="21"/>
+          <w:lang w:eastAsia="en-IN"/>
+          <w14:ligatures w14:val="none"/>
+        </w:rPr>
+        <w:t>value</w:t>
+      </w:r>
+      <w:r>
+        <w:rPr>
+          <w:rFonts w:ascii="Consolas" w:eastAsia="Times New Roman" w:hAnsi="Consolas" w:cs="Times New Roman"/>
+          <w:color w:val="CCCCCC"/>
+          <w:kern w:val="0"/>
+          <w:sz w:val="21"/>
+          <w:szCs w:val="21"/>
+          <w:lang w:eastAsia="en-IN"/>
+          <w14:ligatures w14:val="none"/>
+        </w:rPr>
+        <w:t xml:space="preserve">  </w:t>
+      </w:r>
+      <w:r>
+        <w:rPr>
+          <w:rFonts w:ascii="Consolas" w:eastAsia="Times New Roman" w:hAnsi="Consolas" w:cs="Times New Roman"/>
+          <w:color w:val="6A9955"/>
+          <w:kern w:val="0"/>
+          <w:sz w:val="21"/>
+          <w:szCs w:val="21"/>
+          <w:lang w:eastAsia="en-IN"/>
+          <w14:ligatures w14:val="none"/>
+        </w:rPr>
+        <w:t># Instance variable</w:t>
       </w:r>
     </w:p>
     <w:p>
@@ -4611,125 +6737,528 @@
     </w:p>
     <w:p>
       <w:pPr>
-        <w:rPr>
-          <w:rFonts w:ascii="Times New Roman" w:hAnsi="Times New Roman" w:cs="Times New Roman"/>
-        </w:rPr>
-      </w:pPr>
-      <w:r>
-        <w:rPr>
-          <w:rFonts w:ascii="Times New Roman" w:hAnsi="Times New Roman" w:cs="Times New Roman"/>
-        </w:rPr>
-        <w:t>python</w:t>
-      </w:r>
-    </w:p>
-    <w:p>
-      <w:pPr>
-        <w:rPr>
-          <w:rFonts w:ascii="Times New Roman" w:hAnsi="Times New Roman" w:cs="Times New Roman"/>
-        </w:rPr>
-      </w:pPr>
-      <w:proofErr w:type="spellStart"/>
-      <w:r>
-        <w:rPr>
-          <w:rFonts w:ascii="Times New Roman" w:hAnsi="Times New Roman" w:cs="Times New Roman"/>
-        </w:rPr>
-        <w:t>CopyEdit</w:t>
-      </w:r>
-      <w:proofErr w:type="spellEnd"/>
-    </w:p>
-    <w:p>
-      <w:pPr>
-        <w:rPr>
-          <w:rFonts w:ascii="Times New Roman" w:hAnsi="Times New Roman" w:cs="Times New Roman"/>
-        </w:rPr>
-      </w:pPr>
-      <w:r>
-        <w:rPr>
-          <w:rFonts w:ascii="Times New Roman" w:hAnsi="Times New Roman" w:cs="Times New Roman"/>
-        </w:rPr>
-        <w:t>class Utility:</w:t>
-      </w:r>
-    </w:p>
-    <w:p>
-      <w:pPr>
-        <w:rPr>
-          <w:rFonts w:ascii="Times New Roman" w:hAnsi="Times New Roman" w:cs="Times New Roman"/>
-        </w:rPr>
-      </w:pPr>
-      <w:r>
-        <w:rPr>
-          <w:rFonts w:ascii="Times New Roman" w:hAnsi="Times New Roman" w:cs="Times New Roman"/>
-        </w:rPr>
-        <w:t xml:space="preserve">    @staticmethod</w:t>
-      </w:r>
-    </w:p>
-    <w:p>
-      <w:pPr>
-        <w:rPr>
-          <w:rFonts w:ascii="Times New Roman" w:hAnsi="Times New Roman" w:cs="Times New Roman"/>
-        </w:rPr>
-      </w:pPr>
-      <w:r>
-        <w:rPr>
-          <w:rFonts w:ascii="Times New Roman" w:hAnsi="Times New Roman" w:cs="Times New Roman"/>
-        </w:rPr>
-        <w:t xml:space="preserve">    def </w:t>
+        <w:pStyle w:val="ListParagraph"/>
+        <w:numPr>
+          <w:ilvl w:val="0"/>
+          <w:numId w:val="8"/>
+        </w:numPr>
+        <w:shd w:val="clear" w:color="auto" w:fill="1F1F1F"/>
+        <w:spacing w:after="0" w:line="285" w:lineRule="atLeast"/>
+        <w:rPr>
+          <w:rFonts w:ascii="Consolas" w:eastAsia="Times New Roman" w:hAnsi="Consolas" w:cs="Times New Roman"/>
+          <w:color w:val="CCCCCC"/>
+          <w:kern w:val="0"/>
+          <w:sz w:val="21"/>
+          <w:szCs w:val="21"/>
+          <w:lang w:eastAsia="en-IN"/>
+          <w14:ligatures w14:val="none"/>
+        </w:rPr>
+      </w:pPr>
+      <w:r>
+        <w:rPr>
+          <w:rFonts w:ascii="Consolas" w:eastAsia="Times New Roman" w:hAnsi="Consolas" w:cs="Times New Roman"/>
+          <w:color w:val="569CD6"/>
+          <w:kern w:val="0"/>
+          <w:sz w:val="21"/>
+          <w:szCs w:val="21"/>
+          <w:lang w:eastAsia="en-IN"/>
+          <w14:ligatures w14:val="none"/>
+        </w:rPr>
+        <w:t>class</w:t>
+      </w:r>
+      <w:r>
+        <w:rPr>
+          <w:rFonts w:ascii="Consolas" w:eastAsia="Times New Roman" w:hAnsi="Consolas" w:cs="Times New Roman"/>
+          <w:color w:val="CCCCCC"/>
+          <w:kern w:val="0"/>
+          <w:sz w:val="21"/>
+          <w:szCs w:val="21"/>
+          <w:lang w:eastAsia="en-IN"/>
+          <w14:ligatures w14:val="none"/>
+        </w:rPr>
+        <w:t xml:space="preserve"> </w:t>
+      </w:r>
+      <w:r>
+        <w:rPr>
+          <w:rFonts w:ascii="Consolas" w:eastAsia="Times New Roman" w:hAnsi="Consolas" w:cs="Times New Roman"/>
+          <w:color w:val="4EC9B0"/>
+          <w:kern w:val="0"/>
+          <w:sz w:val="21"/>
+          <w:szCs w:val="21"/>
+          <w:lang w:eastAsia="en-IN"/>
+          <w14:ligatures w14:val="none"/>
+        </w:rPr>
+        <w:t>Utility</w:t>
+      </w:r>
+      <w:r>
+        <w:rPr>
+          <w:rFonts w:ascii="Consolas" w:eastAsia="Times New Roman" w:hAnsi="Consolas" w:cs="Times New Roman"/>
+          <w:color w:val="CCCCCC"/>
+          <w:kern w:val="0"/>
+          <w:sz w:val="21"/>
+          <w:szCs w:val="21"/>
+          <w:lang w:eastAsia="en-IN"/>
+          <w14:ligatures w14:val="none"/>
+        </w:rPr>
+        <w:t>:</w:t>
+      </w:r>
+    </w:p>
+    <w:p>
+      <w:pPr>
+        <w:pStyle w:val="ListParagraph"/>
+        <w:numPr>
+          <w:ilvl w:val="0"/>
+          <w:numId w:val="8"/>
+        </w:numPr>
+        <w:shd w:val="clear" w:color="auto" w:fill="1F1F1F"/>
+        <w:spacing w:after="0" w:line="285" w:lineRule="atLeast"/>
+        <w:rPr>
+          <w:rFonts w:ascii="Consolas" w:eastAsia="Times New Roman" w:hAnsi="Consolas" w:cs="Times New Roman"/>
+          <w:color w:val="CCCCCC"/>
+          <w:kern w:val="0"/>
+          <w:sz w:val="21"/>
+          <w:szCs w:val="21"/>
+          <w:lang w:eastAsia="en-IN"/>
+          <w14:ligatures w14:val="none"/>
+        </w:rPr>
+      </w:pPr>
+      <w:r>
+        <w:rPr>
+          <w:rFonts w:ascii="Consolas" w:eastAsia="Times New Roman" w:hAnsi="Consolas" w:cs="Times New Roman"/>
+          <w:color w:val="CCCCCC"/>
+          <w:kern w:val="0"/>
+          <w:sz w:val="21"/>
+          <w:szCs w:val="21"/>
+          <w:lang w:eastAsia="en-IN"/>
+          <w14:ligatures w14:val="none"/>
+        </w:rPr>
+        <w:t xml:space="preserve">    </w:t>
+      </w:r>
+      <w:r>
+        <w:rPr>
+          <w:rFonts w:ascii="Consolas" w:eastAsia="Times New Roman" w:hAnsi="Consolas" w:cs="Times New Roman"/>
+          <w:color w:val="DCDCAA"/>
+          <w:kern w:val="0"/>
+          <w:sz w:val="21"/>
+          <w:szCs w:val="21"/>
+          <w:lang w:eastAsia="en-IN"/>
+          <w14:ligatures w14:val="none"/>
+        </w:rPr>
+        <w:t>@</w:t>
+      </w:r>
+      <w:r>
+        <w:rPr>
+          <w:rFonts w:ascii="Consolas" w:eastAsia="Times New Roman" w:hAnsi="Consolas" w:cs="Times New Roman"/>
+          <w:color w:val="4EC9B0"/>
+          <w:kern w:val="0"/>
+          <w:sz w:val="21"/>
+          <w:szCs w:val="21"/>
+          <w:lang w:eastAsia="en-IN"/>
+          <w14:ligatures w14:val="none"/>
+        </w:rPr>
+        <w:t>staticmethod</w:t>
+      </w:r>
+    </w:p>
+    <w:p>
+      <w:pPr>
+        <w:pStyle w:val="ListParagraph"/>
+        <w:numPr>
+          <w:ilvl w:val="0"/>
+          <w:numId w:val="8"/>
+        </w:numPr>
+        <w:shd w:val="clear" w:color="auto" w:fill="1F1F1F"/>
+        <w:spacing w:after="0" w:line="285" w:lineRule="atLeast"/>
+        <w:rPr>
+          <w:rFonts w:ascii="Consolas" w:eastAsia="Times New Roman" w:hAnsi="Consolas" w:cs="Times New Roman"/>
+          <w:color w:val="CCCCCC"/>
+          <w:kern w:val="0"/>
+          <w:sz w:val="21"/>
+          <w:szCs w:val="21"/>
+          <w:lang w:eastAsia="en-IN"/>
+          <w14:ligatures w14:val="none"/>
+        </w:rPr>
+      </w:pPr>
+      <w:r>
+        <w:rPr>
+          <w:rFonts w:ascii="Consolas" w:eastAsia="Times New Roman" w:hAnsi="Consolas" w:cs="Times New Roman"/>
+          <w:color w:val="CCCCCC"/>
+          <w:kern w:val="0"/>
+          <w:sz w:val="21"/>
+          <w:szCs w:val="21"/>
+          <w:lang w:eastAsia="en-IN"/>
+          <w14:ligatures w14:val="none"/>
+        </w:rPr>
+        <w:t xml:space="preserve">    </w:t>
+      </w:r>
+      <w:r>
+        <w:rPr>
+          <w:rFonts w:ascii="Consolas" w:eastAsia="Times New Roman" w:hAnsi="Consolas" w:cs="Times New Roman"/>
+          <w:color w:val="569CD6"/>
+          <w:kern w:val="0"/>
+          <w:sz w:val="21"/>
+          <w:szCs w:val="21"/>
+          <w:lang w:eastAsia="en-IN"/>
+          <w14:ligatures w14:val="none"/>
+        </w:rPr>
+        <w:t>def</w:t>
+      </w:r>
+      <w:r>
+        <w:rPr>
+          <w:rFonts w:ascii="Consolas" w:eastAsia="Times New Roman" w:hAnsi="Consolas" w:cs="Times New Roman"/>
+          <w:color w:val="CCCCCC"/>
+          <w:kern w:val="0"/>
+          <w:sz w:val="21"/>
+          <w:szCs w:val="21"/>
+          <w:lang w:eastAsia="en-IN"/>
+          <w14:ligatures w14:val="none"/>
+        </w:rPr>
+        <w:t xml:space="preserve"> </w:t>
       </w:r>
       <w:proofErr w:type="gramStart"/>
       <w:r>
         <w:rPr>
-          <w:rFonts w:ascii="Times New Roman" w:hAnsi="Times New Roman" w:cs="Times New Roman"/>
-        </w:rPr>
-        <w:t>add(</w:t>
+          <w:rFonts w:ascii="Consolas" w:eastAsia="Times New Roman" w:hAnsi="Consolas" w:cs="Times New Roman"/>
+          <w:color w:val="DCDCAA"/>
+          <w:kern w:val="0"/>
+          <w:sz w:val="21"/>
+          <w:szCs w:val="21"/>
+          <w:lang w:eastAsia="en-IN"/>
+          <w14:ligatures w14:val="none"/>
+        </w:rPr>
+        <w:t>add</w:t>
+      </w:r>
+      <w:r>
+        <w:rPr>
+          <w:rFonts w:ascii="Consolas" w:eastAsia="Times New Roman" w:hAnsi="Consolas" w:cs="Times New Roman"/>
+          <w:color w:val="CCCCCC"/>
+          <w:kern w:val="0"/>
+          <w:sz w:val="21"/>
+          <w:szCs w:val="21"/>
+          <w:lang w:eastAsia="en-IN"/>
+          <w14:ligatures w14:val="none"/>
+        </w:rPr>
+        <w:t>(</w:t>
       </w:r>
       <w:proofErr w:type="gramEnd"/>
       <w:r>
         <w:rPr>
-          <w:rFonts w:ascii="Times New Roman" w:hAnsi="Times New Roman" w:cs="Times New Roman"/>
-        </w:rPr>
-        <w:t>a, b):</w:t>
-      </w:r>
-    </w:p>
-    <w:p>
-      <w:pPr>
-        <w:rPr>
-          <w:rFonts w:ascii="Times New Roman" w:hAnsi="Times New Roman" w:cs="Times New Roman"/>
-        </w:rPr>
-      </w:pPr>
-      <w:r>
-        <w:rPr>
-          <w:rFonts w:ascii="Times New Roman" w:hAnsi="Times New Roman" w:cs="Times New Roman"/>
-        </w:rPr>
-        <w:t xml:space="preserve">        return a + b</w:t>
-      </w:r>
-    </w:p>
-    <w:p>
-      <w:pPr>
-        <w:rPr>
-          <w:rFonts w:ascii="Times New Roman" w:hAnsi="Times New Roman" w:cs="Times New Roman"/>
+          <w:rFonts w:ascii="Consolas" w:eastAsia="Times New Roman" w:hAnsi="Consolas" w:cs="Times New Roman"/>
+          <w:color w:val="9CDCFE"/>
+          <w:kern w:val="0"/>
+          <w:sz w:val="21"/>
+          <w:szCs w:val="21"/>
+          <w:lang w:eastAsia="en-IN"/>
+          <w14:ligatures w14:val="none"/>
+        </w:rPr>
+        <w:t>a</w:t>
+      </w:r>
+      <w:r>
+        <w:rPr>
+          <w:rFonts w:ascii="Consolas" w:eastAsia="Times New Roman" w:hAnsi="Consolas" w:cs="Times New Roman"/>
+          <w:color w:val="CCCCCC"/>
+          <w:kern w:val="0"/>
+          <w:sz w:val="21"/>
+          <w:szCs w:val="21"/>
+          <w:lang w:eastAsia="en-IN"/>
+          <w14:ligatures w14:val="none"/>
+        </w:rPr>
+        <w:t xml:space="preserve">, </w:t>
+      </w:r>
+      <w:r>
+        <w:rPr>
+          <w:rFonts w:ascii="Consolas" w:eastAsia="Times New Roman" w:hAnsi="Consolas" w:cs="Times New Roman"/>
+          <w:color w:val="9CDCFE"/>
+          <w:kern w:val="0"/>
+          <w:sz w:val="21"/>
+          <w:szCs w:val="21"/>
+          <w:lang w:eastAsia="en-IN"/>
+          <w14:ligatures w14:val="none"/>
+        </w:rPr>
+        <w:t>b</w:t>
+      </w:r>
+      <w:r>
+        <w:rPr>
+          <w:rFonts w:ascii="Consolas" w:eastAsia="Times New Roman" w:hAnsi="Consolas" w:cs="Times New Roman"/>
+          <w:color w:val="CCCCCC"/>
+          <w:kern w:val="0"/>
+          <w:sz w:val="21"/>
+          <w:szCs w:val="21"/>
+          <w:lang w:eastAsia="en-IN"/>
+          <w14:ligatures w14:val="none"/>
+        </w:rPr>
+        <w:t>):</w:t>
+      </w:r>
+    </w:p>
+    <w:p>
+      <w:pPr>
+        <w:pStyle w:val="ListParagraph"/>
+        <w:numPr>
+          <w:ilvl w:val="0"/>
+          <w:numId w:val="8"/>
+        </w:numPr>
+        <w:shd w:val="clear" w:color="auto" w:fill="1F1F1F"/>
+        <w:spacing w:after="0" w:line="285" w:lineRule="atLeast"/>
+        <w:rPr>
+          <w:rFonts w:ascii="Consolas" w:eastAsia="Times New Roman" w:hAnsi="Consolas" w:cs="Times New Roman"/>
+          <w:color w:val="CCCCCC"/>
+          <w:kern w:val="0"/>
+          <w:sz w:val="21"/>
+          <w:szCs w:val="21"/>
+          <w:lang w:eastAsia="en-IN"/>
+          <w14:ligatures w14:val="none"/>
+        </w:rPr>
+      </w:pPr>
+      <w:r>
+        <w:rPr>
+          <w:rFonts w:ascii="Consolas" w:eastAsia="Times New Roman" w:hAnsi="Consolas" w:cs="Times New Roman"/>
+          <w:color w:val="CCCCCC"/>
+          <w:kern w:val="0"/>
+          <w:sz w:val="21"/>
+          <w:szCs w:val="21"/>
+          <w:lang w:eastAsia="en-IN"/>
+          <w14:ligatures w14:val="none"/>
+        </w:rPr>
+        <w:t xml:space="preserve">        </w:t>
+      </w:r>
+      <w:r>
+        <w:rPr>
+          <w:rFonts w:ascii="Consolas" w:eastAsia="Times New Roman" w:hAnsi="Consolas" w:cs="Times New Roman"/>
+          <w:color w:val="C586C0"/>
+          <w:kern w:val="0"/>
+          <w:sz w:val="21"/>
+          <w:szCs w:val="21"/>
+          <w:lang w:eastAsia="en-IN"/>
+          <w14:ligatures w14:val="none"/>
+        </w:rPr>
+        <w:t>return</w:t>
+      </w:r>
+      <w:r>
+        <w:rPr>
+          <w:rFonts w:ascii="Consolas" w:eastAsia="Times New Roman" w:hAnsi="Consolas" w:cs="Times New Roman"/>
+          <w:color w:val="CCCCCC"/>
+          <w:kern w:val="0"/>
+          <w:sz w:val="21"/>
+          <w:szCs w:val="21"/>
+          <w:lang w:eastAsia="en-IN"/>
+          <w14:ligatures w14:val="none"/>
+        </w:rPr>
+        <w:t xml:space="preserve"> </w:t>
+      </w:r>
+      <w:r>
+        <w:rPr>
+          <w:rFonts w:ascii="Consolas" w:eastAsia="Times New Roman" w:hAnsi="Consolas" w:cs="Times New Roman"/>
+          <w:color w:val="9CDCFE"/>
+          <w:kern w:val="0"/>
+          <w:sz w:val="21"/>
+          <w:szCs w:val="21"/>
+          <w:lang w:eastAsia="en-IN"/>
+          <w14:ligatures w14:val="none"/>
+        </w:rPr>
+        <w:t>a</w:t>
+      </w:r>
+      <w:r>
+        <w:rPr>
+          <w:rFonts w:ascii="Consolas" w:eastAsia="Times New Roman" w:hAnsi="Consolas" w:cs="Times New Roman"/>
+          <w:color w:val="CCCCCC"/>
+          <w:kern w:val="0"/>
+          <w:sz w:val="21"/>
+          <w:szCs w:val="21"/>
+          <w:lang w:eastAsia="en-IN"/>
+          <w14:ligatures w14:val="none"/>
+        </w:rPr>
+        <w:t xml:space="preserve"> </w:t>
+      </w:r>
+      <w:r>
+        <w:rPr>
+          <w:rFonts w:ascii="Consolas" w:eastAsia="Times New Roman" w:hAnsi="Consolas" w:cs="Times New Roman"/>
+          <w:color w:val="D4D4D4"/>
+          <w:kern w:val="0"/>
+          <w:sz w:val="21"/>
+          <w:szCs w:val="21"/>
+          <w:lang w:eastAsia="en-IN"/>
+          <w14:ligatures w14:val="none"/>
+        </w:rPr>
+        <w:t>+</w:t>
+      </w:r>
+      <w:r>
+        <w:rPr>
+          <w:rFonts w:ascii="Consolas" w:eastAsia="Times New Roman" w:hAnsi="Consolas" w:cs="Times New Roman"/>
+          <w:color w:val="CCCCCC"/>
+          <w:kern w:val="0"/>
+          <w:sz w:val="21"/>
+          <w:szCs w:val="21"/>
+          <w:lang w:eastAsia="en-IN"/>
+          <w14:ligatures w14:val="none"/>
+        </w:rPr>
+        <w:t xml:space="preserve"> </w:t>
+      </w:r>
+      <w:r>
+        <w:rPr>
+          <w:rFonts w:ascii="Consolas" w:eastAsia="Times New Roman" w:hAnsi="Consolas" w:cs="Times New Roman"/>
+          <w:color w:val="9CDCFE"/>
+          <w:kern w:val="0"/>
+          <w:sz w:val="21"/>
+          <w:szCs w:val="21"/>
+          <w:lang w:eastAsia="en-IN"/>
+          <w14:ligatures w14:val="none"/>
+        </w:rPr>
+        <w:t>b</w:t>
+      </w:r>
+    </w:p>
+    <w:p>
+      <w:pPr>
+        <w:pStyle w:val="ListParagraph"/>
+        <w:numPr>
+          <w:ilvl w:val="0"/>
+          <w:numId w:val="8"/>
+        </w:numPr>
+        <w:shd w:val="clear" w:color="auto" w:fill="1F1F1F"/>
+        <w:spacing w:after="0" w:line="285" w:lineRule="atLeast"/>
+        <w:rPr>
+          <w:rFonts w:ascii="Consolas" w:eastAsia="Times New Roman" w:hAnsi="Consolas" w:cs="Times New Roman"/>
+          <w:color w:val="CCCCCC"/>
+          <w:kern w:val="0"/>
+          <w:sz w:val="21"/>
+          <w:szCs w:val="21"/>
+          <w:lang w:eastAsia="en-IN"/>
+          <w14:ligatures w14:val="none"/>
         </w:rPr>
       </w:pPr>
       <w:proofErr w:type="gramStart"/>
       <w:r>
         <w:rPr>
-          <w:rFonts w:ascii="Times New Roman" w:hAnsi="Times New Roman" w:cs="Times New Roman"/>
-        </w:rPr>
-        <w:t>print(</w:t>
+          <w:rFonts w:ascii="Consolas" w:eastAsia="Times New Roman" w:hAnsi="Consolas" w:cs="Times New Roman"/>
+          <w:color w:val="DCDCAA"/>
+          <w:kern w:val="0"/>
+          <w:sz w:val="21"/>
+          <w:szCs w:val="21"/>
+          <w:lang w:eastAsia="en-IN"/>
+          <w14:ligatures w14:val="none"/>
+        </w:rPr>
+        <w:t>print</w:t>
+      </w:r>
+      <w:r>
+        <w:rPr>
+          <w:rFonts w:ascii="Consolas" w:eastAsia="Times New Roman" w:hAnsi="Consolas" w:cs="Times New Roman"/>
+          <w:color w:val="CCCCCC"/>
+          <w:kern w:val="0"/>
+          <w:sz w:val="21"/>
+          <w:szCs w:val="21"/>
+          <w:lang w:eastAsia="en-IN"/>
+          <w14:ligatures w14:val="none"/>
+        </w:rPr>
+        <w:t>(</w:t>
       </w:r>
       <w:proofErr w:type="spellStart"/>
       <w:proofErr w:type="gramEnd"/>
       <w:r>
         <w:rPr>
-          <w:rFonts w:ascii="Times New Roman" w:hAnsi="Times New Roman" w:cs="Times New Roman"/>
-        </w:rPr>
-        <w:t>Utility.add</w:t>
+          <w:rFonts w:ascii="Consolas" w:eastAsia="Times New Roman" w:hAnsi="Consolas" w:cs="Times New Roman"/>
+          <w:color w:val="4EC9B0"/>
+          <w:kern w:val="0"/>
+          <w:sz w:val="21"/>
+          <w:szCs w:val="21"/>
+          <w:lang w:eastAsia="en-IN"/>
+          <w14:ligatures w14:val="none"/>
+        </w:rPr>
+        <w:t>Utility</w:t>
+      </w:r>
+      <w:r>
+        <w:rPr>
+          <w:rFonts w:ascii="Consolas" w:eastAsia="Times New Roman" w:hAnsi="Consolas" w:cs="Times New Roman"/>
+          <w:color w:val="CCCCCC"/>
+          <w:kern w:val="0"/>
+          <w:sz w:val="21"/>
+          <w:szCs w:val="21"/>
+          <w:lang w:eastAsia="en-IN"/>
+          <w14:ligatures w14:val="none"/>
+        </w:rPr>
+        <w:t>.</w:t>
+      </w:r>
+      <w:r>
+        <w:rPr>
+          <w:rFonts w:ascii="Consolas" w:eastAsia="Times New Roman" w:hAnsi="Consolas" w:cs="Times New Roman"/>
+          <w:color w:val="DCDCAA"/>
+          <w:kern w:val="0"/>
+          <w:sz w:val="21"/>
+          <w:szCs w:val="21"/>
+          <w:lang w:eastAsia="en-IN"/>
+          <w14:ligatures w14:val="none"/>
+        </w:rPr>
+        <w:t>add</w:t>
       </w:r>
       <w:proofErr w:type="spellEnd"/>
       <w:r>
         <w:rPr>
-          <w:rFonts w:ascii="Times New Roman" w:hAnsi="Times New Roman" w:cs="Times New Roman"/>
-        </w:rPr>
-        <w:t>(5, 3))  # Output: 8</w:t>
+          <w:rFonts w:ascii="Consolas" w:eastAsia="Times New Roman" w:hAnsi="Consolas" w:cs="Times New Roman"/>
+          <w:color w:val="CCCCCC"/>
+          <w:kern w:val="0"/>
+          <w:sz w:val="21"/>
+          <w:szCs w:val="21"/>
+          <w:lang w:eastAsia="en-IN"/>
+          <w14:ligatures w14:val="none"/>
+        </w:rPr>
+        <w:t>(</w:t>
+      </w:r>
+      <w:r>
+        <w:rPr>
+          <w:rFonts w:ascii="Consolas" w:eastAsia="Times New Roman" w:hAnsi="Consolas" w:cs="Times New Roman"/>
+          <w:color w:val="B5CEA8"/>
+          <w:kern w:val="0"/>
+          <w:sz w:val="21"/>
+          <w:szCs w:val="21"/>
+          <w:lang w:eastAsia="en-IN"/>
+          <w14:ligatures w14:val="none"/>
+        </w:rPr>
+        <w:t>5</w:t>
+      </w:r>
+      <w:r>
+        <w:rPr>
+          <w:rFonts w:ascii="Consolas" w:eastAsia="Times New Roman" w:hAnsi="Consolas" w:cs="Times New Roman"/>
+          <w:color w:val="CCCCCC"/>
+          <w:kern w:val="0"/>
+          <w:sz w:val="21"/>
+          <w:szCs w:val="21"/>
+          <w:lang w:eastAsia="en-IN"/>
+          <w14:ligatures w14:val="none"/>
+        </w:rPr>
+        <w:t xml:space="preserve">, </w:t>
+      </w:r>
+      <w:r>
+        <w:rPr>
+          <w:rFonts w:ascii="Consolas" w:eastAsia="Times New Roman" w:hAnsi="Consolas" w:cs="Times New Roman"/>
+          <w:color w:val="B5CEA8"/>
+          <w:kern w:val="0"/>
+          <w:sz w:val="21"/>
+          <w:szCs w:val="21"/>
+          <w:lang w:eastAsia="en-IN"/>
+          <w14:ligatures w14:val="none"/>
+        </w:rPr>
+        <w:t>3</w:t>
+      </w:r>
+      <w:r>
+        <w:rPr>
+          <w:rFonts w:ascii="Consolas" w:eastAsia="Times New Roman" w:hAnsi="Consolas" w:cs="Times New Roman"/>
+          <w:color w:val="CCCCCC"/>
+          <w:kern w:val="0"/>
+          <w:sz w:val="21"/>
+          <w:szCs w:val="21"/>
+          <w:lang w:eastAsia="en-IN"/>
+          <w14:ligatures w14:val="none"/>
+        </w:rPr>
+        <w:t>))  </w:t>
+      </w:r>
+      <w:r>
+        <w:rPr>
+          <w:rFonts w:ascii="Consolas" w:eastAsia="Times New Roman" w:hAnsi="Consolas" w:cs="Times New Roman"/>
+          <w:color w:val="6A9955"/>
+          <w:kern w:val="0"/>
+          <w:sz w:val="21"/>
+          <w:szCs w:val="21"/>
+          <w:lang w:eastAsia="en-IN"/>
+          <w14:ligatures w14:val="none"/>
+        </w:rPr>
+        <w:t># Output: 8</w:t>
       </w:r>
     </w:p>
     <w:p>
@@ -4774,182 +7303,582 @@
     </w:p>
     <w:p>
       <w:pPr>
-        <w:rPr>
-          <w:rFonts w:ascii="Times New Roman" w:hAnsi="Times New Roman" w:cs="Times New Roman"/>
-        </w:rPr>
-      </w:pPr>
-      <w:r>
-        <w:rPr>
-          <w:rFonts w:ascii="Times New Roman" w:hAnsi="Times New Roman" w:cs="Times New Roman"/>
-        </w:rPr>
-        <w:t>python</w:t>
-      </w:r>
-    </w:p>
-    <w:p>
-      <w:pPr>
-        <w:rPr>
-          <w:rFonts w:ascii="Times New Roman" w:hAnsi="Times New Roman" w:cs="Times New Roman"/>
-        </w:rPr>
-      </w:pPr>
+        <w:pStyle w:val="ListParagraph"/>
+        <w:numPr>
+          <w:ilvl w:val="0"/>
+          <w:numId w:val="8"/>
+        </w:numPr>
+        <w:shd w:val="clear" w:color="auto" w:fill="1F1F1F"/>
+        <w:spacing w:after="0" w:line="285" w:lineRule="atLeast"/>
+        <w:rPr>
+          <w:rFonts w:ascii="Consolas" w:eastAsia="Times New Roman" w:hAnsi="Consolas" w:cs="Times New Roman"/>
+          <w:color w:val="CCCCCC"/>
+          <w:kern w:val="0"/>
+          <w:sz w:val="21"/>
+          <w:szCs w:val="21"/>
+          <w:lang w:eastAsia="en-IN"/>
+          <w14:ligatures w14:val="none"/>
+        </w:rPr>
+      </w:pPr>
+      <w:r>
+        <w:rPr>
+          <w:rFonts w:ascii="Consolas" w:eastAsia="Times New Roman" w:hAnsi="Consolas" w:cs="Times New Roman"/>
+          <w:color w:val="569CD6"/>
+          <w:kern w:val="0"/>
+          <w:sz w:val="21"/>
+          <w:szCs w:val="21"/>
+          <w:lang w:eastAsia="en-IN"/>
+          <w14:ligatures w14:val="none"/>
+        </w:rPr>
+        <w:t>class</w:t>
+      </w:r>
+      <w:r>
+        <w:rPr>
+          <w:rFonts w:ascii="Consolas" w:eastAsia="Times New Roman" w:hAnsi="Consolas" w:cs="Times New Roman"/>
+          <w:color w:val="CCCCCC"/>
+          <w:kern w:val="0"/>
+          <w:sz w:val="21"/>
+          <w:szCs w:val="21"/>
+          <w:lang w:eastAsia="en-IN"/>
+          <w14:ligatures w14:val="none"/>
+        </w:rPr>
+        <w:t xml:space="preserve"> </w:t>
+      </w:r>
+      <w:r>
+        <w:rPr>
+          <w:rFonts w:ascii="Consolas" w:eastAsia="Times New Roman" w:hAnsi="Consolas" w:cs="Times New Roman"/>
+          <w:color w:val="4EC9B0"/>
+          <w:kern w:val="0"/>
+          <w:sz w:val="21"/>
+          <w:szCs w:val="21"/>
+          <w:lang w:eastAsia="en-IN"/>
+          <w14:ligatures w14:val="none"/>
+        </w:rPr>
+        <w:t>Person</w:t>
+      </w:r>
+      <w:r>
+        <w:rPr>
+          <w:rFonts w:ascii="Consolas" w:eastAsia="Times New Roman" w:hAnsi="Consolas" w:cs="Times New Roman"/>
+          <w:color w:val="CCCCCC"/>
+          <w:kern w:val="0"/>
+          <w:sz w:val="21"/>
+          <w:szCs w:val="21"/>
+          <w:lang w:eastAsia="en-IN"/>
+          <w14:ligatures w14:val="none"/>
+        </w:rPr>
+        <w:t>:</w:t>
+      </w:r>
+    </w:p>
+    <w:p>
+      <w:pPr>
+        <w:pStyle w:val="ListParagraph"/>
+        <w:numPr>
+          <w:ilvl w:val="0"/>
+          <w:numId w:val="8"/>
+        </w:numPr>
+        <w:shd w:val="clear" w:color="auto" w:fill="1F1F1F"/>
+        <w:spacing w:after="0" w:line="285" w:lineRule="atLeast"/>
+        <w:rPr>
+          <w:rFonts w:ascii="Consolas" w:eastAsia="Times New Roman" w:hAnsi="Consolas" w:cs="Times New Roman"/>
+          <w:color w:val="CCCCCC"/>
+          <w:kern w:val="0"/>
+          <w:sz w:val="21"/>
+          <w:szCs w:val="21"/>
+          <w:lang w:eastAsia="en-IN"/>
+          <w14:ligatures w14:val="none"/>
+        </w:rPr>
+      </w:pPr>
+      <w:r>
+        <w:rPr>
+          <w:rFonts w:ascii="Consolas" w:eastAsia="Times New Roman" w:hAnsi="Consolas" w:cs="Times New Roman"/>
+          <w:color w:val="CCCCCC"/>
+          <w:kern w:val="0"/>
+          <w:sz w:val="21"/>
+          <w:szCs w:val="21"/>
+          <w:lang w:eastAsia="en-IN"/>
+          <w14:ligatures w14:val="none"/>
+        </w:rPr>
+        <w:t xml:space="preserve">    </w:t>
+      </w:r>
+      <w:r>
+        <w:rPr>
+          <w:rFonts w:ascii="Consolas" w:eastAsia="Times New Roman" w:hAnsi="Consolas" w:cs="Times New Roman"/>
+          <w:color w:val="9CDCFE"/>
+          <w:kern w:val="0"/>
+          <w:sz w:val="21"/>
+          <w:szCs w:val="21"/>
+          <w:lang w:eastAsia="en-IN"/>
+          <w14:ligatures w14:val="none"/>
+        </w:rPr>
+        <w:t>species</w:t>
+      </w:r>
+      <w:r>
+        <w:rPr>
+          <w:rFonts w:ascii="Consolas" w:eastAsia="Times New Roman" w:hAnsi="Consolas" w:cs="Times New Roman"/>
+          <w:color w:val="CCCCCC"/>
+          <w:kern w:val="0"/>
+          <w:sz w:val="21"/>
+          <w:szCs w:val="21"/>
+          <w:lang w:eastAsia="en-IN"/>
+          <w14:ligatures w14:val="none"/>
+        </w:rPr>
+        <w:t xml:space="preserve"> </w:t>
+      </w:r>
+      <w:r>
+        <w:rPr>
+          <w:rFonts w:ascii="Consolas" w:eastAsia="Times New Roman" w:hAnsi="Consolas" w:cs="Times New Roman"/>
+          <w:color w:val="D4D4D4"/>
+          <w:kern w:val="0"/>
+          <w:sz w:val="21"/>
+          <w:szCs w:val="21"/>
+          <w:lang w:eastAsia="en-IN"/>
+          <w14:ligatures w14:val="none"/>
+        </w:rPr>
+        <w:t>=</w:t>
+      </w:r>
+      <w:r>
+        <w:rPr>
+          <w:rFonts w:ascii="Consolas" w:eastAsia="Times New Roman" w:hAnsi="Consolas" w:cs="Times New Roman"/>
+          <w:color w:val="CCCCCC"/>
+          <w:kern w:val="0"/>
+          <w:sz w:val="21"/>
+          <w:szCs w:val="21"/>
+          <w:lang w:eastAsia="en-IN"/>
+          <w14:ligatures w14:val="none"/>
+        </w:rPr>
+        <w:t xml:space="preserve"> </w:t>
+      </w:r>
+      <w:r>
+        <w:rPr>
+          <w:rFonts w:ascii="Consolas" w:eastAsia="Times New Roman" w:hAnsi="Consolas" w:cs="Times New Roman"/>
+          <w:color w:val="CE9178"/>
+          <w:kern w:val="0"/>
+          <w:sz w:val="21"/>
+          <w:szCs w:val="21"/>
+          <w:lang w:eastAsia="en-IN"/>
+          <w14:ligatures w14:val="none"/>
+        </w:rPr>
+        <w:t>"Homo sapiens"</w:t>
+      </w:r>
+    </w:p>
+    <w:p>
+      <w:pPr>
+        <w:pStyle w:val="ListParagraph"/>
+        <w:numPr>
+          <w:ilvl w:val="0"/>
+          <w:numId w:val="8"/>
+        </w:numPr>
+        <w:shd w:val="clear" w:color="auto" w:fill="1F1F1F"/>
+        <w:spacing w:after="0" w:line="285" w:lineRule="atLeast"/>
+        <w:rPr>
+          <w:rFonts w:ascii="Consolas" w:eastAsia="Times New Roman" w:hAnsi="Consolas" w:cs="Times New Roman"/>
+          <w:color w:val="CCCCCC"/>
+          <w:kern w:val="0"/>
+          <w:sz w:val="21"/>
+          <w:szCs w:val="21"/>
+          <w:lang w:eastAsia="en-IN"/>
+          <w14:ligatures w14:val="none"/>
+        </w:rPr>
+      </w:pPr>
+      <w:r>
+        <w:rPr>
+          <w:rFonts w:ascii="Consolas" w:eastAsia="Times New Roman" w:hAnsi="Consolas" w:cs="Times New Roman"/>
+          <w:color w:val="CCCCCC"/>
+          <w:kern w:val="0"/>
+          <w:sz w:val="21"/>
+          <w:szCs w:val="21"/>
+          <w:lang w:eastAsia="en-IN"/>
+          <w14:ligatures w14:val="none"/>
+        </w:rPr>
+        <w:t xml:space="preserve">    </w:t>
+      </w:r>
+    </w:p>
+    <w:p>
+      <w:pPr>
+        <w:pStyle w:val="ListParagraph"/>
+        <w:numPr>
+          <w:ilvl w:val="0"/>
+          <w:numId w:val="8"/>
+        </w:numPr>
+        <w:shd w:val="clear" w:color="auto" w:fill="1F1F1F"/>
+        <w:spacing w:after="0" w:line="285" w:lineRule="atLeast"/>
+        <w:rPr>
+          <w:rFonts w:ascii="Consolas" w:eastAsia="Times New Roman" w:hAnsi="Consolas" w:cs="Times New Roman"/>
+          <w:color w:val="CCCCCC"/>
+          <w:kern w:val="0"/>
+          <w:sz w:val="21"/>
+          <w:szCs w:val="21"/>
+          <w:lang w:eastAsia="en-IN"/>
+          <w14:ligatures w14:val="none"/>
+        </w:rPr>
+      </w:pPr>
+      <w:r>
+        <w:rPr>
+          <w:rFonts w:ascii="Consolas" w:eastAsia="Times New Roman" w:hAnsi="Consolas" w:cs="Times New Roman"/>
+          <w:color w:val="CCCCCC"/>
+          <w:kern w:val="0"/>
+          <w:sz w:val="21"/>
+          <w:szCs w:val="21"/>
+          <w:lang w:eastAsia="en-IN"/>
+          <w14:ligatures w14:val="none"/>
+        </w:rPr>
+        <w:t xml:space="preserve">    </w:t>
+      </w:r>
+      <w:r>
+        <w:rPr>
+          <w:rFonts w:ascii="Consolas" w:eastAsia="Times New Roman" w:hAnsi="Consolas" w:cs="Times New Roman"/>
+          <w:color w:val="DCDCAA"/>
+          <w:kern w:val="0"/>
+          <w:sz w:val="21"/>
+          <w:szCs w:val="21"/>
+          <w:lang w:eastAsia="en-IN"/>
+          <w14:ligatures w14:val="none"/>
+        </w:rPr>
+        <w:t>@</w:t>
+      </w:r>
+      <w:r>
+        <w:rPr>
+          <w:rFonts w:ascii="Consolas" w:eastAsia="Times New Roman" w:hAnsi="Consolas" w:cs="Times New Roman"/>
+          <w:color w:val="4EC9B0"/>
+          <w:kern w:val="0"/>
+          <w:sz w:val="21"/>
+          <w:szCs w:val="21"/>
+          <w:lang w:eastAsia="en-IN"/>
+          <w14:ligatures w14:val="none"/>
+        </w:rPr>
+        <w:t>classmethod</w:t>
+      </w:r>
+    </w:p>
+    <w:p>
+      <w:pPr>
+        <w:pStyle w:val="ListParagraph"/>
+        <w:numPr>
+          <w:ilvl w:val="0"/>
+          <w:numId w:val="8"/>
+        </w:numPr>
+        <w:shd w:val="clear" w:color="auto" w:fill="1F1F1F"/>
+        <w:spacing w:after="0" w:line="285" w:lineRule="atLeast"/>
+        <w:rPr>
+          <w:rFonts w:ascii="Consolas" w:eastAsia="Times New Roman" w:hAnsi="Consolas" w:cs="Times New Roman"/>
+          <w:color w:val="CCCCCC"/>
+          <w:kern w:val="0"/>
+          <w:sz w:val="21"/>
+          <w:szCs w:val="21"/>
+          <w:lang w:eastAsia="en-IN"/>
+          <w14:ligatures w14:val="none"/>
+        </w:rPr>
+      </w:pPr>
+      <w:r>
+        <w:rPr>
+          <w:rFonts w:ascii="Consolas" w:eastAsia="Times New Roman" w:hAnsi="Consolas" w:cs="Times New Roman"/>
+          <w:color w:val="CCCCCC"/>
+          <w:kern w:val="0"/>
+          <w:sz w:val="21"/>
+          <w:szCs w:val="21"/>
+          <w:lang w:eastAsia="en-IN"/>
+          <w14:ligatures w14:val="none"/>
+        </w:rPr>
+        <w:t xml:space="preserve">    </w:t>
+      </w:r>
+      <w:r>
+        <w:rPr>
+          <w:rFonts w:ascii="Consolas" w:eastAsia="Times New Roman" w:hAnsi="Consolas" w:cs="Times New Roman"/>
+          <w:color w:val="569CD6"/>
+          <w:kern w:val="0"/>
+          <w:sz w:val="21"/>
+          <w:szCs w:val="21"/>
+          <w:lang w:eastAsia="en-IN"/>
+          <w14:ligatures w14:val="none"/>
+        </w:rPr>
+        <w:t>def</w:t>
+      </w:r>
+      <w:r>
+        <w:rPr>
+          <w:rFonts w:ascii="Consolas" w:eastAsia="Times New Roman" w:hAnsi="Consolas" w:cs="Times New Roman"/>
+          <w:color w:val="CCCCCC"/>
+          <w:kern w:val="0"/>
+          <w:sz w:val="21"/>
+          <w:szCs w:val="21"/>
+          <w:lang w:eastAsia="en-IN"/>
+          <w14:ligatures w14:val="none"/>
+        </w:rPr>
+        <w:t xml:space="preserve"> </w:t>
+      </w:r>
       <w:proofErr w:type="spellStart"/>
       <w:r>
         <w:rPr>
-          <w:rFonts w:ascii="Times New Roman" w:hAnsi="Times New Roman" w:cs="Times New Roman"/>
-        </w:rPr>
-        <w:t>CopyEdit</w:t>
+          <w:rFonts w:ascii="Consolas" w:eastAsia="Times New Roman" w:hAnsi="Consolas" w:cs="Times New Roman"/>
+          <w:color w:val="DCDCAA"/>
+          <w:kern w:val="0"/>
+          <w:sz w:val="21"/>
+          <w:szCs w:val="21"/>
+          <w:lang w:eastAsia="en-IN"/>
+          <w14:ligatures w14:val="none"/>
+        </w:rPr>
+        <w:t>get_species</w:t>
       </w:r>
       <w:proofErr w:type="spellEnd"/>
-    </w:p>
-    <w:p>
-      <w:pPr>
-        <w:rPr>
-          <w:rFonts w:ascii="Times New Roman" w:hAnsi="Times New Roman" w:cs="Times New Roman"/>
-        </w:rPr>
-      </w:pPr>
-      <w:r>
-        <w:rPr>
-          <w:rFonts w:ascii="Times New Roman" w:hAnsi="Times New Roman" w:cs="Times New Roman"/>
-        </w:rPr>
-        <w:t>class Person:</w:t>
-      </w:r>
-    </w:p>
-    <w:p>
-      <w:pPr>
-        <w:rPr>
-          <w:rFonts w:ascii="Times New Roman" w:hAnsi="Times New Roman" w:cs="Times New Roman"/>
-        </w:rPr>
-      </w:pPr>
-      <w:r>
-        <w:rPr>
-          <w:rFonts w:ascii="Times New Roman" w:hAnsi="Times New Roman" w:cs="Times New Roman"/>
-        </w:rPr>
-        <w:t xml:space="preserve">    species = "Homo sapiens"</w:t>
-      </w:r>
-    </w:p>
-    <w:p>
-      <w:pPr>
-        <w:rPr>
-          <w:rFonts w:ascii="Times New Roman" w:hAnsi="Times New Roman" w:cs="Times New Roman"/>
-        </w:rPr>
-      </w:pPr>
-      <w:r>
-        <w:rPr>
-          <w:rFonts w:ascii="Times New Roman" w:hAnsi="Times New Roman" w:cs="Times New Roman"/>
-        </w:rPr>
-        <w:t xml:space="preserve">    </w:t>
-      </w:r>
-    </w:p>
-    <w:p>
-      <w:pPr>
-        <w:rPr>
-          <w:rFonts w:ascii="Times New Roman" w:hAnsi="Times New Roman" w:cs="Times New Roman"/>
-        </w:rPr>
-      </w:pPr>
-      <w:r>
-        <w:rPr>
-          <w:rFonts w:ascii="Times New Roman" w:hAnsi="Times New Roman" w:cs="Times New Roman"/>
-        </w:rPr>
-        <w:t xml:space="preserve">    @classmethod</w:t>
-      </w:r>
-    </w:p>
-    <w:p>
-      <w:pPr>
-        <w:rPr>
-          <w:rFonts w:ascii="Times New Roman" w:hAnsi="Times New Roman" w:cs="Times New Roman"/>
-        </w:rPr>
-      </w:pPr>
-      <w:r>
-        <w:rPr>
-          <w:rFonts w:ascii="Times New Roman" w:hAnsi="Times New Roman" w:cs="Times New Roman"/>
-        </w:rPr>
-        <w:t xml:space="preserve">    def </w:t>
+      <w:r>
+        <w:rPr>
+          <w:rFonts w:ascii="Consolas" w:eastAsia="Times New Roman" w:hAnsi="Consolas" w:cs="Times New Roman"/>
+          <w:color w:val="CCCCCC"/>
+          <w:kern w:val="0"/>
+          <w:sz w:val="21"/>
+          <w:szCs w:val="21"/>
+          <w:lang w:eastAsia="en-IN"/>
+          <w14:ligatures w14:val="none"/>
+        </w:rPr>
+        <w:t>(</w:t>
       </w:r>
       <w:proofErr w:type="spellStart"/>
       <w:r>
         <w:rPr>
-          <w:rFonts w:ascii="Times New Roman" w:hAnsi="Times New Roman" w:cs="Times New Roman"/>
-        </w:rPr>
-        <w:t>get_species</w:t>
+          <w:rFonts w:ascii="Consolas" w:eastAsia="Times New Roman" w:hAnsi="Consolas" w:cs="Times New Roman"/>
+          <w:color w:val="9CDCFE"/>
+          <w:kern w:val="0"/>
+          <w:sz w:val="21"/>
+          <w:szCs w:val="21"/>
+          <w:lang w:eastAsia="en-IN"/>
+          <w14:ligatures w14:val="none"/>
+        </w:rPr>
+        <w:t>cls</w:t>
       </w:r>
       <w:proofErr w:type="spellEnd"/>
       <w:r>
         <w:rPr>
-          <w:rFonts w:ascii="Times New Roman" w:hAnsi="Times New Roman" w:cs="Times New Roman"/>
-        </w:rPr>
-        <w:t>(</w:t>
-      </w:r>
-      <w:proofErr w:type="spellStart"/>
-      <w:r>
-        <w:rPr>
-          <w:rFonts w:ascii="Times New Roman" w:hAnsi="Times New Roman" w:cs="Times New Roman"/>
-        </w:rPr>
-        <w:t>cls</w:t>
-      </w:r>
-      <w:proofErr w:type="spellEnd"/>
-      <w:r>
-        <w:rPr>
-          <w:rFonts w:ascii="Times New Roman" w:hAnsi="Times New Roman" w:cs="Times New Roman"/>
+          <w:rFonts w:ascii="Consolas" w:eastAsia="Times New Roman" w:hAnsi="Consolas" w:cs="Times New Roman"/>
+          <w:color w:val="CCCCCC"/>
+          <w:kern w:val="0"/>
+          <w:sz w:val="21"/>
+          <w:szCs w:val="21"/>
+          <w:lang w:eastAsia="en-IN"/>
+          <w14:ligatures w14:val="none"/>
         </w:rPr>
         <w:t>):</w:t>
       </w:r>
     </w:p>
     <w:p>
       <w:pPr>
-        <w:rPr>
-          <w:rFonts w:ascii="Times New Roman" w:hAnsi="Times New Roman" w:cs="Times New Roman"/>
-        </w:rPr>
-      </w:pPr>
-      <w:r>
-        <w:rPr>
-          <w:rFonts w:ascii="Times New Roman" w:hAnsi="Times New Roman" w:cs="Times New Roman"/>
-        </w:rPr>
-        <w:t xml:space="preserve">        return </w:t>
+        <w:pStyle w:val="ListParagraph"/>
+        <w:numPr>
+          <w:ilvl w:val="0"/>
+          <w:numId w:val="8"/>
+        </w:numPr>
+        <w:shd w:val="clear" w:color="auto" w:fill="1F1F1F"/>
+        <w:spacing w:after="0" w:line="285" w:lineRule="atLeast"/>
+        <w:rPr>
+          <w:rFonts w:ascii="Consolas" w:eastAsia="Times New Roman" w:hAnsi="Consolas" w:cs="Times New Roman"/>
+          <w:color w:val="CCCCCC"/>
+          <w:kern w:val="0"/>
+          <w:sz w:val="21"/>
+          <w:szCs w:val="21"/>
+          <w:lang w:eastAsia="en-IN"/>
+          <w14:ligatures w14:val="none"/>
+        </w:rPr>
+      </w:pPr>
+      <w:r>
+        <w:rPr>
+          <w:rFonts w:ascii="Consolas" w:eastAsia="Times New Roman" w:hAnsi="Consolas" w:cs="Times New Roman"/>
+          <w:color w:val="CCCCCC"/>
+          <w:kern w:val="0"/>
+          <w:sz w:val="21"/>
+          <w:szCs w:val="21"/>
+          <w:lang w:eastAsia="en-IN"/>
+          <w14:ligatures w14:val="none"/>
+        </w:rPr>
+        <w:t xml:space="preserve">        </w:t>
+      </w:r>
+      <w:r>
+        <w:rPr>
+          <w:rFonts w:ascii="Consolas" w:eastAsia="Times New Roman" w:hAnsi="Consolas" w:cs="Times New Roman"/>
+          <w:color w:val="C586C0"/>
+          <w:kern w:val="0"/>
+          <w:sz w:val="21"/>
+          <w:szCs w:val="21"/>
+          <w:lang w:eastAsia="en-IN"/>
+          <w14:ligatures w14:val="none"/>
+        </w:rPr>
+        <w:t>return</w:t>
+      </w:r>
+      <w:r>
+        <w:rPr>
+          <w:rFonts w:ascii="Consolas" w:eastAsia="Times New Roman" w:hAnsi="Consolas" w:cs="Times New Roman"/>
+          <w:color w:val="CCCCCC"/>
+          <w:kern w:val="0"/>
+          <w:sz w:val="21"/>
+          <w:szCs w:val="21"/>
+          <w:lang w:eastAsia="en-IN"/>
+          <w14:ligatures w14:val="none"/>
+        </w:rPr>
+        <w:t xml:space="preserve"> </w:t>
       </w:r>
       <w:proofErr w:type="spellStart"/>
       <w:proofErr w:type="gramStart"/>
       <w:r>
         <w:rPr>
-          <w:rFonts w:ascii="Times New Roman" w:hAnsi="Times New Roman" w:cs="Times New Roman"/>
-        </w:rPr>
-        <w:t>cls.species</w:t>
+          <w:rFonts w:ascii="Consolas" w:eastAsia="Times New Roman" w:hAnsi="Consolas" w:cs="Times New Roman"/>
+          <w:color w:val="9CDCFE"/>
+          <w:kern w:val="0"/>
+          <w:sz w:val="21"/>
+          <w:szCs w:val="21"/>
+          <w:lang w:eastAsia="en-IN"/>
+          <w14:ligatures w14:val="none"/>
+        </w:rPr>
+        <w:t>cls</w:t>
+      </w:r>
+      <w:r>
+        <w:rPr>
+          <w:rFonts w:ascii="Consolas" w:eastAsia="Times New Roman" w:hAnsi="Consolas" w:cs="Times New Roman"/>
+          <w:color w:val="CCCCCC"/>
+          <w:kern w:val="0"/>
+          <w:sz w:val="21"/>
+          <w:szCs w:val="21"/>
+          <w:lang w:eastAsia="en-IN"/>
+          <w14:ligatures w14:val="none"/>
+        </w:rPr>
+        <w:t>.</w:t>
+      </w:r>
+      <w:r>
+        <w:rPr>
+          <w:rFonts w:ascii="Consolas" w:eastAsia="Times New Roman" w:hAnsi="Consolas" w:cs="Times New Roman"/>
+          <w:color w:val="9CDCFE"/>
+          <w:kern w:val="0"/>
+          <w:sz w:val="21"/>
+          <w:szCs w:val="21"/>
+          <w:lang w:eastAsia="en-IN"/>
+          <w14:ligatures w14:val="none"/>
+        </w:rPr>
+        <w:t>species</w:t>
       </w:r>
       <w:proofErr w:type="spellEnd"/>
       <w:proofErr w:type="gramEnd"/>
     </w:p>
     <w:p>
       <w:pPr>
-        <w:rPr>
-          <w:rFonts w:ascii="Times New Roman" w:hAnsi="Times New Roman" w:cs="Times New Roman"/>
-        </w:rPr>
-      </w:pPr>
-    </w:p>
-    <w:p>
-      <w:pPr>
-        <w:rPr>
-          <w:rFonts w:ascii="Times New Roman" w:hAnsi="Times New Roman" w:cs="Times New Roman"/>
+        <w:pStyle w:val="ListParagraph"/>
+        <w:numPr>
+          <w:ilvl w:val="0"/>
+          <w:numId w:val="8"/>
+        </w:numPr>
+        <w:shd w:val="clear" w:color="auto" w:fill="1F1F1F"/>
+        <w:spacing w:after="0" w:line="285" w:lineRule="atLeast"/>
+        <w:rPr>
+          <w:rFonts w:ascii="Consolas" w:eastAsia="Times New Roman" w:hAnsi="Consolas" w:cs="Times New Roman"/>
+          <w:color w:val="CCCCCC"/>
+          <w:kern w:val="0"/>
+          <w:sz w:val="21"/>
+          <w:szCs w:val="21"/>
+          <w:lang w:eastAsia="en-IN"/>
+          <w14:ligatures w14:val="none"/>
+        </w:rPr>
+      </w:pPr>
+    </w:p>
+    <w:p>
+      <w:pPr>
+        <w:pStyle w:val="ListParagraph"/>
+        <w:numPr>
+          <w:ilvl w:val="0"/>
+          <w:numId w:val="8"/>
+        </w:numPr>
+        <w:shd w:val="clear" w:color="auto" w:fill="1F1F1F"/>
+        <w:spacing w:after="0" w:line="285" w:lineRule="atLeast"/>
+        <w:rPr>
+          <w:rFonts w:ascii="Consolas" w:eastAsia="Times New Roman" w:hAnsi="Consolas" w:cs="Times New Roman"/>
+          <w:color w:val="CCCCCC"/>
+          <w:kern w:val="0"/>
+          <w:sz w:val="21"/>
+          <w:szCs w:val="21"/>
+          <w:lang w:eastAsia="en-IN"/>
+          <w14:ligatures w14:val="none"/>
         </w:rPr>
       </w:pPr>
       <w:proofErr w:type="gramStart"/>
       <w:r>
         <w:rPr>
-          <w:rFonts w:ascii="Times New Roman" w:hAnsi="Times New Roman" w:cs="Times New Roman"/>
-        </w:rPr>
-        <w:t>print(</w:t>
+          <w:rFonts w:ascii="Consolas" w:eastAsia="Times New Roman" w:hAnsi="Consolas" w:cs="Times New Roman"/>
+          <w:color w:val="DCDCAA"/>
+          <w:kern w:val="0"/>
+          <w:sz w:val="21"/>
+          <w:szCs w:val="21"/>
+          <w:lang w:eastAsia="en-IN"/>
+          <w14:ligatures w14:val="none"/>
+        </w:rPr>
+        <w:t>print</w:t>
+      </w:r>
+      <w:r>
+        <w:rPr>
+          <w:rFonts w:ascii="Consolas" w:eastAsia="Times New Roman" w:hAnsi="Consolas" w:cs="Times New Roman"/>
+          <w:color w:val="CCCCCC"/>
+          <w:kern w:val="0"/>
+          <w:sz w:val="21"/>
+          <w:szCs w:val="21"/>
+          <w:lang w:eastAsia="en-IN"/>
+          <w14:ligatures w14:val="none"/>
+        </w:rPr>
+        <w:t>(</w:t>
       </w:r>
       <w:proofErr w:type="spellStart"/>
       <w:proofErr w:type="gramEnd"/>
       <w:r>
         <w:rPr>
-          <w:rFonts w:ascii="Times New Roman" w:hAnsi="Times New Roman" w:cs="Times New Roman"/>
-        </w:rPr>
-        <w:t>Person.get_species</w:t>
+          <w:rFonts w:ascii="Consolas" w:eastAsia="Times New Roman" w:hAnsi="Consolas" w:cs="Times New Roman"/>
+          <w:color w:val="4EC9B0"/>
+          <w:kern w:val="0"/>
+          <w:sz w:val="21"/>
+          <w:szCs w:val="21"/>
+          <w:lang w:eastAsia="en-IN"/>
+          <w14:ligatures w14:val="none"/>
+        </w:rPr>
+        <w:t>Person</w:t>
+      </w:r>
+      <w:r>
+        <w:rPr>
+          <w:rFonts w:ascii="Consolas" w:eastAsia="Times New Roman" w:hAnsi="Consolas" w:cs="Times New Roman"/>
+          <w:color w:val="CCCCCC"/>
+          <w:kern w:val="0"/>
+          <w:sz w:val="21"/>
+          <w:szCs w:val="21"/>
+          <w:lang w:eastAsia="en-IN"/>
+          <w14:ligatures w14:val="none"/>
+        </w:rPr>
+        <w:t>.</w:t>
+      </w:r>
+      <w:r>
+        <w:rPr>
+          <w:rFonts w:ascii="Consolas" w:eastAsia="Times New Roman" w:hAnsi="Consolas" w:cs="Times New Roman"/>
+          <w:color w:val="DCDCAA"/>
+          <w:kern w:val="0"/>
+          <w:sz w:val="21"/>
+          <w:szCs w:val="21"/>
+          <w:lang w:eastAsia="en-IN"/>
+          <w14:ligatures w14:val="none"/>
+        </w:rPr>
+        <w:t>get_species</w:t>
       </w:r>
       <w:proofErr w:type="spellEnd"/>
       <w:r>
         <w:rPr>
-          <w:rFonts w:ascii="Times New Roman" w:hAnsi="Times New Roman" w:cs="Times New Roman"/>
-        </w:rPr>
-        <w:t>())  # Output: Homo sapiens</w:t>
+          <w:rFonts w:ascii="Consolas" w:eastAsia="Times New Roman" w:hAnsi="Consolas" w:cs="Times New Roman"/>
+          <w:color w:val="CCCCCC"/>
+          <w:kern w:val="0"/>
+          <w:sz w:val="21"/>
+          <w:szCs w:val="21"/>
+          <w:lang w:eastAsia="en-IN"/>
+          <w14:ligatures w14:val="none"/>
+        </w:rPr>
+        <w:t>())  </w:t>
+      </w:r>
+      <w:r>
+        <w:rPr>
+          <w:rFonts w:ascii="Consolas" w:eastAsia="Times New Roman" w:hAnsi="Consolas" w:cs="Times New Roman"/>
+          <w:color w:val="6A9955"/>
+          <w:kern w:val="0"/>
+          <w:sz w:val="21"/>
+          <w:szCs w:val="21"/>
+          <w:lang w:eastAsia="en-IN"/>
+          <w14:ligatures w14:val="none"/>
+        </w:rPr>
+        <w:t># Output: Homo sapiens</w:t>
       </w:r>
     </w:p>
     <w:p>

</xml_diff>